<commit_message>
WC/2024/227: 9A - Manager named on MASPER and respiratory replies; duplication cut (change 67)
Co-Authored-By: Claude Opus 5.5 <noreply@anthropic.com>
Claude-Session: https://claude.ai/code/session_01PbSZiMB1koFR46V5hQyVcy
</commit_message>
<xml_diff>
--- a/wc2024227/drafts/out/FILING_1OCT2026/2026-10_SECOND_AMENDED_9A_FINAL.docx
+++ b/wc2024227/drafts/out/FILING_1OCT2026/2026-10_SECOND_AMENDED_9A_FINAL.docx
@@ -1336,7 +1336,7 @@
           <w:sz w:val="20"/>
           <w:szCs w:val="20"/>
         </w:rPr>
-        <w:t>On 8 August 2023 at 4:15 pm the Director wrote regarding an additional shift to replace the shift not worked due to a rostering error. [¶ 28]</w:t>
+        <w:t xml:space="preserve">On 8 August 2023 at 4:15 pm the Director wrote regarding an additional shift to replace the shift not worked due to a rostering error. [¶ 28] On 8 August 2023 he confirmed that he would work the replacement shift and was looking to pick up another. [¶ 29]</w:t>
       </w:r>
     </w:p>
     <w:p>
@@ -1375,7 +1375,7 @@
           <w:sz w:val="20"/>
           <w:szCs w:val="20"/>
         </w:rPr>
-        <w:t>On 4 September 2023 he confirmed that he was able and willing to work any roster presented to him including the current schedule with full 24-hour availability, that he had no issues with shift work, and attached a draft roster spreadsheet. [¶¶ 33 to 35]</w:t>
+        <w:t xml:space="preserve">On 4 September 2023 he confirmed that he was able and willing to work any roster presented to him including the current schedule with full 24-hour availability, that he had no issues with shift work, and attached a draft roster spreadsheet. [¶¶ 33 to 35] On 8 September 2023 the Director wrote that she was "glad to hear things seem to be going well with Chloe" and glad that he had applied for the additional shifts through the recent EOI. [¶ 36]</w:t>
       </w:r>
     </w:p>
     <w:p>
@@ -1398,10 +1398,20 @@
       <w:r>
         <w:rPr>
           <w:rFonts w:ascii="Arial" w:hAnsi="Arial" w:cs="Arial"/>
-          <w:sz w:val="20"/>
-          <w:szCs w:val="20"/>
-        </w:rPr>
-        <w:t>On 8 August 2023 he had confirmed that he would work the replacement shift and was looking to pick up another. [¶ 29] On 8 September 2023 the Director wrote that she was "glad to hear things seem to be going well with Chloe" and glad that he had applied for the additional shifts through the recent EOI. [¶ 36]</w:t>
+          <w:b/>
+          <w:sz w:val="20"/>
+          <w:szCs w:val="20"/>
+        </w:rPr>
+        <w:t xml:space="preserve">1(d) Notification of variable office hours (23 August 2023 to 17 May 2024). </w:t>
+      </w:r>
+      <w:r>
+        <w:rPr>
+          <w:rFonts w:ascii="Arial" w:hAnsi="Arial" w:cs="Arial"/>
+          <w:b w:val="0"/>
+          <w:sz w:val="20"/>
+          <w:szCs w:val="20"/>
+        </w:rPr>
+        <w:t>The position reports to the Switchboard Manager, and the role description names that person as the contact for the position. [¶¶ 3 to 4]</w:t>
       </w:r>
     </w:p>
     <w:p>
@@ -1411,20 +1421,10 @@
       <w:r>
         <w:rPr>
           <w:rFonts w:ascii="Arial" w:hAnsi="Arial" w:cs="Arial"/>
-          <w:b/>
-          <w:sz w:val="20"/>
-          <w:szCs w:val="20"/>
-        </w:rPr>
-        <w:t xml:space="preserve">1(d) Notification of variable office hours (23 August 2023 to 17 May 2024). </w:t>
-      </w:r>
-      <w:r>
-        <w:rPr>
-          <w:rFonts w:ascii="Arial" w:hAnsi="Arial" w:cs="Arial"/>
-          <w:b w:val="0"/>
-          <w:sz w:val="20"/>
-          <w:szCs w:val="20"/>
-        </w:rPr>
-        <w:t>The position reports to the Switchboard Manager, and the role description names that person as the contact for the position. [¶¶ 3 to 4]</w:t>
+          <w:sz w:val="20"/>
+          <w:szCs w:val="20"/>
+        </w:rPr>
+        <w:t>On 23 August 2023 at 2:18 pm she wrote to Logan Switch with the subject "What's Chloe's Hours?!": "I am fulltime and work flex hours - You may have noticed recently I am starting at different times in the morning and finish at different times in the afternoon", and "My hours would range from starting between 6-9am and finishing 2-5pm." [¶¶ 70 to 72]</w:t>
       </w:r>
     </w:p>
     <w:p>
@@ -1434,10 +1434,20 @@
       <w:r>
         <w:rPr>
           <w:rFonts w:ascii="Arial" w:hAnsi="Arial" w:cs="Arial"/>
-          <w:sz w:val="20"/>
-          <w:szCs w:val="20"/>
-        </w:rPr>
-        <w:t>On 23 August 2023 at 2:18 pm she wrote to Logan Switch with the subject "What's Chloe's Hours?!": "I am fulltime and work flex hours - You may have noticed recently I am starting at different times in the morning and finish at different times in the afternoon", and "My hours would range from starting between 6-9am and finishing 2-5pm." [¶¶ 70 to 72]</w:t>
+          <w:b/>
+          <w:sz w:val="20"/>
+          <w:szCs w:val="20"/>
+        </w:rPr>
+        <w:t xml:space="preserve">The Respondent does not allege that fixed office hours were stated to the Switchboard staff at any time between 23 August 2023 and 17 May 2024. </w:t>
+      </w:r>
+      <w:r>
+        <w:rPr>
+          <w:rFonts w:ascii="Arial" w:hAnsi="Arial" w:cs="Arial"/>
+          <w:b w:val="0"/>
+          <w:sz w:val="20"/>
+          <w:szCs w:val="20"/>
+        </w:rPr>
+        <w:t>[¶ 73] That is approximately nine months.</w:t>
       </w:r>
     </w:p>
     <w:p>
@@ -1451,7 +1461,7 @@
           <w:sz w:val="20"/>
           <w:szCs w:val="20"/>
         </w:rPr>
-        <w:t xml:space="preserve">The Respondent does not allege that fixed office hours were stated to the Switchboard staff at any time between 23 August 2023 and 17 May 2024. </w:t>
+        <w:t xml:space="preserve">1(e) Pandemic leave submissions (20 February to 1 March 2024). </w:t>
       </w:r>
       <w:r>
         <w:rPr>
@@ -1460,7 +1470,7 @@
           <w:sz w:val="20"/>
           <w:szCs w:val="20"/>
         </w:rPr>
-        <w:t>[¶ 73] That is approximately nine months.</w:t>
+        <w:t>On 20 February 2024 the Appellant messaged the Manager that he had tested positive for COVID-19. She "requested that you send it to her so she could submit it in MyHR". [¶ 136] She had said he was eligible for up to five days' paid leave on photo evidence of the test. He sent it to her as she asked. She then asked him to submit the Special Pandemic Leave request through myHR himself and attach a statutory declaration or photo evidence of his test. [¶ 132] The myHR submissions report records the initiator of that request as the Appellant [¶¶ 140 to 141], and the Respondent does not allege that any other Switchboard employee was required to submit such a request personally through myHR in February 2024. [¶ 142] The leave request history for Process Reference 15480560 records him creating a draft at 11:24:48 that morning and submitting the request at 11:41:27. [¶¶ 114 to 115] So the material was provided four times in all: once to the Manager, as requested, and then three times through myHR, once that morning and, after two declines, twice more.</w:t>
       </w:r>
     </w:p>
     <w:p>
@@ -1470,20 +1480,10 @@
       <w:r>
         <w:rPr>
           <w:rFonts w:ascii="Arial" w:hAnsi="Arial" w:cs="Arial"/>
-          <w:b/>
-          <w:sz w:val="20"/>
-          <w:szCs w:val="20"/>
-        </w:rPr>
-        <w:t xml:space="preserve">1(e) Pandemic leave submissions (20 February to 1 March 2024). </w:t>
-      </w:r>
-      <w:r>
-        <w:rPr>
-          <w:rFonts w:ascii="Arial" w:hAnsi="Arial" w:cs="Arial"/>
-          <w:b w:val="0"/>
-          <w:sz w:val="20"/>
-          <w:szCs w:val="20"/>
-        </w:rPr>
-        <w:t>On 20 February 2024 the Appellant messaged the Manager that he had tested positive for COVID-19. She "requested that you send it to her so she could submit it in MyHR". [¶ 136] She had said he was eligible for up to five days' paid leave on photo evidence of the test. He sent it to her as she asked. She then asked him to submit the Special Pandemic Leave request through myHR himself and attach a statutory declaration or photo evidence of his test. [¶ 132] The myHR submissions report records the initiator of that request as the Appellant [¶¶ 140 to 141], and the Respondent does not allege that any other Switchboard employee was required to submit such a request personally through myHR in February 2024. [¶ 142] The leave request history for Process Reference 15480560 records him creating a draft at 11:24:48 that morning and submitting the request at 11:41:27. [¶¶ 114 to 115] So the material was provided four times in all: once to the Manager, as requested, and then three times through myHR, once that morning and, after two declines, twice more.</w:t>
+          <w:sz w:val="20"/>
+          <w:szCs w:val="20"/>
+        </w:rPr>
+        <w:t>It records the request being declined at 12:23:43 on 21 February 2024; submitted again at 06:07:32 on 28 February; declined again at 09:06:07 on 29 February; submitted a third time at 11:07:28 that morning; and approved at 11:21:03. [¶¶ 116 to 120]</w:t>
       </w:r>
     </w:p>
     <w:p>
@@ -1496,7 +1496,7 @@
           <w:sz w:val="20"/>
           <w:szCs w:val="20"/>
         </w:rPr>
-        <w:t>It records the request being declined at 12:23:43 on 21 February 2024; submitted again at 06:07:32 on 28 February; declined again at 09:06:07 on 29 February; submitted a third time at 11:07:28 that morning; and approved at 11:21:03. [¶¶ 116 to 120]</w:t>
+        <w:t xml:space="preserve">It records the Appellant as having submitted the request on three occasions and the Manager as having declined it on two, and records the Director as approving it at 16:05:08 on 1 March 2024. [¶¶ 121 to 123] Two reasons for the declines appear on the record and they are not the same. The review decision records that on 21 February the Manager messaged that she had to decline because the minimum period for COVID leave was five days for a positive staff member, that she noted the statutory declaration provided was sufficient evidence, and that she asked him to resubmit his leave days. [¶¶ 137 to 138]</w:t>
       </w:r>
     </w:p>
     <w:p>
@@ -1509,7 +1509,7 @@
           <w:sz w:val="20"/>
           <w:szCs w:val="20"/>
         </w:rPr>
-        <w:t>It records the Appellant as having submitted the request on three occasions and the Manager as having declined it on two, and records the Director as approving it at 16:05:08 on 1 March 2024. [¶¶ 121 to 123] The approval followed the third submission by thirteen minutes and thirty-five seconds; the interval from draft to final approval was ten days, four hours, forty minutes and twenty seconds. [¶¶ 124 to 125] Two reasons for the declines appear on the record and they are not the same. The review decision records that on 21 February the Manager messaged that she had to decline because the minimum period for COVID leave was five days for a positive staff member, that she noted the statutory declaration provided was sufficient evidence, and that she asked him to resubmit his leave days. [¶¶ 137 to 138]</w:t>
+        <w:t>It records the Appellant messaging that he was confused about why his amended request was declined, and that he had done everything as required. [¶ 139]</w:t>
       </w:r>
     </w:p>
     <w:p>
@@ -1522,7 +1522,7 @@
           <w:sz w:val="20"/>
           <w:szCs w:val="20"/>
         </w:rPr>
-        <w:t>It records the Appellant messaging that he was confused about why his amended request was declined, and that he had done everything as required. [¶ 139]</w:t>
+        <w:t>The Respondent pleads that she declined the application because on her assessment the required statutory declaration was not attached; that "a review indicates that in fact, the attachments were present on the appellant's submission"; and that this was human error on the background of high work demands. [¶¶ 133 to 135]</w:t>
       </w:r>
     </w:p>
     <w:p>
@@ -1535,7 +1535,7 @@
           <w:sz w:val="20"/>
           <w:szCs w:val="20"/>
         </w:rPr>
-        <w:t>The Respondent pleads that she declined the application because on her assessment the required statutory declaration was not attached; that "a review indicates that in fact, the attachments were present on the appellant's submission"; and that this was human error on the background of high work demands. [¶¶ 133 to 135]</w:t>
+        <w:t>So the request was made on 20 February 2024 and finally approved on 1 March 2024: ten days, four hours, forty minutes and twenty seconds from draft to final approval, with two declines and three submissions in between. The third submission was approved in thirteen minutes and thirty-five seconds. [¶¶ 114 to 125]</w:t>
       </w:r>
     </w:p>
     <w:p>
@@ -1548,7 +1548,7 @@
           <w:sz w:val="20"/>
           <w:szCs w:val="20"/>
         </w:rPr>
-        <w:t>So the request was made on 20 February 2024 and finally approved on 1 March 2024: ten days, four hours, forty minutes and twenty seconds from draft to final approval, with two declines and three submissions in between. The third submission was approved in thirteen minutes and thirty-five seconds. [¶¶ 114 to 125]</w:t>
+        <w:t>Two matters are repeated here from Stressors 2 and 3. The myHR submissions report records the Manager as the initiator of each of the five Attendance Variation and Allowance Claims made for the Appellant between 1 February and 31 May 2024, and the Appellant as the initiator of none [¶¶ 198 to 201]; the special pandemic leave request was the submission he was required to make himself [¶¶ 132, 140 to 142]. The Respondent pleads human error in the handling of that request [¶¶ 133 to 135] and human error in the rostering of 17 and 18 March 2024 [¶ 226], events less than a month apart.</w:t>
       </w:r>
     </w:p>
     <w:p>
@@ -1558,10 +1558,20 @@
       <w:r>
         <w:rPr>
           <w:rFonts w:ascii="Arial" w:hAnsi="Arial" w:cs="Arial"/>
-          <w:sz w:val="20"/>
-          <w:szCs w:val="20"/>
-        </w:rPr>
-        <w:t>Two matters are repeated here from Stressors 2 and 3. The myHR submissions report records the Manager as the initiator of each of the five Attendance Variation and Allowance Claims made for the Appellant between 1 February and 31 May 2024, and the Appellant as the initiator of none [¶¶ 198 to 201]; the special pandemic leave request was the submission he was required to make himself [¶¶ 132, 140 to 142]. The Respondent pleads human error in the handling of that request [¶¶ 133 to 135] and human error in the rostering of 17 and 18 March 2024 [¶ 226], events less than a month apart.</w:t>
+          <w:b/>
+          <w:sz w:val="20"/>
+          <w:szCs w:val="20"/>
+        </w:rPr>
+        <w:t xml:space="preserve">1(f) After hours on call process changed (15 April 2024). </w:t>
+      </w:r>
+      <w:r>
+        <w:rPr>
+          <w:rFonts w:ascii="Arial" w:hAnsi="Arial" w:cs="Arial"/>
+          <w:b w:val="0"/>
+          <w:sz w:val="20"/>
+          <w:szCs w:val="20"/>
+        </w:rPr>
+        <w:t>On 15 April 2024 at 12:39 pm the Switchboard Manager wrote to Logan Switch, copied to the Director and the Switchboard staff, with the subject "Afterhours Oncall Process - Switchboard". [¶ 49] That email stated that the process during office hours remained the same and that staff were to contact her through switch, the office or her mobile, and: "You will see that Ellen and myself have added Afterhours on call, the days that are highlighted in purple show who is on call after hours." [¶¶ 50, 52] It stated: "This new process is effective from today." [¶ 51]</w:t>
       </w:r>
     </w:p>
     <w:p>
@@ -1571,20 +1581,10 @@
       <w:r>
         <w:rPr>
           <w:rFonts w:ascii="Arial" w:hAnsi="Arial" w:cs="Arial"/>
-          <w:b/>
-          <w:sz w:val="20"/>
-          <w:szCs w:val="20"/>
-        </w:rPr>
-        <w:t xml:space="preserve">1(f) After hours on call process changed (15 April 2024). </w:t>
-      </w:r>
-      <w:r>
-        <w:rPr>
-          <w:rFonts w:ascii="Arial" w:hAnsi="Arial" w:cs="Arial"/>
-          <w:b w:val="0"/>
-          <w:sz w:val="20"/>
-          <w:szCs w:val="20"/>
-        </w:rPr>
-        <w:t>On 15 April 2024 at 12:39 pm the Switchboard Manager wrote to Logan Switch, copied to the Director and the Switchboard staff, with the subject "Afterhours Oncall Process - Switchboard". [¶ 49] That email stated that the process during office hours remained the same and that staff were to contact her through switch, the office or her mobile, and: "You will see that Ellen and myself have added Afterhours on call, the days that are highlighted in purple show who is on call after hours." [¶¶ 50, 52] It stated: "This new process is effective from today." [¶ 51]</w:t>
+          <w:sz w:val="20"/>
+          <w:szCs w:val="20"/>
+        </w:rPr>
+        <w:t>She signed it as "A/Switchboard Manager". [¶ 53]</w:t>
       </w:r>
     </w:p>
     <w:p>
@@ -1594,10 +1594,20 @@
       <w:r>
         <w:rPr>
           <w:rFonts w:ascii="Arial" w:hAnsi="Arial" w:cs="Arial"/>
-          <w:sz w:val="20"/>
-          <w:szCs w:val="20"/>
-        </w:rPr>
-        <w:t>She signed it as "A/Switchboard Manager". [¶ 53]</w:t>
+          <w:b/>
+          <w:sz w:val="20"/>
+          <w:szCs w:val="20"/>
+        </w:rPr>
+        <w:t xml:space="preserve">1(g) Data entry process changed (19 April 2024). </w:t>
+      </w:r>
+      <w:r>
+        <w:rPr>
+          <w:rFonts w:ascii="Arial" w:hAnsi="Arial" w:cs="Arial"/>
+          <w:b w:val="0"/>
+          <w:sz w:val="20"/>
+          <w:szCs w:val="20"/>
+        </w:rPr>
+        <w:t>The review decision records that on 19 April 2024 she emailed the team stating that due to errors being made with respect to data entry a new process was to be followed which included more checks to ensure accuracy of data entry. [¶ 54]</w:t>
       </w:r>
     </w:p>
     <w:p>
@@ -1611,7 +1621,7 @@
           <w:sz w:val="20"/>
           <w:szCs w:val="20"/>
         </w:rPr>
-        <w:t xml:space="preserve">1(g) Data entry process changed (19 April 2024). </w:t>
+        <w:t xml:space="preserve">1(h) Misdirected calls and the MASPER response (2 to 9 May 2024). </w:t>
       </w:r>
       <w:r>
         <w:rPr>
@@ -1620,7 +1630,7 @@
           <w:sz w:val="20"/>
           <w:szCs w:val="20"/>
         </w:rPr>
-        <w:t>The review decision records that on 19 April 2024 she emailed the team stating that due to errors being made with respect to data entry a new process was to be followed which included more checks to ensure accuracy of data entry. [¶ 54]</w:t>
+        <w:t>A key responsibility of the position is to participate in the Emergency Response process by receiving emergency response notifications and distributing them to the appropriate response groups, dependent on the category of emergency, as per emergency code procedures, strictly adhering to protocols and timeframes; to maintain call queues to a minimum at all times; and to operate under pressure, particularly where high volume call traffic is concerned. [¶¶ 5, 8, 10]</w:t>
       </w:r>
     </w:p>
     <w:p>
@@ -1630,20 +1640,11 @@
       <w:r>
         <w:rPr>
           <w:rFonts w:ascii="Arial" w:hAnsi="Arial" w:cs="Arial"/>
-          <w:b/>
-          <w:sz w:val="20"/>
-          <w:szCs w:val="20"/>
-        </w:rPr>
-        <w:t xml:space="preserve">1(h) Misdirected calls and the MASPER response (2 to 9 May 2024). </w:t>
-      </w:r>
-      <w:r>
-        <w:rPr>
-          <w:rFonts w:ascii="Arial" w:hAnsi="Arial" w:cs="Arial"/>
           <w:b w:val="0"/>
           <w:sz w:val="20"/>
           <w:szCs w:val="20"/>
         </w:rPr>
-        <w:t>A key responsibility of the position is to participate in the Emergency Response process by receiving emergency response notifications and distributing them to the appropriate response groups, dependent on the category of emergency, as per emergency code procedures, strictly adhering to protocols and timeframes; to maintain call queues to a minimum at all times; and to operate under pressure, particularly where high volume call traffic is concerned. [¶¶ 5, 8, 10]</w:t>
+        <w:t>In April 2025 the console took between 269 and 444 calls on an eight-hour shift (Stressor 3(b), the ordinary-call-load paragraph below); the Appellant's evidence is that the load in May 2024 was of the same order. Emergency codes were received and paged through it throughout the day (Stressor 3(b)).</w:t>
       </w:r>
     </w:p>
     <w:p>
@@ -1653,11 +1654,10 @@
       <w:r>
         <w:rPr>
           <w:rFonts w:ascii="Arial" w:hAnsi="Arial" w:cs="Arial"/>
-          <w:b w:val="0"/>
-          <w:sz w:val="20"/>
-          <w:szCs w:val="20"/>
-        </w:rPr>
-        <w:t>In April 2025 the console took between 269 and 444 calls on an eight-hour shift (Stressor 3(b), the ordinary-call-load paragraph below); the Appellant's evidence is that the load in May 2024 was of the same order. Emergency codes were received and paged through it throughout the day (Stressor 3(b)).</w:t>
+          <w:sz w:val="20"/>
+          <w:szCs w:val="20"/>
+        </w:rPr>
+        <w:t>On 3 May 2024 at 3:06 pm the MASPER Registrar wrote to the Switchboard Manager with the subject "Switchboard issues 2nd and 3rd May 2024", listing five occasions on 2 and 3 May. [¶¶ 56 to 57] Of the occasion at 14:46 on 3 May the email records: "MET call team called x5290 asking where MET call was located 'VHUB' - switchboard could not tell them where VHUB was. Had to be redirected by MASPER". [¶ 58]</w:t>
       </w:r>
     </w:p>
     <w:p>
@@ -1670,7 +1670,7 @@
           <w:sz w:val="20"/>
           <w:szCs w:val="20"/>
         </w:rPr>
-        <w:t>On 3 May 2024 at 3:06 pm the MASPER Registrar wrote to the Switchboard Manager with the subject "Switchboard issues 2nd and 3rd May 2024", listing five occasions on 2 and 3 May. [¶¶ 56 to 57] Of the occasion at 14:46 on 3 May the email records: "MET call team called x5290 asking where MET call was located 'VHUB' - switchboard could not tell them where VHUB was. Had to be redirected by MASPER". [¶ 58]</w:t>
+        <w:t>On 8 May at 5:28 pm she wrote again, listing four further occasions, recording of those on 8 May that a call was "incorrectly put through to MASPER" on each occasion. [¶¶ 59 to 61] Those nine occasions fell while the arrangement notified on 15 April 2024 was in force. [¶ 68]</w:t>
       </w:r>
     </w:p>
     <w:p>
@@ -1683,7 +1683,7 @@
           <w:sz w:val="20"/>
           <w:szCs w:val="20"/>
         </w:rPr>
-        <w:t>On 8 May at 5:28 pm she wrote again, listing four further occasions, recording of those on 8 May that a call was "incorrectly put through to MASPER" on each occasion. [¶¶ 59 to 61] Those nine occasions fell while the arrangement notified on 15 April 2024 was in force. [¶ 68]</w:t>
+        <w:t xml:space="preserve">The Manager's first reply was sent on 9 May at 9:20 am, five days, eighteen hours and fourteen minutes after the first email. [¶¶ 62 to 64] It was sent to the Registrar and Dr Wong, and asked Dr Wong, to whom the reports had been copied, to confirm her business hours because they were "not provided on the rosters", noting that her dect phone was "currently switched off". [¶ 65]</w:t>
       </w:r>
     </w:p>
     <w:p>
@@ -1696,7 +1696,7 @@
           <w:sz w:val="20"/>
           <w:szCs w:val="20"/>
         </w:rPr>
-        <w:t>The first reply was sent on 9 May at 9:20 am, and asked Dr Wong, to whom the reports had been copied, to confirm her business hours because they were "not provided on the rosters", noting that her dect phone was "currently switched off". [¶ 65]</w:t>
+        <w:t>At 10:15 am the same day the Switchboard Manager wrote to Logan Switch introducing a new process and referring to "many ongoing issues raised by the MASPER and the medical department about calls being transferred to the wrong medical teams". [¶¶ 66 to 67]</w:t>
       </w:r>
     </w:p>
     <w:p>
@@ -1709,7 +1709,7 @@
           <w:sz w:val="20"/>
           <w:szCs w:val="20"/>
         </w:rPr>
-        <w:t>That reply was sent five days, eighteen hours and fourteen minutes after the first email. [¶¶ 62 to 64]</w:t>
+        <w:t>The Respondent does not allege that any communication was sent to Logan Switch or to the Switchboard staff concerning those occasions at any time after 3 May 2024 and before 10:15 am on 9 May 2024. [¶ 69]</w:t>
       </w:r>
     </w:p>
     <w:p>
@@ -1722,7 +1722,7 @@
           <w:sz w:val="20"/>
           <w:szCs w:val="20"/>
         </w:rPr>
-        <w:t>At 10:15 am the same day the Switchboard Manager wrote to Logan Switch introducing a new process and referring to "many ongoing issues raised by the MASPER and the medical department about calls being transferred to the wrong medical teams". [¶¶ 66 to 67]</w:t>
+        <w:t xml:space="preserve">So the sequence at the console was: the first report on 3 May 2024, a second on 8 May (the fifth calendar day after the first), nine occasions in all, the Manager's first reply after five days, eighteen hours and fourteen minutes, and a new process communicated to Switchboard staff at 10:15 am on 9 May (the sixth day). [¶¶ 56 to 69]</w:t>
       </w:r>
     </w:p>
     <w:p>
@@ -1732,10 +1732,20 @@
       <w:r>
         <w:rPr>
           <w:rFonts w:ascii="Arial" w:hAnsi="Arial" w:cs="Arial"/>
-          <w:sz w:val="20"/>
-          <w:szCs w:val="20"/>
-        </w:rPr>
-        <w:t>The Respondent does not allege that any communication was sent to Logan Switch or to the Switchboard staff concerning those occasions at any time after 3 May 2024 and before 10:15 am on 9 May 2024. [¶ 69]</w:t>
+          <w:b/>
+          <w:sz w:val="20"/>
+          <w:szCs w:val="20"/>
+        </w:rPr>
+        <w:t xml:space="preserve">1(i) The complaint of 13 May 2024 - chronology only (13 May 2024). </w:t>
+      </w:r>
+      <w:r>
+        <w:rPr>
+          <w:rFonts w:ascii="Arial" w:hAnsi="Arial" w:cs="Arial"/>
+          <w:b w:val="0"/>
+          <w:sz w:val="20"/>
+          <w:szCs w:val="20"/>
+        </w:rPr>
+        <w:t>On 13 May 2024 the Appellant lodged a corrupt conduct complaint regarding clinical risks. The Ethical Standards Unit formally determined this constituted a Public Interest Disclosure (Admitted Fact: Form 24, para 20, admitted 18 February 2026). The content is not set out. It is pleaded for chronology only; no cause of the injury and no motive is alleged in connection with it.</w:t>
       </w:r>
     </w:p>
     <w:p>
@@ -1745,10 +1755,20 @@
       <w:r>
         <w:rPr>
           <w:rFonts w:ascii="Arial" w:hAnsi="Arial" w:cs="Arial"/>
-          <w:sz w:val="20"/>
-          <w:szCs w:val="20"/>
-        </w:rPr>
-        <w:t>So the sequence at the console was: the first report on 3 May 2024, a second on 8 May (the fifth calendar day after the first), nine occasions in all, a first reply after five days, eighteen hours and fourteen minutes, and a new process communicated to Switchboard staff at 10:15 am on 9 May (the sixth day). [¶¶ 56 to 69]</w:t>
+          <w:b/>
+          <w:sz w:val="20"/>
+          <w:szCs w:val="20"/>
+        </w:rPr>
+        <w:t xml:space="preserve">1(j) On-call roster and absence notification instructions - context only (13 to 15 May 2024). </w:t>
+      </w:r>
+      <w:r>
+        <w:rPr>
+          <w:rFonts w:ascii="Arial" w:hAnsi="Arial" w:cs="Arial"/>
+          <w:b w:val="0"/>
+          <w:sz w:val="20"/>
+          <w:szCs w:val="20"/>
+        </w:rPr>
+        <w:t>On 13 May 2024 at 4:29 pm the on-call roster for the fortnight beginning that day was circulated to the Switchboard team. [¶¶ 111 to 112]</w:t>
       </w:r>
     </w:p>
     <w:p>
@@ -1762,7 +1782,7 @@
           <w:sz w:val="20"/>
           <w:szCs w:val="20"/>
         </w:rPr>
-        <w:t xml:space="preserve">1(i) The complaint of 13 May 2024 - chronology only (13 May 2024). </w:t>
+        <w:t xml:space="preserve"/>
       </w:r>
       <w:r>
         <w:rPr>
@@ -1771,7 +1791,7 @@
           <w:sz w:val="20"/>
           <w:szCs w:val="20"/>
         </w:rPr>
-        <w:t>On 13 May 2024 the Appellant lodged a corrupt conduct complaint regarding clinical risks. The Ethical Standards Unit formally determined this constituted a Public Interest Disclosure (Admitted Fact: Form 24, para 20, admitted 18 February 2026). The content is not set out. It is pleaded for chronology only; no cause of the injury and no motive is alleged in connection with it.</w:t>
+        <w:t>From 14 May 2024 the process for notifying unavailability for a rostered shift was also directed through the Switchboard Manager, both emails identifying the Switchboard as a means of contacting her. [¶¶ 162 to 165]</w:t>
       </w:r>
     </w:p>
     <w:p>
@@ -1781,20 +1801,10 @@
       <w:r>
         <w:rPr>
           <w:rFonts w:ascii="Arial" w:hAnsi="Arial" w:cs="Arial"/>
-          <w:b/>
-          <w:sz w:val="20"/>
-          <w:szCs w:val="20"/>
-        </w:rPr>
-        <w:t xml:space="preserve">1(j) On-call roster and absence notification instructions - context only (13 to 15 May 2024). </w:t>
-      </w:r>
-      <w:r>
-        <w:rPr>
-          <w:rFonts w:ascii="Arial" w:hAnsi="Arial" w:cs="Arial"/>
-          <w:b w:val="0"/>
-          <w:sz w:val="20"/>
-          <w:szCs w:val="20"/>
-        </w:rPr>
-        <w:t>On 13 May 2024 at 4:29 pm the on-call roster for the fortnight beginning that day was circulated to the Switchboard team. [¶¶ 111 to 112]</w:t>
+          <w:sz w:val="20"/>
+          <w:szCs w:val="20"/>
+        </w:rPr>
+        <w:t>The Respondent does not allege that the Appellant was informed before 14 May 2024 that any other means of notification was required. [¶ 166]</w:t>
       </w:r>
     </w:p>
     <w:p>
@@ -1808,7 +1818,7 @@
           <w:sz w:val="20"/>
           <w:szCs w:val="20"/>
         </w:rPr>
-        <w:t xml:space="preserve"/>
+        <w:t xml:space="preserve">1(k) Respiratory directory error and requests for correction (15 to 20 May 2024). </w:t>
       </w:r>
       <w:r>
         <w:rPr>
@@ -1817,7 +1827,7 @@
           <w:sz w:val="20"/>
           <w:szCs w:val="20"/>
         </w:rPr>
-        <w:t>From 14 May 2024 the process for notifying unavailability for a rostered shift was also directed through the Switchboard Manager, both emails identifying the Switchboard as a means of contacting her. [¶¶ 162 to 165]</w:t>
+        <w:t>On 15 May 2024 at 11:47 am an Administration Officer of the Integrated Respiratory Service wrote to Logan Switch, marked of High importance: "Could you please amend your number registry/directory to show #8768 belongs to the Integrated Respiratory Service... We are not Respiratory Medical OPD and we do not have any doctors working out of this area." [¶ 89]</w:t>
       </w:r>
     </w:p>
     <w:p>
@@ -1830,7 +1840,7 @@
           <w:sz w:val="20"/>
           <w:szCs w:val="20"/>
         </w:rPr>
-        <w:t>The Respondent does not allege that the Appellant was informed before 14 May 2024 that any other means of notification was required. [¶ 166]</w:t>
+        <w:t>The Respondent does not allege that any response was made to that email before 20 May 2024. [¶ 90]</w:t>
       </w:r>
     </w:p>
     <w:p>
@@ -1840,20 +1850,10 @@
       <w:r>
         <w:rPr>
           <w:rFonts w:ascii="Arial" w:hAnsi="Arial" w:cs="Arial"/>
-          <w:b/>
-          <w:sz w:val="20"/>
-          <w:szCs w:val="20"/>
-        </w:rPr>
-        <w:t xml:space="preserve">1(k) Respiratory directory error and requests for correction (15 to 20 May 2024). </w:t>
-      </w:r>
-      <w:r>
-        <w:rPr>
-          <w:rFonts w:ascii="Arial" w:hAnsi="Arial" w:cs="Arial"/>
-          <w:b w:val="0"/>
-          <w:sz w:val="20"/>
-          <w:szCs w:val="20"/>
-        </w:rPr>
-        <w:t>On 15 May 2024 at 11:47 am an Administration Officer of the Integrated Respiratory Service wrote to Logan Switch, marked of High importance: "Could you please amend your number registry/directory to show #8768 belongs to the Integrated Respiratory Service... We are not Respiratory Medical OPD and we do not have any doctors working out of this area." [¶ 89]</w:t>
+          <w:sz w:val="20"/>
+          <w:szCs w:val="20"/>
+        </w:rPr>
+        <w:t>On 20 May at 11:03 am she wrote again, marked of High importance: "Just a courtesy reminder, we continue to get calls put through to us for Respiratory Medical Outpatients... we can not help patients or other clinical staff with OPD issues." [¶¶ 91 to 92]</w:t>
       </w:r>
     </w:p>
     <w:p>
@@ -1866,7 +1866,7 @@
           <w:sz w:val="20"/>
           <w:szCs w:val="20"/>
         </w:rPr>
-        <w:t>The Respondent does not allege that any response was made to that email before 20 May 2024. [¶ 90]</w:t>
+        <w:t>The Respondent does not allege that any response was made to that email before 2:05 pm that day. [¶ 93]</w:t>
       </w:r>
     </w:p>
     <w:p>
@@ -1879,7 +1879,7 @@
           <w:sz w:val="20"/>
           <w:szCs w:val="20"/>
         </w:rPr>
-        <w:t>On 20 May at 11:03 am she wrote again, marked of High importance: "Just a courtesy reminder, we continue to get calls put through to us for Respiratory Medical Outpatients... we can not help patients or other clinical staff with OPD issues." [¶¶ 91 to 92]</w:t>
+        <w:t xml:space="preserve">At 2:05 pm, from the Logan Switch account and within the office hours the Manager had stated to all Switchboard staff on 17 May 2024, the Appellant wrote to the Manager identifying the cause as modifications made to the document "Outpatients Department - Clinic contact Details" on 22 February 2024, and recommending a modification and review of that document. [¶¶ 94 to 96] That email was sent three hours and two minutes after the Service's second email, and five days, two hours and eighteen minutes after its first. [¶¶ 97 to 98]</w:t>
       </w:r>
     </w:p>
     <w:p>
@@ -1892,7 +1892,7 @@
           <w:sz w:val="20"/>
           <w:szCs w:val="20"/>
         </w:rPr>
-        <w:t>The Respondent does not allege that any response was made to that email before 2:05 pm that day. [¶ 93]</w:t>
+        <w:t xml:space="preserve">The Respondent does not allege that the Appellant was rostered to work after 2:05 pm that day. [¶ 99] The Manager's reply at 4:30 pm stated: "Thank you for bringing this to my attention however this task was being actioned. I had discussed with Richard this morning about the update of outpatients respiratory/medical." [¶¶ 100, 104] It was sent two hours and twenty-five minutes after the Appellant's email, and two hours after the conclusion of the office hours she had stated to all Switchboard staff on 17 May 2024. [¶¶ 102 to 103]</w:t>
       </w:r>
     </w:p>
     <w:p>
@@ -1905,7 +1905,7 @@
           <w:sz w:val="20"/>
           <w:szCs w:val="20"/>
         </w:rPr>
-        <w:t>At 2:05 pm, from the Logan Switch account and within the office hours stated to all Switchboard staff on 17 May 2024, the Appellant wrote identifying the cause as modifications made to the document "Outpatients Department - Clinic contact Details" on 22 February 2024, and recommending a modification and review of that document. [¶¶ 94 to 96] That email was sent three hours and two minutes after the Service's second email, and five days, two hours and eighteen minutes after its first. [¶¶ 97 to 98]</w:t>
+        <w:t>The Respondent's amended List of Documents records no document created on 20 May 2024 recording that discussion, and no communication sent by either named person to the Service on that day; and the Respondent does not allege that the other named person communicated with the Service on that day. [¶¶ 105 to 108]</w:t>
       </w:r>
     </w:p>
     <w:p>
@@ -1918,7 +1918,7 @@
           <w:sz w:val="20"/>
           <w:szCs w:val="20"/>
         </w:rPr>
-        <w:t>The Respondent does not allege that the Appellant was rostered to work after 2:05 pm that day. [¶ 99] The reply at 4:30 pm stated: "Thank you for bringing this to my attention however this task was being actioned. I had discussed with Richard this morning about the update of outpatients respiratory/medical." [¶¶ 100, 104] It was sent two hours and twenty-five minutes after the Appellant's email, and two hours after the conclusion of the office hours stated to all Switchboard staff on 17 May 2024. [¶¶ 102 to 103]</w:t>
+        <w:t>The Respondent does not allege that the contact-details document was amended on or before 20 May 2024, or that the Switchboard staff were notified of the modifications made to it on 22 February 2024. [¶¶ 109 to 110]</w:t>
       </w:r>
     </w:p>
     <w:p>
@@ -1931,7 +1931,7 @@
           <w:sz w:val="20"/>
           <w:szCs w:val="20"/>
         </w:rPr>
-        <w:t>The Respondent's amended List of Documents records no document created on 20 May 2024 recording that discussion, and no communication sent by either named person to the Service on that day; and the Respondent does not allege that the other named person communicated with the Service on that day. [¶¶ 105 to 108]</w:t>
+        <w:t xml:space="preserve">So the sequence was: the Service's first email on 15 May 2024; its second on 20 May, the fifth calendar day; the Appellant's escalation five days, two hours and eighteen minutes after the first email and three hours and two minutes after the second; and the Manager's reply two hours and twenty-five minutes after that, two hours after the office hours she had stated had ended. In that time the Respondent alleges no response to the Service, no amendment of the document, and no notice to the staff of the change made to it on 22 February 2024. [¶¶ 90, 93, 97 to 98, 102 to 103, 105 to 110]</w:t>
       </w:r>
     </w:p>
     <w:p>
@@ -1944,7 +1944,7 @@
           <w:sz w:val="20"/>
           <w:szCs w:val="20"/>
         </w:rPr>
-        <w:t>The Respondent does not allege that the contact-details document was amended on or before 20 May 2024, or that the Switchboard staff were notified of the modifications made to it on 22 February 2024. [¶¶ 109 to 110]</w:t>
+        <w:t>On 20 May 2024 at 4:30 pm the Switchboard Manager wrote: "Taking note of your recommendation, we can also put the updated procedures out to the team for consultation before implementing." [¶ 101]</w:t>
       </w:r>
     </w:p>
     <w:p>
@@ -1954,10 +1954,20 @@
       <w:r>
         <w:rPr>
           <w:rFonts w:ascii="Arial" w:hAnsi="Arial" w:cs="Arial"/>
-          <w:sz w:val="20"/>
-          <w:szCs w:val="20"/>
-        </w:rPr>
-        <w:t>So the sequence was: the Service's first email on 15 May 2024; its second on 20 May, the fifth calendar day; the Appellant's escalation five days, two hours and eighteen minutes after the first email and three hours and two minutes after the second; and the reply two hours and twenty-five minutes after that, two hours after the stated office hours had ended. In that time the Respondent alleges no response to the Service, no amendment of the document, and no notice to the staff of the change made to it on 22 February 2024. [¶¶ 90, 93, 97 to 98, 102 to 103, 105 to 110]</w:t>
+          <w:b/>
+          <w:sz w:val="20"/>
+          <w:szCs w:val="20"/>
+        </w:rPr>
+        <w:t xml:space="preserve">1(l) Office hours request and the retraction response (15 to 21 May 2024). </w:t>
+      </w:r>
+      <w:r>
+        <w:rPr>
+          <w:rFonts w:ascii="Arial" w:hAnsi="Arial" w:cs="Arial"/>
+          <w:b w:val="0"/>
+          <w:sz w:val="20"/>
+          <w:szCs w:val="20"/>
+        </w:rPr>
+        <w:t>On 15 May 2024 at 1:15 pm the Appellant wrote to the Manager and Logan Switch, copied to the Switchboard staff, the Director and LBH_HR, asking that she share her office hours so the department could be aware of her regular schedule, noting inconsistency in arrival and departure times, and asking that "any directives and changes within the department is made in consultation with the team". [¶¶ 74 to 75]</w:t>
       </w:r>
     </w:p>
     <w:p>
@@ -1970,7 +1980,7 @@
           <w:sz w:val="20"/>
           <w:szCs w:val="20"/>
         </w:rPr>
-        <w:t>On 20 May 2024 at 4:30 pm the Switchboard Manager wrote: "Taking note of your recommendation, we can also put the updated procedures out to the team for consultation before implementing." [¶ 101]</w:t>
+        <w:t>At 6:23 pm the Director replied, copied to the Manager and marked of High importance, stating that his email "did not demonstrate our iCARE2 value of Respect and did not comply with our Code of conduct", and asked him to retract it. [¶¶ 76 to 77]</w:t>
       </w:r>
     </w:p>
     <w:p>
@@ -1980,20 +1990,10 @@
       <w:r>
         <w:rPr>
           <w:rFonts w:ascii="Arial" w:hAnsi="Arial" w:cs="Arial"/>
-          <w:b/>
-          <w:sz w:val="20"/>
-          <w:szCs w:val="20"/>
-        </w:rPr>
-        <w:t xml:space="preserve">1(l) Office hours request and the retraction response (15 to 21 May 2024). </w:t>
-      </w:r>
-      <w:r>
-        <w:rPr>
-          <w:rFonts w:ascii="Arial" w:hAnsi="Arial" w:cs="Arial"/>
-          <w:b w:val="0"/>
-          <w:sz w:val="20"/>
-          <w:szCs w:val="20"/>
-        </w:rPr>
-        <w:t>On 15 May 2024 at 1:15 pm the Appellant wrote to the Manager and Logan Switch, copied to the Switchboard staff, the Director and LBH_HR, asking that she share her office hours so the department could be aware of her regular schedule, noting inconsistency in arrival and departure times, and asking that "any directives and changes within the department is made in consultation with the team". [¶¶ 74 to 75]</w:t>
+          <w:sz w:val="20"/>
+          <w:szCs w:val="20"/>
+        </w:rPr>
+        <w:t>At 7:09 pm the Appellant replied that "Requesting clarity on business hours is a reasonable question". [¶ 78] The Respondent's outline of Ms Taylor's evidence, served 24 September 2026, states that, acting on HR's advice, she removed the email of 15 May 2024 from the shared Switchboard inbox.</w:t>
       </w:r>
     </w:p>
     <w:p>
@@ -2006,7 +2006,7 @@
           <w:sz w:val="20"/>
           <w:szCs w:val="20"/>
         </w:rPr>
-        <w:t>At 6:23 pm the Director replied, copied to the Manager and marked of High importance, stating that his email "did not demonstrate our iCARE2 value of Respect and did not comply with our Code of conduct", and asked him to retract it. [¶¶ 76 to 77]</w:t>
+        <w:t>On 17 May 2024 at 9:30 am the Manager wrote to the whole department, headed "Switchboard Manager - On call and Hours", stating that her hours "can vary", that "I will be in later between 0800-830am. Otherwise my hours are from 06:30-14:30", that "I will not be in the office until around 11am on Monday 20.05.2024", and that "Moving forward so communication is clear for the team, I will be sending an email to switch to advise of any change to my office hours for the week". [¶¶ 81 to 84, 113] Those stated office hours concluded at 2:30 pm. [¶ 88]</w:t>
       </w:r>
     </w:p>
     <w:p>
@@ -2019,7 +2019,7 @@
           <w:sz w:val="20"/>
           <w:szCs w:val="20"/>
         </w:rPr>
-        <w:t>At 7:09 pm the Appellant replied that "Requesting clarity on business hours is a reasonable question". [¶ 78] The Respondent's outline of Ms Taylor's evidence, served 24 September 2026, states that, acting on HR's advice, she removed the email of 15 May 2024 from the shared Switchboard inbox.</w:t>
+        <w:t>On 21 May 2024 at 2:53 pm the Director replied that she would follow up on the issues raised, and asked "can I ask was there one or more particular changes and/or directives where you had concerns about consultation and communication?" [¶¶ 79 to 80]</w:t>
       </w:r>
     </w:p>
     <w:p>
@@ -2029,23 +2029,35 @@
       <w:r>
         <w:rPr>
           <w:rFonts w:ascii="Arial" w:hAnsi="Arial" w:cs="Arial"/>
-          <w:sz w:val="20"/>
-          <w:szCs w:val="20"/>
-        </w:rPr>
-        <w:t>On 17 May 2024 at 9:30 am the Manager wrote to the whole department, headed "Switchboard Manager - On call and Hours", stating that her hours "can vary", that "I will be in later between 0800-830am. Otherwise my hours are from 06:30-14:30", that "I will not be in the office until around 11am on Monday 20.05.2024", and that "Moving forward so communication is clear for the team, I will be sending an email to switch to advise of any change to my office hours for the week". [¶¶ 81 to 84, 113] Those stated office hours concluded at 2:30 pm. [¶ 88]</w:t>
+          <w:b/>
+          <w:sz w:val="20"/>
+          <w:szCs w:val="20"/>
+        </w:rPr>
+        <w:t xml:space="preserve">So the request for the Manager's office hours was made at 1:15 pm on 15 May 2024. </w:t>
+      </w:r>
+      <w:r>
+        <w:rPr>
+          <w:rFonts w:ascii="Arial" w:hAnsi="Arial" w:cs="Arial"/>
+          <w:b w:val="0"/>
+          <w:sz w:val="20"/>
+          <w:szCs w:val="20"/>
+        </w:rPr>
+        <w:t>The request to retract it came five hours and eight minutes later, at 6:23 pm. The hours were stated to the whole department one day, twenty hours and fifteen minutes after the request, at 9:30 am on 17 May. The Director's question about which changes had concerned him came six days, one hour and thirty-eight minutes after the request, at 2:53 pm on 21 May. Before the request, no fixed hours had been stated for approximately nine months. [¶¶ 73 to 84]</w:t>
       </w:r>
     </w:p>
     <w:p>
       <w:pPr>
+        <w:keepNext/>
         <w:spacing w:before="0" w:after="100" w:line="264" w:lineRule="auto"/>
       </w:pPr>
       <w:r>
         <w:rPr>
           <w:rFonts w:ascii="Arial" w:hAnsi="Arial" w:cs="Arial"/>
-          <w:sz w:val="20"/>
-          <w:szCs w:val="20"/>
-        </w:rPr>
-        <w:t>On 21 May 2024 at 2:53 pm the Director replied that she would follow up on the issues raised, and asked "can I ask was there one or more particular changes and/or directives where you had concerns about consultation and communication?" [¶¶ 79 to 80]</w:t>
+          <w:b/>
+          <w:sz w:val="20"/>
+          <w:szCs w:val="20"/>
+        </w:rPr>
+        <w:t>Supporting records and overlap with the other themes</w:t>
       </w:r>
     </w:p>
     <w:p>
@@ -2059,7 +2071,7 @@
           <w:sz w:val="20"/>
           <w:szCs w:val="20"/>
         </w:rPr>
-        <w:t xml:space="preserve">So the request for the Manager's office hours was made at 1:15 pm on 15 May 2024. </w:t>
+        <w:t xml:space="preserve">The Manager's notice of 18 June 2024. </w:t>
       </w:r>
       <w:r>
         <w:rPr>
@@ -2068,22 +2080,20 @@
           <w:sz w:val="20"/>
           <w:szCs w:val="20"/>
         </w:rPr>
-        <w:t>The request to retract it came five hours and eight minutes later, at 6:23 pm. The hours were stated to the whole department one day, twenty hours and fifteen minutes after the request, at 9:30 am on 17 May. The Director's question about which changes had concerned him came six days, one hour and thirty-eight minutes after the request, at 2:53 pm on 21 May. Before the request, no fixed hours had been stated for approximately nine months. [¶¶ 73 to 84]</w:t>
+        <w:t>On 18 June 2024 at 8:58 am the Manager wrote to Logan Switch: "I am taking today off, and hopefully will be back tomorrow", and "I am sorry I haven't been there for you all over the past week." [¶¶ 85 to 87]</w:t>
       </w:r>
     </w:p>
     <w:p>
       <w:pPr>
-        <w:keepNext/>
         <w:spacing w:before="0" w:after="100" w:line="264" w:lineRule="auto"/>
       </w:pPr>
       <w:r>
         <w:rPr>
           <w:rFonts w:ascii="Arial" w:hAnsi="Arial" w:cs="Arial"/>
-          <w:b/>
-          <w:sz w:val="20"/>
-          <w:szCs w:val="20"/>
-        </w:rPr>
-        <w:t>Supporting records and overlap with the other themes</w:t>
+          <w:sz w:val="20"/>
+          <w:szCs w:val="20"/>
+        </w:rPr>
+        <w:t xml:space="preserve">By letter of 5 June 2026, reference K-LM26/729, signed by the Chief Executive and addressed to the Commission, Metro South Health stated that "there have been no 'consequential' changes to operating procedures over the period requested" [¶ 266], and that "All employee complaints relating to Logan Hospital Switchboard operational errors are made directly to the Line Manager of Switch Board and managed solely via email or verbally with the complainant." [¶ 267] Its statements on fatigue risk management and on the record of MET calls are pleaded at Stressor 3 [¶¶ 263 to 265, 268].</w:t>
       </w:r>
     </w:p>
     <w:p>
@@ -2093,20 +2103,10 @@
       <w:r>
         <w:rPr>
           <w:rFonts w:ascii="Arial" w:hAnsi="Arial" w:cs="Arial"/>
-          <w:b/>
-          <w:sz w:val="20"/>
-          <w:szCs w:val="20"/>
-        </w:rPr>
-        <w:t xml:space="preserve">The Manager's notice of 18 June 2024. </w:t>
-      </w:r>
-      <w:r>
-        <w:rPr>
-          <w:rFonts w:ascii="Arial" w:hAnsi="Arial" w:cs="Arial"/>
-          <w:b w:val="0"/>
-          <w:sz w:val="20"/>
-          <w:szCs w:val="20"/>
-        </w:rPr>
-        <w:t>On 18 June 2024 at 8:58 am the Manager wrote to Logan Switch: "I am taking today off, and hopefully will be back tomorrow", and "I am sorry I haven't been there for you all over the past week." [¶¶ 85 to 87]</w:t>
+          <w:sz w:val="20"/>
+          <w:szCs w:val="20"/>
+        </w:rPr>
+        <w:t xml:space="preserve">The Respondent does not allege that any change was made to the operating procedures of the Switchboard as a consequence of any employee complaint at any time before 30 June 2024 [¶ 272]; its position on fatigue risk management before that date is pleaded at Stressor 3, supporting fatigue records [¶¶ 269 to 271].</w:t>
       </w:r>
     </w:p>
     <w:p>
@@ -2116,10 +2116,11 @@
       <w:r>
         <w:rPr>
           <w:rFonts w:ascii="Arial" w:hAnsi="Arial" w:cs="Arial"/>
-          <w:sz w:val="20"/>
-          <w:szCs w:val="20"/>
-        </w:rPr>
-        <w:t>By letter of 5 June 2026, reference K-LM26/729, signed by the Chief Executive and addressed to the Commission, Metro South Health stated that the requested fatigue risk management documents "do not exist", that mandatory Fatigue Risk Management System training "only applies to health practitioners and clinical assistants" and that Switchboard staff are non-clinical. [¶¶ 263, 265] It stated that "The implementation of fatigue risk management assessment at Switchboard Logan Hospital occurred after 30 June 2024". [¶ 264] It stated that "there have been no 'consequential' changes to operating procedures over the period requested". [¶ 266] It stated that "All employee complaints relating to Logan Hospital Switchboard operational errors are made directly to the Line Manager of Switch Board and managed solely via email or verbally with the complainant." [¶ 267] It stated that "a spreadsheet of recorded MET calls is available for the period 17-18 March 2024". [¶ 268]</w:t>
+          <w:b w:val="0"/>
+          <w:sz w:val="20"/>
+          <w:szCs w:val="20"/>
+        </w:rPr>
+        <w:t>Payroll's direction of 3 May 2024 to correct four fortnights had not been actioned on 13 May [¶¶ 192 to 193] and was still awaited on 21 May [¶¶ 194 to 195]; that sequence is pleaded at Stressor 2(h), 2(i), 2(l) and 2(m) and is repeated here as part of the conditions in which the work was carried on.</w:t>
       </w:r>
     </w:p>
     <w:p>
@@ -2129,10 +2130,20 @@
       <w:r>
         <w:rPr>
           <w:rFonts w:ascii="Arial" w:hAnsi="Arial" w:cs="Arial"/>
-          <w:sz w:val="20"/>
-          <w:szCs w:val="20"/>
-        </w:rPr>
-        <w:t>The Respondent does not allege that any fatigue risk assessment was conducted, that any fatigue risk management training was provided, that fatigue risk management assessment was implemented at the Switchboard, or that any change was made to the operating procedures of the Switchboard as a consequence of any employee complaint, at any time before 30 June 2024. [¶¶ 269 to 272]</w:t>
+          <w:b/>
+          <w:sz w:val="20"/>
+          <w:szCs w:val="20"/>
+        </w:rPr>
+        <w:t xml:space="preserve">The rostering concern raised in August 2023 recurred, and the employer's own documents record it. </w:t>
+      </w:r>
+      <w:r>
+        <w:rPr>
+          <w:rFonts w:ascii="Arial" w:hAnsi="Arial" w:cs="Arial"/>
+          <w:b w:val="0"/>
+          <w:sz w:val="20"/>
+          <w:szCs w:val="20"/>
+        </w:rPr>
+        <w:t>On 26 April 2024 the Director wrote that the Manager "was working to fix this error" [¶¶ 211 to 212]; on 10 May 2024 she wrote to Human Resources that the Appellant's concern was about how the Manager was rostering the team and its effect on staff fatigue [¶ 218], acknowledged "a few rostering errors made by Chloe with regards to Cory's line in past rosters" [¶ 220], and stated that his roster would not be considered [¶ 221]; and on 18 February 2026 the Respondent admitted that the Director stated on 7 August 2023 that there had been a rostering error that was accidentally made [¶ 287]. These facts are pleaded at Stressor 3(a) and 3(e) to 3(g) and are repeated here because they bear on this stressor.</w:t>
       </w:r>
     </w:p>
     <w:p>
@@ -2142,57 +2153,20 @@
       <w:r>
         <w:rPr>
           <w:rFonts w:ascii="Arial" w:hAnsi="Arial" w:cs="Arial"/>
+          <w:b/>
+          <w:sz w:val="20"/>
+          <w:szCs w:val="20"/>
+        </w:rPr>
+        <w:t xml:space="preserve">Context and the Respondent's pleaded position. </w:t>
+      </w:r>
+      <w:r>
+        <w:rPr>
+          <w:rFonts w:ascii="Arial" w:hAnsi="Arial" w:cs="Arial"/>
           <w:b w:val="0"/>
           <w:sz w:val="20"/>
           <w:szCs w:val="20"/>
         </w:rPr>
-        <w:t>Payroll's direction of 3 May 2024 to correct four fortnights had not been actioned on 13 May [¶¶ 192 to 193] and was still awaited on 21 May [¶¶ 194 to 195]; that sequence is pleaded at Stressor 2(h), 2(i), 2(l) and 2(m) and is repeated here as part of the conditions in which the work was carried on.</w:t>
-      </w:r>
-    </w:p>
-    <w:p>
-      <w:pPr>
-        <w:spacing w:before="0" w:after="100" w:line="264" w:lineRule="auto"/>
-      </w:pPr>
-      <w:r>
-        <w:rPr>
-          <w:rFonts w:ascii="Arial" w:hAnsi="Arial" w:cs="Arial"/>
-          <w:b/>
-          <w:sz w:val="20"/>
-          <w:szCs w:val="20"/>
-        </w:rPr>
-        <w:t xml:space="preserve">The rostering concern raised in August 2023 recurred, and the employer's own documents record it. </w:t>
-      </w:r>
-      <w:r>
-        <w:rPr>
-          <w:rFonts w:ascii="Arial" w:hAnsi="Arial" w:cs="Arial"/>
-          <w:b w:val="0"/>
-          <w:sz w:val="20"/>
-          <w:szCs w:val="20"/>
-        </w:rPr>
-        <w:t>On 26 April 2024 the Director wrote that the Manager "was working to fix this error" [¶¶ 211 to 212]; on 10 May 2024 she wrote to Human Resources that the Appellant's concern was about how the Manager was rostering the team and its effect on staff fatigue [¶ 218], acknowledged "a few rostering errors made by Chloe with regards to Cory's line in past rosters" [¶ 220], and stated that his roster would not be considered [¶ 221]; and on 18 February 2026 the Respondent admitted that the Director stated on 7 August 2023 that there had been a rostering error that was accidentally made [¶ 287]. These facts are pleaded at Stressor 3(a) and 3(e) to 3(g) and are repeated here because they bear on this stressor.</w:t>
-      </w:r>
-    </w:p>
-    <w:p>
-      <w:pPr>
-        <w:spacing w:before="0" w:after="100" w:line="264" w:lineRule="auto"/>
-      </w:pPr>
-      <w:r>
-        <w:rPr>
-          <w:rFonts w:ascii="Arial" w:hAnsi="Arial" w:cs="Arial"/>
-          <w:b/>
-          <w:sz w:val="20"/>
-          <w:szCs w:val="20"/>
-        </w:rPr>
-        <w:t xml:space="preserve">Context and the Respondent's pleaded position. </w:t>
-      </w:r>
-      <w:r>
-        <w:rPr>
-          <w:rFonts w:ascii="Arial" w:hAnsi="Arial" w:cs="Arial"/>
-          <w:b w:val="0"/>
-          <w:sz w:val="20"/>
-          <w:szCs w:val="20"/>
-        </w:rPr>
-        <w:t>The Respondent does not allege that the Appellant was subject to any disciplinary process, or that his work performance was the subject of any formal performance management process, before 18 June 2024, nor does it describe any communication with him before that date as a warning. [¶¶ 300 to 302] Paragraph 27 of its amended statement of facts and contentions does not identify the management action relied upon. [¶ 303] The matters at 1(a), 1(c), 1(e), 1(i) and 1(j), and at paragraph 3 below, are pleaded as part of the sequence of matters the Appellant raised and the responses he received. They are not relied on as separate causes within Stressor 1. Where an admitted fact from that sequence is repeated under Stressor 2 or Stressor 3, it is relied on there only for the purpose stated under that stressor. The circumstances relied on as causes in Stressor 1 are those at 1(b), 1(d), 1(f) to 1(h), 1(k) and 1(l), read with the opening duties and standards and the supporting records.</w:t>
+        <w:t xml:space="preserve">The Respondent's pleaded answer, including paragraph 27 of its statement, is at Part C, paragraph 10. [¶¶ 300 to 303] The matters at 1(a), 1(c), 1(e), 1(i) and 1(j), and at paragraph 3 below, are pleaded as part of the sequence of matters the Appellant raised and the responses he received. They are not relied on as separate causes within Stressor 1. Where an admitted fact from that sequence is repeated under Stressor 2 or Stressor 3, it is relied on there only for the purpose stated under that stressor. The circumstances relied on as causes in Stressor 1 are those at 1(b), 1(d), 1(f) to 1(h), 1(k) and 1(l), read with the opening duties and standards and the supporting records.</w:t>
       </w:r>
       <w:r>
         <w:rPr>
@@ -2862,7 +2836,7 @@
           <w:sz w:val="20"/>
           <w:szCs w:val="20"/>
         </w:rPr>
-        <w:t>The Respondent does not allege that the Appellant was subject to any disciplinary process, or that his work performance was the subject of any formal performance management process, before 18 June 2024, nor does it describe any communication with him before that date as a warning. [¶¶ 300 to 302] Paragraph 27 of its amended statement of facts and contentions, which contends that any management action was reasonable management action taken in a reasonable way, does not identify, by particular, date, document or cross-reference, the management action relied upon. [¶¶ 238, 303] The employer's letter of 5 June 2026 states that there were no consequential changes to operating procedures over the period requested [¶ 266] and how employee complaints were managed [¶ 267], and the Respondent does not allege any change to the operating procedures of the Switchboard as a consequence of any employee complaint before 30 June 2024 [¶ 272]; those facts are pleaded at Stressors 1, supporting records and 3, supporting fatigue records and are repeated here.</w:t>
+        <w:t xml:space="preserve">The Respondent's pleaded answer, including paragraph 27 of its statement, is at Part C, paragraph 10 [¶¶ 238, 300 to 303]. The employer's letter of 5 June 2026 on operating procedures and complaint handling is pleaded at Stressor 1, supporting records [¶¶ 266 to 267, 272].</w:t>
       </w:r>
     </w:p>
     <w:p>
@@ -3328,10 +3302,20 @@
       <w:r>
         <w:rPr>
           <w:rFonts w:ascii="Arial" w:hAnsi="Arial" w:cs="Arial"/>
-          <w:sz w:val="20"/>
-          <w:szCs w:val="20"/>
-        </w:rPr>
-        <w:t>The agreement of 17 June 2020, the Appellant's submission that it "was no longer fit for purpose" after his transition, and the surrounding matters as to it are pleaded under the agreement heading above. [¶¶ 17 to 25]</w:t>
+          <w:b/>
+          <w:sz w:val="20"/>
+          <w:szCs w:val="20"/>
+        </w:rPr>
+        <w:t xml:space="preserve">The rest recorded between those shifts. </w:t>
+      </w:r>
+      <w:r>
+        <w:rPr>
+          <w:rFonts w:ascii="Arial" w:hAnsi="Arial" w:cs="Arial"/>
+          <w:b w:val="0"/>
+          <w:sz w:val="20"/>
+          <w:szCs w:val="20"/>
+        </w:rPr>
+        <w:t>The seven-hour figure is the interval between the rostered finish at 23:00 on 17 March 2024 and the rostered commencement at 06:00 on 18 March 2024. The review decision records the Appellant's response of 9 August 2024 that the break "did not include travel time" and that, with travel factored in, the break between shifts would have been less than five hours. [¶ 251] The Appellant's account is this. His home is on the Gold Coast and the drive to and from Logan Hospital took about an hour each way at those hours. Across the two shifts about four hours were spent driving. When the 17 March shift ended at 23:00 he had been awake and working for about sixteen hours. Of the seven hours before 06:00, two were on the road and at best four to five were available for sleep. So, across the pair of shifts, the Appellant's account is: about sixteen hours of work, on two eight-hour shifts; about four hours of travel, in four drives of about an hour each; and about four hours of sleep, of the four to five hours available. The seven hours and the response of 9 August 2024 are the admitted record; the rest of that account is the Appellant's own evidence.</w:t>
       </w:r>
     </w:p>
     <w:p>
@@ -3345,7 +3329,7 @@
           <w:sz w:val="20"/>
           <w:szCs w:val="20"/>
         </w:rPr>
-        <w:t xml:space="preserve">The rest recorded between those shifts. </w:t>
+        <w:t xml:space="preserve">The codes on the shift of 17 March 2024. </w:t>
       </w:r>
       <w:r>
         <w:rPr>
@@ -3354,7 +3338,7 @@
           <w:sz w:val="20"/>
           <w:szCs w:val="20"/>
         </w:rPr>
-        <w:t>The seven-hour figure is the interval between the rostered finish at 23:00 on 17 March 2024 and the rostered commencement at 06:00 on 18 March 2024. The review decision records the Appellant's response of 9 August 2024 that the break "did not include travel time" and that, with travel factored in, the break between shifts would have been less than five hours. [¶ 251] The Appellant's account is this. His home is on the Gold Coast and the drive to and from Logan Hospital took about an hour each way at those hours. Across the two shifts about four hours were spent driving. When the 17 March shift ended at 23:00 he had been awake and working for about sixteen hours. Of the seven hours before 06:00, two were on the road and at best four to five were available for sleep. So, across the pair of shifts, the Appellant's account is: about sixteen hours of work, on two eight-hour shifts; about four hours of travel, in four drives of about an hour each; and about four hours of sleep, of the four to five hours available. The seven hours and the response of 9 August 2024 are the admitted record; the rest of that account is the Appellant's own evidence.</w:t>
+        <w:t>The shift ended at 23:00. [¶ 284] The Emergency Code Register for that day (Tab 31) records eight codes: at 3:57 a Code Grey in the ED lounge; at 5:19 a MET call to Ward 5A bed 27; at 7:48 a Code Grey in the ED corridor near short stay; at 13:48 a MET call to Ward 3B bed 2; at 14:13 a Code Grey in ED adult acute bed 15; at 19:16 a MET call to Ward 2H bed 7; at 19:20, four minutes later, a Code Blue to the same patient, Ward 2H bed 7; and at 21:16 a MET call to Ward 2Q bed 5. The last three fell in the evening of that shift.</w:t>
       </w:r>
     </w:p>
     <w:p>
@@ -3368,7 +3352,7 @@
           <w:sz w:val="20"/>
           <w:szCs w:val="20"/>
         </w:rPr>
-        <w:t xml:space="preserve">The codes on the shift of 17 March 2024. </w:t>
+        <w:t xml:space="preserve">The codes on the shift of 18 March 2024. </w:t>
       </w:r>
       <w:r>
         <w:rPr>
@@ -3377,7 +3361,7 @@
           <w:sz w:val="20"/>
           <w:szCs w:val="20"/>
         </w:rPr>
-        <w:t>The shift ended at 23:00. [¶ 284] The Emergency Code Register for that day (Tab 31) records eight codes: at 3:57 a Code Grey in the ED lounge; at 5:19 a MET call to Ward 5A bed 27; at 7:48 a Code Grey in the ED corridor near short stay; at 13:48 a MET call to Ward 3B bed 2; at 14:13 a Code Grey in ED adult acute bed 15; at 19:16 a MET call to Ward 2H bed 7; at 19:20, four minutes later, a Code Blue to the same patient, Ward 2H bed 7; and at 21:16 a MET call to Ward 2Q bed 5. The last three fell in the evening of that shift.</w:t>
+        <w:t>The shift began at 06:00, seven hours after the previous one ended. [¶ 284] The register records eleven codes that day: at 8:48 a Code Grey at the QAS triage airlock; at 9:20 a MET call to Ward 6A bed 8; at 11:31 a MET call to Ward 3DR bed 14, cancelled at 11:32; at 11:35 a Neonatal MET call to Theatre 2; at 13:09 a Neonatal MET call to Birth Suites 5; at 14:38 a MET call to Ward 3DR bed 11; at 14:45 and 14:55 Code Greys at QAS triage; and at 19:15 and 19:34 Code Greys on the ED QAS ramp. Six of those fell between 06:00 and 14:00: a Code Grey, three adult MET calls (one cancelled within a minute) and two Neonatal MET calls.</w:t>
       </w:r>
     </w:p>
     <w:p>
@@ -3387,20 +3371,10 @@
       <w:r>
         <w:rPr>
           <w:rFonts w:ascii="Arial" w:hAnsi="Arial" w:cs="Arial"/>
-          <w:b/>
-          <w:sz w:val="20"/>
-          <w:szCs w:val="20"/>
-        </w:rPr>
-        <w:t xml:space="preserve">The codes on the shift of 18 March 2024. </w:t>
-      </w:r>
-      <w:r>
-        <w:rPr>
-          <w:rFonts w:ascii="Arial" w:hAnsi="Arial" w:cs="Arial"/>
-          <w:b w:val="0"/>
-          <w:sz w:val="20"/>
-          <w:szCs w:val="20"/>
-        </w:rPr>
-        <w:t>The shift began at 06:00, seven hours after the previous one ended. [¶ 284] The register records eleven codes that day: at 8:48 a Code Grey at the QAS triage airlock; at 9:20 a MET call to Ward 6A bed 8; at 11:31 a MET call to Ward 3DR bed 14, cancelled at 11:32; at 11:35 a Neonatal MET call to Theatre 2; at 13:09 a Neonatal MET call to Birth Suites 5; at 14:38 a MET call to Ward 3DR bed 11; at 14:45 and 14:55 Code Greys at QAS triage; and at 19:15 and 19:34 Code Greys on the ED QAS ramp. Six of those fell between 06:00 and 14:00: a Code Grey, three adult MET calls (one cancelled within a minute) and two Neonatal MET calls.</w:t>
+          <w:sz w:val="20"/>
+          <w:szCs w:val="20"/>
+        </w:rPr>
+        <w:t>The entries are those recorded in the register at Tab 31. The propositions drawn from it (paragraphs 228 to 231 of the notice: the eight entries on 17 March including the MET call and Code Blue to Ward 2H bed 7; the six entries between 06:00 and 14:00 on 18 March including the two Neonatal MET calls; and the 19 March entry "CALLED VIA SWITRCHBOARD") were not admitted, and the authenticity of the copy is in issue (Schedule, Part 1, Tab 31). The employer holds its own record of the MET calls for 17 and 18 March 2024. [¶ 268]</w:t>
       </w:r>
     </w:p>
     <w:p>
@@ -3410,10 +3384,20 @@
       <w:r>
         <w:rPr>
           <w:rFonts w:ascii="Arial" w:hAnsi="Arial" w:cs="Arial"/>
-          <w:sz w:val="20"/>
-          <w:szCs w:val="20"/>
-        </w:rPr>
-        <w:t>The entries are those recorded in the register at Tab 31. The propositions drawn from it (paragraphs 228 to 231 of the notice: the eight entries on 17 March including the MET call and Code Blue to Ward 2H bed 7; the six entries between 06:00 and 14:00 on 18 March including the two Neonatal MET calls; and the 19 March entry "CALLED VIA SWITRCHBOARD") were not admitted, and the authenticity of the copy is in issue (Schedule, Part 1, Tab 31). The employer holds its own record of the MET calls for 17 and 18 March 2024. [¶ 268]</w:t>
+          <w:b/>
+          <w:sz w:val="20"/>
+          <w:szCs w:val="20"/>
+        </w:rPr>
+        <w:t xml:space="preserve">The ordinary call load, and the Monday. </w:t>
+      </w:r>
+      <w:r>
+        <w:rPr>
+          <w:rFonts w:ascii="Arial" w:hAnsi="Arial" w:cs="Arial"/>
+          <w:b w:val="0"/>
+          <w:sz w:val="20"/>
+          <w:szCs w:val="20"/>
+        </w:rPr>
+        <w:t>In April 2025, during the Appellant's graduated return, the console took between 269 and 444 calls on a single eight-hour shift, an average of about 360, on the monthly call statistics for that period; the highest figure, 444, was the one Monday afternoon shift in that period, 14 April 2025. On the Appellant's account the Monday early shift is the peak of the week: the weekend's backlog, the resumption of clinics and elective lists and the Monday admissions arrive at the console together. The shift of 18 March 2024 was the Monday early shift, the first shift of the working week [¶ 227], and it followed a break of seven hours. [¶ 284]</w:t>
       </w:r>
     </w:p>
     <w:p>
@@ -3427,7 +3411,7 @@
           <w:sz w:val="20"/>
           <w:szCs w:val="20"/>
         </w:rPr>
-        <w:t xml:space="preserve">The ordinary call load, and the Monday. </w:t>
+        <w:t xml:space="preserve">3(c) Sick leave after the consecutive shifts (19 March 2024). </w:t>
       </w:r>
       <w:r>
         <w:rPr>
@@ -3436,7 +3420,7 @@
           <w:sz w:val="20"/>
           <w:szCs w:val="20"/>
         </w:rPr>
-        <w:t>In April 2025, during the Appellant's graduated return, the console took between 269 and 444 calls on a single eight-hour shift, an average of about 360, on the monthly call statistics for that period; the highest figure, 444, was the one Monday afternoon shift in that period, 14 April 2025. On the Appellant's account the Monday early shift is the peak of the week: the weekend's backlog, the resumption of clinics and elective lists and the Monday admissions arrive at the console together. The shift of 18 March 2024 was the Monday early shift, the first shift of the working week [¶ 227], and it followed a break of seven hours. [¶ 284]</w:t>
+        <w:t>The Leave Takings Report produced by Metro South Health in respect of 19 March 2024 records the Leave Category as "Sick", the Leave Type as "Sick Leave", the Time Code as "SCK", the Leave Taken as 7.60 hours and the Leave Status as approved. [¶ 235]</w:t>
       </w:r>
     </w:p>
     <w:p>
@@ -3446,20 +3430,11 @@
       <w:r>
         <w:rPr>
           <w:rFonts w:ascii="Arial" w:hAnsi="Arial" w:cs="Arial"/>
-          <w:b/>
-          <w:sz w:val="20"/>
-          <w:szCs w:val="20"/>
-        </w:rPr>
-        <w:t xml:space="preserve">3(c) Sick leave after the consecutive shifts (19 March 2024). </w:t>
-      </w:r>
-      <w:r>
-        <w:rPr>
-          <w:rFonts w:ascii="Arial" w:hAnsi="Arial" w:cs="Arial"/>
           <w:b w:val="0"/>
           <w:sz w:val="20"/>
           <w:szCs w:val="20"/>
         </w:rPr>
-        <w:t>The Leave Takings Report produced by Metro South Health in respect of 19 March 2024 records the Leave Category as "Sick", the Leave Type as "Sick Leave", the Time Code as "SCK", the Leave Taken as 7.60 hours and the Leave Status as approved. [¶ 235]</w:t>
+        <w:t>The Respondent pleads that the Appellant took leave on 19 March 2024 but says this was paid leave, and that pursuant to clause 18.10 of the Award he is not entitled to fatigue leave because he was not performing overtime. [¶¶ 236 to 237] The Respondent's outlines served 24 September 2026 give notice that its payroll witness will say the Award's fatigue provision "applies to breaks around overtime, not between two ordinary shifts". On that account, no fatigue-leave entitlement under clause 18.10 arose from the short break between ordinary shifts. That contention does not itself answer whether the roster or the response to fatigue was reasonable.</w:t>
       </w:r>
     </w:p>
     <w:p>
@@ -3469,11 +3444,20 @@
       <w:r>
         <w:rPr>
           <w:rFonts w:ascii="Arial" w:hAnsi="Arial" w:cs="Arial"/>
+          <w:b/>
+          <w:sz w:val="20"/>
+          <w:szCs w:val="20"/>
+        </w:rPr>
+        <w:t xml:space="preserve">The codes on 19 March 2024, the day of the sick leave. </w:t>
+      </w:r>
+      <w:r>
+        <w:rPr>
+          <w:rFonts w:ascii="Arial" w:hAnsi="Arial" w:cs="Arial"/>
           <w:b w:val="0"/>
           <w:sz w:val="20"/>
           <w:szCs w:val="20"/>
         </w:rPr>
-        <w:t>The Respondent pleads that the Appellant took leave on 19 March 2024 but says this was paid leave, and that pursuant to clause 18.10 of the Award he is not entitled to fatigue leave because he was not performing overtime. [¶¶ 236 to 237] The Respondent's outlines served 24 September 2026 give notice that its payroll witness will say the Award's fatigue provision "applies to breaks around overtime, not between two ordinary shifts". On that account, no fatigue-leave entitlement under clause 18.10 arose from the short break between ordinary shifts. That contention does not itself answer whether the roster or the response to fatigue was reasonable.</w:t>
+        <w:t>Sick leave of 7.60 hours was taken that day. [¶ 235] The register records sixteen entries on 19 March 2024: at 0:17 a MET call to Ward MIU bed 21; at 1:41 a Code Grey in ED Ambi Care; at 9:27 a Paediatric MET call to Ward CIU bed 16; at 10:28 a simulation MET call (adults) to Ward 7C bed 3; at 11:30 a MET call to Ward 2I bed 20; at 11:34 a MET call to the same patient, Ward 2I bed 20, annotated "CALLED VIA SWITRCHBOARD" [sic]; at 12:36 a MET call to Ward 2I bed 12; at 13:42 a MET call to Ward 3DR bed 11; at 16:28 a further MET call to Ward 3DR bed 11, cancelled at 16:29; at 16:48 a Code Grey in the ED mental health lounge; at 17:23 a further MET call to Ward 3DR bed 11; at 17:31 a Code Grey in ED Ambi Care room 2; at 18:45 a MET call to Ward 5B bed 7; at 21:28 a Code Grey in the ED mental health lounge; and at 22:25 a Code Grey at ED QAS triage. Six of those fell between 06:00 and 14:00: a Paediatric MET call, a simulation, and four adult MET calls. Ward 3DR bed 11, the subject of a MET call at 14:38 on the shift of 18 March, was the subject of further MET calls at 13:42, 16:28 and 17:23 on 19 March.</w:t>
       </w:r>
     </w:p>
     <w:p>
@@ -3487,7 +3471,7 @@
           <w:sz w:val="20"/>
           <w:szCs w:val="20"/>
         </w:rPr>
-        <w:t xml:space="preserve">The codes on 19 March 2024, the day of the sick leave. </w:t>
+        <w:t xml:space="preserve">3(d) Fatigue enquiry and refusal (8 April to 1 May 2024). </w:t>
       </w:r>
       <w:r>
         <w:rPr>
@@ -3496,7 +3480,7 @@
           <w:sz w:val="20"/>
           <w:szCs w:val="20"/>
         </w:rPr>
-        <w:t>Sick leave of 7.60 hours was taken that day. [¶ 235] The register records sixteen entries on 19 March 2024: at 0:17 a MET call to Ward MIU bed 21; at 1:41 a Code Grey in ED Ambi Care; at 9:27 a Paediatric MET call to Ward CIU bed 16; at 10:28 a simulation MET call (adults) to Ward 7C bed 3; at 11:30 a MET call to Ward 2I bed 20; at 11:34 a MET call to the same patient, Ward 2I bed 20, annotated "CALLED VIA SWITRCHBOARD" [sic]; at 12:36 a MET call to Ward 2I bed 12; at 13:42 a MET call to Ward 3DR bed 11; at 16:28 a further MET call to Ward 3DR bed 11, cancelled at 16:29; at 16:48 a Code Grey in the ED mental health lounge; at 17:23 a further MET call to Ward 3DR bed 11; at 17:31 a Code Grey in ED Ambi Care room 2; at 18:45 a MET call to Ward 5B bed 7; at 21:28 a Code Grey in the ED mental health lounge; and at 22:25 a Code Grey at ED QAS triage. Six of those fell between 06:00 and 14:00: a Paediatric MET call, a simulation, and four adult MET calls. Ward 3DR bed 11, the subject of a MET call at 14:38 on the shift of 18 March, was the subject of further MET calls at 13:42, 16:28 and 17:23 on 19 March.</w:t>
+        <w:t>The review decision records: "You emailed Ms Taylor on 8 April 2024 and requested a review of your payment for the pay period between 8 March 2024 and 31 March 2024", noting the Award requirement as to a minimum ten-hour break. [¶¶ 242 to 243]</w:t>
       </w:r>
     </w:p>
     <w:p>
@@ -3506,20 +3490,10 @@
       <w:r>
         <w:rPr>
           <w:rFonts w:ascii="Arial" w:hAnsi="Arial" w:cs="Arial"/>
-          <w:b/>
-          <w:sz w:val="20"/>
-          <w:szCs w:val="20"/>
-        </w:rPr>
-        <w:t xml:space="preserve">3(d) Fatigue enquiry and refusal (8 April to 1 May 2024). </w:t>
-      </w:r>
-      <w:r>
-        <w:rPr>
-          <w:rFonts w:ascii="Arial" w:hAnsi="Arial" w:cs="Arial"/>
-          <w:b w:val="0"/>
-          <w:sz w:val="20"/>
-          <w:szCs w:val="20"/>
-        </w:rPr>
-        <w:t>The review decision records: "You emailed Ms Taylor on 8 April 2024 and requested a review of your payment for the pay period between 8 March 2024 and 31 March 2024", noting the Award requirement as to a minimum ten-hour break. [¶¶ 242 to 243]</w:t>
+          <w:sz w:val="20"/>
+          <w:szCs w:val="20"/>
+        </w:rPr>
+        <w:t>It records that she replied on 9 April 2024 and "added she also escalated your enquiry regarding fatigue leave to Human Resources to confirm policies around this", and that she "proceeded to acknowledge the importance of communication and requested that you raise your concerns with her as soon as they arise so she could action them sooner for you". [¶¶ 244 to 245]</w:t>
       </w:r>
     </w:p>
     <w:p>
@@ -3532,7 +3506,7 @@
           <w:sz w:val="20"/>
           <w:szCs w:val="20"/>
         </w:rPr>
-        <w:t>It records that she replied on 9 April 2024 and "added she also escalated your enquiry regarding fatigue leave to Human Resources to confirm policies around this", and that she "proceeded to acknowledge the importance of communication and requested that you raise your concerns with her as soon as they arise so she could action them sooner for you". [¶¶ 244 to 245]</w:t>
+        <w:t>It records that on 24 April 2024 the Appellant emailed expressing dissatisfaction that it had been more than two weeks without any response or overtime payment. [¶ 246]</w:t>
       </w:r>
     </w:p>
     <w:p>
@@ -3545,7 +3519,7 @@
           <w:sz w:val="20"/>
           <w:szCs w:val="20"/>
         </w:rPr>
-        <w:t>It records that on 24 April 2024 the Appellant emailed expressing dissatisfaction that it had been more than two weeks without any response or overtime payment. [¶ 246]</w:t>
+        <w:t>The Respondent does not allege that any response was made to the fatigue enquiry between 9 April and 1 May 2024; the enquiry of 8 April was answered after 23 days. [¶¶ 249 to 250]</w:t>
       </w:r>
     </w:p>
     <w:p>
@@ -3558,7 +3532,7 @@
           <w:sz w:val="20"/>
           <w:szCs w:val="20"/>
         </w:rPr>
-        <w:t>The Respondent does not allege that any response was made to the fatigue enquiry between 9 April and 1 May 2024; the enquiry of 8 April was answered after 23 days. [¶¶ 249 to 250]</w:t>
+        <w:t>It records that she responded on 1 May 2024 stating that after a consultation with payroll and Human Resources the request for fatigue payment for 18 March 2024 would not be processed due to the existing 8-hour agreement, and noting that he was able to terminate that agreement going forward. [¶¶ 247 to 248]</w:t>
       </w:r>
     </w:p>
     <w:p>
@@ -3571,7 +3545,7 @@
           <w:sz w:val="20"/>
           <w:szCs w:val="20"/>
         </w:rPr>
-        <w:t>It records that she responded on 1 May 2024 stating that after a consultation with payroll and Human Resources the request for fatigue payment for 18 March 2024 would not be processed due to the existing 8-hour agreement, and noting that he was able to terminate that agreement going forward. [¶¶ 247 to 248]</w:t>
+        <w:t>It records that payroll was, as at 1 May 2024, still reviewing his entitlements; that the employer did not mention his shift on 18 March 2024; and that there was uncertainty between him and the employer regarding whether the 8-hour agreement continued to apply. [¶¶ 253 to 255]</w:t>
       </w:r>
     </w:p>
     <w:p>
@@ -3584,7 +3558,7 @@
           <w:sz w:val="20"/>
           <w:szCs w:val="20"/>
         </w:rPr>
-        <w:t>It records that payroll was, as at 1 May 2024, still reviewing his entitlements; that the employer did not mention his shift on 18 March 2024; and that there was uncertainty between him and the employer regarding whether the 8-hour agreement continued to apply. [¶¶ 253 to 255]</w:t>
+        <w:t>So the enquiry of 8 April 2024 was answered on 1 May 2024, 23 days later, with a refusal. In between were the acknowledgment of 9 April, the escalation to Human Resources, and the Appellant's email of 24 April; no other response is alleged. [¶¶ 242 to 250] So the day after the consecutive shifts was recorded against the Appellant's own sick leave [¶ 235], and the Respondent says no fatigue leave was due for it [¶¶ 236 to 237]. The refusal relied on an agreement signed at a time the Respondent does not allege the Manager held that role, and never reviewed; the Respondent does not allege that he was told, before that day, that he could end it "going forward". [¶¶ 21 to 22, 25, 242 to 250]</w:t>
       </w:r>
     </w:p>
     <w:p>
@@ -3594,10 +3568,20 @@
       <w:r>
         <w:rPr>
           <w:rFonts w:ascii="Arial" w:hAnsi="Arial" w:cs="Arial"/>
-          <w:sz w:val="20"/>
-          <w:szCs w:val="20"/>
-        </w:rPr>
-        <w:t>So the enquiry of 8 April 2024 was answered on 1 May 2024, 23 days later, with a refusal. In between were the acknowledgment of 9 April, the escalation to Human Resources, and the Appellant's email of 24 April; no other response is alleged. [¶¶ 242 to 250] So the day after the consecutive shifts was recorded against the Appellant's own sick leave [¶ 235], and the Respondent says no fatigue leave was due for it [¶¶ 236 to 237]. The refusal relied on an agreement signed at a time the Respondent does not allege the Manager held that role, and never reviewed; the Respondent does not allege that he was told, before that day, that he could end it "going forward". [¶¶ 21 to 22, 25, 242 to 250]</w:t>
+          <w:b/>
+          <w:sz w:val="20"/>
+          <w:szCs w:val="20"/>
+        </w:rPr>
+        <w:t xml:space="preserve">3(e) Roster line error and proposed alternatives (16 to 26 April 2024). </w:t>
+      </w:r>
+      <w:r>
+        <w:rPr>
+          <w:rFonts w:ascii="Arial" w:hAnsi="Arial" w:cs="Arial"/>
+          <w:b w:val="0"/>
+          <w:sz w:val="20"/>
+          <w:szCs w:val="20"/>
+        </w:rPr>
+        <w:t>On 26 April 2024 at 1:52 pm the Director wrote with the subject "Roster Concerns", referring to a meeting on 16 April 2024 at which the Appellant had raised a roster line ending with night shifts followed by three days off and then returning to night shifts, and stating that the Manager "was working to fix this error and would get in touch with you about what alternative shifts she could offer". [¶¶ 211 to 212]</w:t>
       </w:r>
     </w:p>
     <w:p>
@@ -3607,20 +3591,10 @@
       <w:r>
         <w:rPr>
           <w:rFonts w:ascii="Arial" w:hAnsi="Arial" w:cs="Arial"/>
-          <w:b/>
-          <w:sz w:val="20"/>
-          <w:szCs w:val="20"/>
-        </w:rPr>
-        <w:t xml:space="preserve">3(e) Roster line error and proposed alternatives (16 to 26 April 2024). </w:t>
-      </w:r>
-      <w:r>
-        <w:rPr>
-          <w:rFonts w:ascii="Arial" w:hAnsi="Arial" w:cs="Arial"/>
-          <w:b w:val="0"/>
-          <w:sz w:val="20"/>
-          <w:szCs w:val="20"/>
-        </w:rPr>
-        <w:t>On 26 April 2024 at 1:52 pm the Director wrote with the subject "Roster Concerns", referring to a meeting on 16 April 2024 at which the Appellant had raised a roster line ending with night shifts followed by three days off and then returning to night shifts, and stating that the Manager "was working to fix this error and would get in touch with you about what alternative shifts she could offer". [¶¶ 211 to 212]</w:t>
+          <w:sz w:val="20"/>
+          <w:szCs w:val="20"/>
+        </w:rPr>
+        <w:t>The Respondent does not allege that she got in touch with him about alternative shifts following that meeting. [¶ 213]</w:t>
       </w:r>
     </w:p>
     <w:p>
@@ -3630,10 +3604,20 @@
       <w:r>
         <w:rPr>
           <w:rFonts w:ascii="Arial" w:hAnsi="Arial" w:cs="Arial"/>
-          <w:sz w:val="20"/>
-          <w:szCs w:val="20"/>
-        </w:rPr>
-        <w:t>The Respondent does not allege that she got in touch with him about alternative shifts following that meeting. [¶ 213]</w:t>
+          <w:b/>
+          <w:sz w:val="20"/>
+          <w:szCs w:val="20"/>
+        </w:rPr>
+        <w:t xml:space="preserve">3(f) Fatigue toolkit raised and HR advice awaited (1 to 8 May 2024). </w:t>
+      </w:r>
+      <w:r>
+        <w:rPr>
+          <w:rFonts w:ascii="Arial" w:hAnsi="Arial" w:cs="Arial"/>
+          <w:b w:val="0"/>
+          <w:sz w:val="20"/>
+          <w:szCs w:val="20"/>
+        </w:rPr>
+        <w:t>On 1 May 2024 at 1:18 pm the Appellant referred to section 4, clause 10.4.1 of the Operations Manual, which "includes a toolkit required by management to manage fatigue and implement appropriate protocols and adhere to the workplace health and safety act", and stated: "I forwarded the toolkit to Chloe last week for review and action but have yet to receive feedback". [¶¶ 214 to 215]</w:t>
       </w:r>
     </w:p>
     <w:p>
@@ -3643,20 +3627,10 @@
       <w:r>
         <w:rPr>
           <w:rFonts w:ascii="Arial" w:hAnsi="Arial" w:cs="Arial"/>
-          <w:b/>
-          <w:sz w:val="20"/>
-          <w:szCs w:val="20"/>
-        </w:rPr>
-        <w:t xml:space="preserve">3(f) Fatigue toolkit raised and HR advice awaited (1 to 8 May 2024). </w:t>
-      </w:r>
-      <w:r>
-        <w:rPr>
-          <w:rFonts w:ascii="Arial" w:hAnsi="Arial" w:cs="Arial"/>
-          <w:b w:val="0"/>
-          <w:sz w:val="20"/>
-          <w:szCs w:val="20"/>
-        </w:rPr>
-        <w:t>On 1 May 2024 at 1:18 pm the Appellant referred to section 4, clause 10.4.1 of the Operations Manual, which "includes a toolkit required by management to manage fatigue and implement appropriate protocols and adhere to the workplace health and safety act", and stated: "I forwarded the toolkit to Chloe last week for review and action but have yet to receive feedback". [¶¶ 214 to 215]</w:t>
+          <w:sz w:val="20"/>
+          <w:szCs w:val="20"/>
+        </w:rPr>
+        <w:t>The Respondent does not allege that the toolkit was reviewed or that any feedback was provided before 18 June 2024. [¶ 216]</w:t>
       </w:r>
     </w:p>
     <w:p>
@@ -3669,7 +3643,7 @@
           <w:sz w:val="20"/>
           <w:szCs w:val="20"/>
         </w:rPr>
-        <w:t>The Respondent does not allege that the toolkit was reviewed or that any feedback was provided before 18 June 2024. [¶ 216]</w:t>
+        <w:t>On 8 May 2024 at 9:08 am the Director replied that she was following up with HR for further advice and would get back to him as soon as possible. [¶ 217]</w:t>
       </w:r>
     </w:p>
     <w:p>
@@ -3679,10 +3653,20 @@
       <w:r>
         <w:rPr>
           <w:rFonts w:ascii="Arial" w:hAnsi="Arial" w:cs="Arial"/>
-          <w:sz w:val="20"/>
-          <w:szCs w:val="20"/>
-        </w:rPr>
-        <w:t>On 8 May 2024 at 9:08 am the Director replied that she was following up with HR for further advice and would get back to him as soon as possible. [¶ 217]</w:t>
+          <w:b/>
+          <w:sz w:val="20"/>
+          <w:szCs w:val="20"/>
+        </w:rPr>
+        <w:t xml:space="preserve">3(g) Risk rating and roster decision recorded (10 May 2024). </w:t>
+      </w:r>
+      <w:r>
+        <w:rPr>
+          <w:rFonts w:ascii="Arial" w:hAnsi="Arial" w:cs="Arial"/>
+          <w:b w:val="0"/>
+          <w:sz w:val="20"/>
+          <w:szCs w:val="20"/>
+        </w:rPr>
+        <w:t>On 10 May 2024 at 2:08 pm the Director wrote to Human Resources forwarding his email, stating: "I think he is trying to raise that he has concerns over how his manager is rostering for the Switchboard team and how it is impacting on staff fatigue, or more specifically his fatigue." [¶ 218]</w:t>
       </w:r>
     </w:p>
     <w:p>
@@ -3692,20 +3676,10 @@
       <w:r>
         <w:rPr>
           <w:rFonts w:ascii="Arial" w:hAnsi="Arial" w:cs="Arial"/>
-          <w:b/>
-          <w:sz w:val="20"/>
-          <w:szCs w:val="20"/>
-        </w:rPr>
-        <w:t xml:space="preserve">3(g) Risk rating and roster decision recorded (10 May 2024). </w:t>
-      </w:r>
-      <w:r>
-        <w:rPr>
-          <w:rFonts w:ascii="Arial" w:hAnsi="Arial" w:cs="Arial"/>
-          <w:b w:val="0"/>
-          <w:sz w:val="20"/>
-          <w:szCs w:val="20"/>
-        </w:rPr>
-        <w:t>On 10 May 2024 at 2:08 pm the Director wrote to Human Resources forwarding his email, stating: "I think he is trying to raise that he has concerns over how his manager is rostering for the Switchboard team and how it is impacting on staff fatigue, or more specifically his fatigue." [¶ 218]</w:t>
+          <w:sz w:val="20"/>
+          <w:szCs w:val="20"/>
+        </w:rPr>
+        <w:t>She stated that she and the Manager had run through the Roster Risk Assessment Matrix and "we say at best there would be a rating of 11 which is moderate". [¶ 219]</w:t>
       </w:r>
     </w:p>
     <w:p>
@@ -3718,7 +3692,7 @@
           <w:sz w:val="20"/>
           <w:szCs w:val="20"/>
         </w:rPr>
-        <w:t>She stated that she and the Manager had run through the Roster Risk Assessment Matrix and "we say at best there would be a rating of 11 which is moderate". [¶ 219]</w:t>
+        <w:t>She stated: "I acknowledge there has been a few rostering errors made by Chloe with regards to Cory's line in past rosters". [¶ 220]</w:t>
       </w:r>
     </w:p>
     <w:p>
@@ -3731,7 +3705,7 @@
           <w:sz w:val="20"/>
           <w:szCs w:val="20"/>
         </w:rPr>
-        <w:t>She stated: "I acknowledge there has been a few rostering errors made by Chloe with regards to Cory's line in past rosters". [¶ 220]</w:t>
+        <w:t>She stated: "Cory's roster will not be considered, however Cory is not yet aware of this as we cannot advise what is the roster we are planning on going with before we send out the implementation plan for this business case for change". [¶ 221] Eleven days later, on 21 May 2024, she asked him which particular changes or directives had concerned him. [¶ 80]</w:t>
       </w:r>
     </w:p>
     <w:p>
@@ -3741,14 +3715,25 @@
       <w:r>
         <w:rPr>
           <w:rFonts w:ascii="Arial" w:hAnsi="Arial" w:cs="Arial"/>
-          <w:sz w:val="20"/>
-          <w:szCs w:val="20"/>
-        </w:rPr>
-        <w:t>She stated: "Cory's roster will not be considered, however Cory is not yet aware of this as we cannot advise what is the roster we are planning on going with before we send out the implementation plan for this business case for change". [¶ 221] Eleven days later, on 21 May 2024, she asked him which particular changes or directives had concerned him. [¶ 80]</w:t>
+          <w:b/>
+          <w:sz w:val="20"/>
+          <w:szCs w:val="20"/>
+        </w:rPr>
+        <w:t xml:space="preserve">3(h) HR follow-up with the fatigue guideline (20 May 2024). </w:t>
+      </w:r>
+      <w:r>
+        <w:rPr>
+          <w:rFonts w:ascii="Arial" w:hAnsi="Arial" w:cs="Arial"/>
+          <w:b w:val="0"/>
+          <w:sz w:val="20"/>
+          <w:szCs w:val="20"/>
+        </w:rPr>
+        <w:t>On 20 May 2024 the Director sent Human Resources the Queensland Health Fatigue Risk Management Systems Implementation Guideline, qh-gdl-401-3.3. [¶¶ 222 to 223] Ten days earlier she had written that she and the Manager had run through the Roster Risk Assessment Matrix and "we say at best there would be a rating of 11 which is moderate". [¶ 219] The Respondent disclosed the guideline, with that email chain, on 14 July 2025 (Tab 8A). The following passages are from that disclosed copy.</w:t>
       </w:r>
     </w:p>
     <w:p>
       <w:pPr>
+        <w:keepNext/>
         <w:spacing w:before="0" w:after="100" w:line="264" w:lineRule="auto"/>
       </w:pPr>
       <w:r>
@@ -3758,20 +3743,127 @@
           <w:sz w:val="20"/>
           <w:szCs w:val="20"/>
         </w:rPr>
-        <w:t xml:space="preserve">3(h) HR follow-up with the fatigue guideline (20 May 2024). </w:t>
-      </w:r>
-      <w:r>
-        <w:rPr>
-          <w:rFonts w:ascii="Arial" w:hAnsi="Arial" w:cs="Arial"/>
-          <w:b w:val="0"/>
-          <w:sz w:val="20"/>
-          <w:szCs w:val="20"/>
-        </w:rPr>
-        <w:t>On 20 May 2024 the Director sent Human Resources the Queensland Health Fatigue Risk Management Systems Implementation Guideline, qh-gdl-401-3.3. [¶¶ 222 to 223] Ten days earlier she had written that she and the Manager had run through the Roster Risk Assessment Matrix and "we say at best there would be a rating of 11 which is moderate". [¶ 219] The Respondent disclosed the guideline, with that email chain, on 14 July 2025 (Tab 8A). The following passages are from that disclosed copy.</w:t>
+        <w:t>Supporting records about the fatigue arrangements</w:t>
+      </w:r>
+      <w:r>
+        <w:rPr>
+          <w:rStyle w:val="CommentReference"/>
+        </w:rPr>
       </w:r>
     </w:p>
     <w:p>
       <w:pPr>
+        <w:spacing w:before="0" w:after="100" w:line="264" w:lineRule="auto"/>
+      </w:pPr>
+      <w:r>
+        <w:rPr>
+          <w:rFonts w:ascii="Arial" w:hAnsi="Arial" w:cs="Arial"/>
+          <w:b/>
+          <w:sz w:val="20"/>
+          <w:szCs w:val="20"/>
+        </w:rPr>
+        <w:t xml:space="preserve">Implementation and records of fatigue risk management. </w:t>
+      </w:r>
+      <w:r>
+        <w:rPr>
+          <w:rFonts w:ascii="Arial" w:hAnsi="Arial" w:cs="Arial"/>
+          <w:b w:val="0"/>
+          <w:sz w:val="20"/>
+          <w:szCs w:val="20"/>
+        </w:rPr>
+        <w:t>By letter of 5 June 2026, reference K-LM26/729, signed by the Chief Executive and addressed to the Commission, Metro South Health stated that the requested fatigue risk management documents "do not exist", that mandatory Fatigue Risk Management System training "only applies to health practitioners and clinical assistants" and that Switchboard staff are non-clinical. [¶¶ 263, 265] It stated that "The implementation of fatigue risk management assessment at Switchboard Logan Hospital occurred after 30 June 2024". [¶ 264] It stated that "there have been no 'consequential' changes to operating procedures over the period requested". [¶ 266] The Respondent does not allege that any fatigue risk assessment was conducted, that fatigue risk management training was provided, that fatigue risk management assessment was implemented at the Switchboard, or that any change was made to the operating procedures of the Switchboard as a consequence of any employee complaint, at any time before 30 June 2024. [¶¶ 269 to 272]</w:t>
+      </w:r>
+    </w:p>
+    <w:p>
+      <w:pPr>
+        <w:spacing w:before="0" w:after="100" w:line="264" w:lineRule="auto"/>
+      </w:pPr>
+      <w:r>
+        <w:rPr>
+          <w:rFonts w:ascii="Arial" w:hAnsi="Arial" w:cs="Arial"/>
+          <w:sz w:val="20"/>
+          <w:szCs w:val="20"/>
+        </w:rPr>
+        <w:t>The guideline defines fatigue as "A state of impaired physical and/or mental performance and lowered alertness arising as a result or combination of physical and mental work, health and psychosocial factors or inadequate restorative sleep", a fatigue risk management system as "An integrated set of management practices and procedures for monitoring and managing the risks posed to health, safety and wellbeing by fatigue", and "Defences in depth" as a "Hazard identification and risk control model that applies a series of layered mechanisms to minimise the occurrence of fatigue related incidents". [Guideline, glossary, p 29]</w:t>
+      </w:r>
+    </w:p>
+    <w:p>
+      <w:pPr>
+        <w:spacing w:before="0" w:after="100" w:line="264" w:lineRule="auto"/>
+      </w:pPr>
+      <w:r>
+        <w:rPr>
+          <w:rFonts w:ascii="Arial" w:hAnsi="Arial" w:cs="Arial"/>
+          <w:sz w:val="20"/>
+          <w:szCs w:val="20"/>
+        </w:rPr>
+        <w:t>It provides that "Level 4 controls relate to error tolerance and containment" and that "Error tolerance relates to built-in redundancies that decrease the likelihood that a fatigued individual will make an error which may have catastrophic consequences." [p 21] It lists among its related documents the Hospital and Health Services General Employees (Queensland Health) Award - State 2015 and the "I1 (QH-POL-171) Fatigue risk management policy". [p 27, section 9]</w:t>
+      </w:r>
+    </w:p>
+    <w:p>
+      <w:pPr>
+        <w:spacing w:before="0" w:after="100" w:line="264" w:lineRule="auto"/>
+      </w:pPr>
+      <w:r>
+        <w:rPr>
+          <w:rFonts w:ascii="Arial" w:hAnsi="Arial" w:cs="Arial"/>
+          <w:sz w:val="20"/>
+          <w:szCs w:val="20"/>
+        </w:rPr>
+        <w:t>On consultation and training, the guideline states: "there is a legislative obligation to consult with workers in relation to hazard identification and the making of decisions about how associated risks can be managed. Consultation requirements for Queensland Health are described in Health, safety and wellbeing consultation standard (QH-IMP-401-2:2020)." It states that information, training and instruction "must have regard for: the nature of the work carried out; the nature of the risks associated with the work; the control measures implemented", and that "where a work unit or an occupational stream has been identified at risk of fatigue, the training provided must consider the above criteria". Its example training matrix (Figure 11) lists, as those to be trained, "Staff at risk of fatigue", "Rostering staff" and "Manager, supervisors, executives", with learning outcomes including "Rostering". [p 26, section 7.1]</w:t>
+      </w:r>
+    </w:p>
+    <w:p>
+      <w:pPr>
+        <w:spacing w:before="0" w:after="100" w:line="264" w:lineRule="auto"/>
+      </w:pPr>
+      <w:r>
+        <w:rPr>
+          <w:rFonts w:ascii="Arial" w:hAnsi="Arial" w:cs="Arial"/>
+          <w:sz w:val="20"/>
+          <w:szCs w:val="20"/>
+        </w:rPr>
+        <w:t>Its supporting documents include the "Fatigue risk assessment tool", the "Individual fatigue likelihood calculator" and the "Samn-Perelli fatigue checklist". [pp 27 to 28, section 9] It defines a "Worker" by reference to section 7 of the WHS Act, including "An employee", and states that "The Department of Health and each of the HHSs are considered to be PCBUs". [pp 29 to 30, section 10] Its version control records that version 1.0 of 10 November 2021 replaced the "Fatigue Risk Management System Resource Pack December 2018 v. 3". [p 30, section 11] Its references include "Queensland Ombudsman (2006). The Neville Report". [p 31, section 12]</w:t>
+      </w:r>
+    </w:p>
+    <w:p>
+      <w:pPr>
+        <w:spacing w:before="0" w:after="100" w:line="264" w:lineRule="auto"/>
+      </w:pPr>
+      <w:r>
+        <w:rPr>
+          <w:rFonts w:ascii="Arial" w:hAnsi="Arial" w:cs="Arial"/>
+          <w:sz w:val="20"/>
+          <w:szCs w:val="20"/>
+        </w:rPr>
+        <w:t xml:space="preserve">So the guideline treated the Award under which the Appellant was employed as a supporting document. It treated every employee of a Hospital and Health Service as a worker to whom it applied. It called for consultation with workers on fatigue hazards, and for training of rostering staff and managers. A resource pack had preceded it since December 2018. It is the guideline the Director sent to Human Resources on 20 May 2024 [¶¶ 222 to 223], ten days after she and the Manager had assessed the fatigue risk of the Appellant's roster as moderate [¶ 219]; the Chief Executive's letter states that fatigue risk management assessment at the Switchboard was implemented only "after 30 June 2024" and that the mandatory training "only applies to health practitioners and clinical assistants". [¶¶ 264 to 265] The Respondent does not allege that any fatigue risk management training was provided to the Appellant, or that any fatigue risk assessment of his position was conducted, before 30 June 2024. [¶¶ 269 to 270]</w:t>
+      </w:r>
+    </w:p>
+    <w:p>
+      <w:pPr>
+        <w:spacing w:before="0" w:after="100" w:line="264" w:lineRule="auto"/>
+      </w:pPr>
+      <w:r>
+        <w:rPr>
+          <w:rFonts w:ascii="Arial" w:hAnsi="Arial" w:cs="Arial"/>
+          <w:b/>
+          <w:sz w:val="20"/>
+          <w:szCs w:val="20"/>
+        </w:rPr>
+        <w:t xml:space="preserve">Where the framework came from. </w:t>
+      </w:r>
+      <w:r>
+        <w:rPr>
+          <w:rFonts w:ascii="Arial" w:hAnsi="Arial" w:cs="Arial"/>
+          <w:b w:val="0"/>
+          <w:sz w:val="20"/>
+          <w:szCs w:val="20"/>
+        </w:rPr>
+        <w:t>The guideline's references list "Queensland Ombudsman (2006). The Neville Report". [p 31, section 12] Queensland Health's Policy on Medical Fatigue Risk Management, which took effect on 1 July 2008, followed that report (Queensland Ombudsman, The Neville Report Update, 2011), and the resource pack of December 2018 and the 2021 guideline that replaced it apply the system to every "worker" of a Hospital and Health Service, including "An employee" [pp 29 to 30, section 10; p 30, section 11]; the Switchboard is where the codes are received and paged. [¶ 8]</w:t>
+      </w:r>
+    </w:p>
+    <w:p>
+      <w:pPr>
         <w:keepNext/>
         <w:spacing w:before="0" w:after="100" w:line="264" w:lineRule="auto"/>
       </w:pPr>
@@ -3782,12 +3874,7 @@
           <w:sz w:val="20"/>
           <w:szCs w:val="20"/>
         </w:rPr>
-        <w:t>Supporting records about the fatigue arrangements</w:t>
-      </w:r>
-      <w:r>
-        <w:rPr>
-          <w:rStyle w:val="CommentReference"/>
-        </w:rPr>
+        <w:t>Findings recorded in the decision under appeal</w:t>
       </w:r>
     </w:p>
     <w:p>
@@ -3801,7 +3888,7 @@
           <w:sz w:val="20"/>
           <w:szCs w:val="20"/>
         </w:rPr>
-        <w:t xml:space="preserve">Implementation and records of fatigue risk management. </w:t>
+        <w:t xml:space="preserve">The findings in the decision under appeal. </w:t>
       </w:r>
       <w:r>
         <w:rPr>
@@ -3810,7 +3897,7 @@
           <w:sz w:val="20"/>
           <w:szCs w:val="20"/>
         </w:rPr>
-        <w:t>By letter of 5 June 2026, reference K-LM26/729, signed by the Chief Executive and addressed to the Commission, Metro South Health stated that the requested fatigue risk management documents "do not exist", that mandatory Fatigue Risk Management System training "only applies to health practitioners and clinical assistants" and that Switchboard staff are non-clinical. [¶¶ 263, 265] It stated that "The implementation of fatigue risk management assessment at Switchboard Logan Hospital occurred after 30 June 2024". [¶ 264] It stated that "there have been no 'consequential' changes to operating procedures over the period requested". [¶ 266] The Respondent does not allege that any fatigue risk assessment was conducted, that fatigue risk management training was provided, that fatigue risk management assessment was implemented at the Switchboard, or that any change was made to the operating procedures of the Switchboard as a consequence of any employee complaint, at any time before 30 June 2024. [¶¶ 269 to 272]</w:t>
+        <w:t>The review decision states: "The break between the shift on 17 March 2024 and 18 March 2024 equated to 7 hours." [¶ 258]</w:t>
       </w:r>
     </w:p>
     <w:p>
@@ -3823,7 +3910,7 @@
           <w:sz w:val="20"/>
           <w:szCs w:val="20"/>
         </w:rPr>
-        <w:t>The guideline defines fatigue as "A state of impaired physical and/or mental performance and lowered alertness arising as a result or combination of physical and mental work, health and psychosocial factors or inadequate restorative sleep", a fatigue risk management system as "An integrated set of management practices and procedures for monitoring and managing the risks posed to health, safety and wellbeing by fatigue", and "Defences in depth" as a "Hazard identification and risk control model that applies a series of layered mechanisms to minimise the occurrence of fatigue related incidents". [Guideline, glossary, p 29]</w:t>
+        <w:t>It states that even if the Appellant was allowed to leave early on 17 March 2024 as suggested by the employer, he left a maximum of thirty minutes early, which meant he still did not receive a minimum 8-hour break. [¶ 259]</w:t>
       </w:r>
     </w:p>
     <w:p>
@@ -3836,7 +3923,7 @@
           <w:sz w:val="20"/>
           <w:szCs w:val="20"/>
         </w:rPr>
-        <w:t>It provides that "Level 4 controls relate to error tolerance and containment" and that "Error tolerance relates to built-in redundancies that decrease the likelihood that a fatigued individual will make an error which may have catastrophic consequences." [p 21] It lists among its related documents the Hospital and Health Services General Employees (Queensland Health) Award - State 2015 and the "I1 (QH-POL-171) Fatigue risk management policy". [p 27, section 9]</w:t>
+        <w:t>It states: "Based on this, I find the rostering of these two shifts amounted to unreasonable management action given that it was in direct contradiction to the award and the 8-hour agreement." [¶ 260]</w:t>
       </w:r>
     </w:p>
     <w:p>
@@ -3849,7 +3936,7 @@
           <w:sz w:val="20"/>
           <w:szCs w:val="20"/>
         </w:rPr>
-        <w:t>On consultation and training, the guideline states: "there is a legislative obligation to consult with workers in relation to hazard identification and the making of decisions about how associated risks can be managed. Consultation requirements for Queensland Health are described in Health, safety and wellbeing consultation standard (QH-IMP-401-2:2020)." It states that information, training and instruction "must have regard for: the nature of the work carried out; the nature of the risks associated with the work; the control measures implemented", and that "where a work unit or an occupational stream has been identified at risk of fatigue, the training provided must consider the above criteria". Its example training matrix (Figure 11) lists, as those to be trained, "Staff at risk of fatigue", "Rostering staff" and "Manager, supervisors, executives", with learning outcomes including "Rostering". [p 26, section 7.1]</w:t>
+        <w:t>It states, under the heading "Conclusion", that the Appellant "sustained a personal injury of a psychological nature". [¶ 261]</w:t>
       </w:r>
     </w:p>
     <w:p>
@@ -3862,20 +3949,22 @@
           <w:sz w:val="20"/>
           <w:szCs w:val="20"/>
         </w:rPr>
-        <w:t>Its supporting documents include the "Fatigue risk assessment tool", the "Individual fatigue likelihood calculator" and the "Samn-Perelli fatigue checklist". [pp 27 to 28, section 9] It defines a "Worker" by reference to section 7 of the WHS Act, including "An employee", and states that "The Department of Health and each of the HHSs are considered to be PCBUs". [pp 29 to 30, section 10] Its version control records that version 1.0 of 10 November 2021 replaced the "Fatigue Risk Management System Resource Pack December 2018 v. 3". [p 30, section 11] Its references include "Queensland Ombudsman (2006). The Neville Report". [p 31, section 12]</w:t>
+        <w:t>It states that his injury "arose out of employment, to the extent that it arose out of factors 2, 3 and 4, where employment was a significant contributing factor". [¶ 262]</w:t>
       </w:r>
     </w:p>
     <w:p>
       <w:pPr>
+        <w:keepNext/>
         <w:spacing w:before="0" w:after="100" w:line="264" w:lineRule="auto"/>
       </w:pPr>
       <w:r>
         <w:rPr>
           <w:rFonts w:ascii="Arial" w:hAnsi="Arial" w:cs="Arial"/>
-          <w:sz w:val="20"/>
-          <w:szCs w:val="20"/>
-        </w:rPr>
-        <w:t>So the guideline treated the Award under which the Appellant was employed as a supporting document. It treated every employee of a Hospital and Health Service as a worker to whom it applied. It called for consultation with workers on fatigue hazards, and for training of rostering staff and managers. A resource pack had preceded it since December 2018. The Chief Executive's letter states that fatigue risk management assessment at the Switchboard was implemented after 30 June 2024 and that the mandatory training "only applies to health practitioners and clinical assistants". [¶¶ 264 to 265] The Respondent does not allege that any fatigue risk management training was provided to the Appellant, or that any fatigue risk assessment of his position was conducted, before 30 June 2024. [¶¶ 269 to 270]</w:t>
+          <w:b/>
+          <w:sz w:val="20"/>
+          <w:szCs w:val="20"/>
+        </w:rPr>
+        <w:t>The Respondent's pleaded answer and subsequent roster proposal</w:t>
       </w:r>
     </w:p>
     <w:p>
@@ -3888,7 +3977,7 @@
           <w:sz w:val="20"/>
           <w:szCs w:val="20"/>
         </w:rPr>
-        <w:t>The guideline the Director sent to Human Resources on 20 May 2024 is the guideline the Chief Executive's letter of 5 June 2026 says was implemented at the Switchboard only "after 30 June 2024" [¶ 264], and the training for which "only applies to health practitioners and clinical assistants" [¶ 265]. The fatigue risk of the Appellant's roster had been assessed by the Director and the Manager as moderate on 10 May 2024 [¶ 219]; no fatigue risk assessment of his position is alleged to have been conducted before 30 June 2024 [¶ 269].</w:t>
+        <w:t>The Respondent pleads that the shift was separated by only a 7-hour break, that this was a result of human error and not intentional or repeated, that in June 2020 the Appellant signed an agreement allowing an 8-hour break, and that "the appellant could refuse shifts at anytime". [¶¶ 226, 232 to 233] The Respondent's outlines of evidence served 24 September 2026 give notice that its witnesses will say the break "was the result of human error", and that the advice returned within payroll was that "what had occurred was better characterised as a rostering practice issue for the line manager rather than an unpaid entitlement".</w:t>
       </w:r>
     </w:p>
     <w:p>
@@ -3902,7 +3991,7 @@
           <w:sz w:val="20"/>
           <w:szCs w:val="20"/>
         </w:rPr>
-        <w:t xml:space="preserve">Where the framework came from. </w:t>
+        <w:t xml:space="preserve">The Respondent's pleaded position on the roster. </w:t>
       </w:r>
       <w:r>
         <w:rPr>
@@ -3911,22 +4000,20 @@
           <w:sz w:val="20"/>
           <w:szCs w:val="20"/>
         </w:rPr>
-        <w:t>The guideline's references list "Queensland Ombudsman (2006). The Neville Report". [p 31, section 12] Queensland Health's Policy on Medical Fatigue Risk Management, which took effect on 1 July 2008, followed that report (Queensland Ombudsman, The Neville Report Update, 2011), and the resource pack of December 2018 and the 2021 guideline that replaced it apply the system to every "worker" of a Hospital and Health Service, including "An employee" [pp 29 to 30, section 10; p 30, section 11]; the Switchboard is where the codes are received and paged. [¶ 8]</w:t>
+        <w:t>On 18 February 2026 the Respondent denied paragraphs of the Appellant's earlier notice on the stated grounds "because the comparator used does not represent a true comparator in the circumstances and because the roster was equitable". [¶ 299]</w:t>
       </w:r>
     </w:p>
     <w:p>
       <w:pPr>
-        <w:keepNext/>
         <w:spacing w:before="0" w:after="100" w:line="264" w:lineRule="auto"/>
       </w:pPr>
       <w:r>
         <w:rPr>
           <w:rFonts w:ascii="Arial" w:hAnsi="Arial" w:cs="Arial"/>
-          <w:b/>
-          <w:sz w:val="20"/>
-          <w:szCs w:val="20"/>
-        </w:rPr>
-        <w:t>Findings recorded in the decision under appeal</w:t>
+          <w:sz w:val="20"/>
+          <w:szCs w:val="20"/>
+        </w:rPr>
+        <w:t>The Consultation Paper of November 2024 states that the proposed roster "is intended to introduce a more equitable roster for Switchboard Services, Logan Hospital staff". [¶ 171]</w:t>
       </w:r>
     </w:p>
     <w:p>
@@ -3936,20 +4023,10 @@
       <w:r>
         <w:rPr>
           <w:rFonts w:ascii="Arial" w:hAnsi="Arial" w:cs="Arial"/>
-          <w:b/>
-          <w:sz w:val="20"/>
-          <w:szCs w:val="20"/>
-        </w:rPr>
-        <w:t xml:space="preserve">The findings in the decision under appeal. </w:t>
-      </w:r>
-      <w:r>
-        <w:rPr>
-          <w:rFonts w:ascii="Arial" w:hAnsi="Arial" w:cs="Arial"/>
-          <w:b w:val="0"/>
-          <w:sz w:val="20"/>
-          <w:szCs w:val="20"/>
-        </w:rPr>
-        <w:t>The review decision states: "The break between the shift on 17 March 2024 and 18 March 2024 equated to 7 hours." [¶ 258]</w:t>
+          <w:sz w:val="20"/>
+          <w:szCs w:val="20"/>
+        </w:rPr>
+        <w:t>It states that the proposed roster includes "Redistribution of nights for greater equity based on FTE" and a "Rotational roster for predictability and equity to all staff ensuring fair distribution of penalties". [¶¶ 172 to 173]</w:t>
       </w:r>
     </w:p>
     <w:p>
@@ -3962,7 +4039,7 @@
           <w:sz w:val="20"/>
           <w:szCs w:val="20"/>
         </w:rPr>
-        <w:t>It states that even if the Appellant was allowed to leave early on 17 March 2024 as suggested by the employer, he left a maximum of thirty minutes early, which meant he still did not receive a minimum 8-hour break. [¶ 259]</w:t>
+        <w:t>It states that it includes an additional eight-hour Saturday shift to assist with call volume and the extension of a five-hour weekday shift to eight hours. [¶¶ 174 to 175]</w:t>
       </w:r>
     </w:p>
     <w:p>
@@ -3972,42 +4049,25 @@
       <w:r>
         <w:rPr>
           <w:rFonts w:ascii="Arial" w:hAnsi="Arial" w:cs="Arial"/>
-          <w:sz w:val="20"/>
-          <w:szCs w:val="20"/>
-        </w:rPr>
-        <w:t>It states: "Based on this, I find the rostering of these two shifts amounted to unreasonable management action given that it was in direct contradiction to the award and the 8-hour agreement." [¶ 260]</w:t>
+          <w:b/>
+          <w:sz w:val="20"/>
+          <w:szCs w:val="20"/>
+        </w:rPr>
+        <w:t xml:space="preserve">The Respondent's pleaded answer to this stressor. </w:t>
+      </w:r>
+      <w:r>
+        <w:rPr>
+          <w:rFonts w:ascii="Arial" w:hAnsi="Arial" w:cs="Arial"/>
+          <w:b w:val="0"/>
+          <w:sz w:val="20"/>
+          <w:szCs w:val="20"/>
+        </w:rPr>
+        <w:t xml:space="preserve">Beyond the agreement and the sick-leave matters at 3(c), the Respondent's pleaded answer, including paragraph 27 of its statement, is at Part C, paragraph 10 [¶¶ 238, 300 to 303]; its account of how complaints were handled is pleaded at Stressor 1, supporting records [¶¶ 267, 272].</w:t>
       </w:r>
     </w:p>
     <w:p>
       <w:pPr>
-        <w:spacing w:before="0" w:after="100" w:line="264" w:lineRule="auto"/>
-      </w:pPr>
-      <w:r>
-        <w:rPr>
-          <w:rFonts w:ascii="Arial" w:hAnsi="Arial" w:cs="Arial"/>
-          <w:sz w:val="20"/>
-          <w:szCs w:val="20"/>
-        </w:rPr>
-        <w:t>It states, under the heading "Conclusion", that the Appellant "sustained a personal injury of a psychological nature". [¶ 261]</w:t>
-      </w:r>
-    </w:p>
-    <w:p>
-      <w:pPr>
-        <w:spacing w:before="0" w:after="100" w:line="264" w:lineRule="auto"/>
-      </w:pPr>
-      <w:r>
-        <w:rPr>
-          <w:rFonts w:ascii="Arial" w:hAnsi="Arial" w:cs="Arial"/>
-          <w:sz w:val="20"/>
-          <w:szCs w:val="20"/>
-        </w:rPr>
-        <w:t>It states that his injury "arose out of employment, to the extent that it arose out of factors 2, 3 and 4, where employment was a significant contributing factor". [¶ 262]</w:t>
-      </w:r>
-    </w:p>
-    <w:p>
-      <w:pPr>
-        <w:keepNext/>
-        <w:spacing w:before="0" w:after="100" w:line="264" w:lineRule="auto"/>
+        <w:spacing w:before="80" w:after="140" w:line="264" w:lineRule="auto"/>
       </w:pPr>
       <w:r>
         <w:rPr>
@@ -4016,118 +4076,6 @@
           <w:sz w:val="20"/>
           <w:szCs w:val="20"/>
         </w:rPr>
-        <w:t>The Respondent's pleaded answer and subsequent roster proposal</w:t>
-      </w:r>
-    </w:p>
-    <w:p>
-      <w:pPr>
-        <w:spacing w:before="0" w:after="100" w:line="264" w:lineRule="auto"/>
-      </w:pPr>
-      <w:r>
-        <w:rPr>
-          <w:rFonts w:ascii="Arial" w:hAnsi="Arial" w:cs="Arial"/>
-          <w:sz w:val="20"/>
-          <w:szCs w:val="20"/>
-        </w:rPr>
-        <w:t>The Respondent pleads that the shift was separated by only a 7-hour break, that this was a result of human error and not intentional or repeated, that in June 2020 the Appellant signed an agreement allowing an 8-hour break, and that "the appellant could refuse shifts at anytime". [¶¶ 226, 232 to 233] The Respondent's outlines of evidence served 24 September 2026 give notice that its witnesses will say the break "was the result of human error", and that the advice returned within payroll was that "what had occurred was better characterised as a rostering practice issue for the line manager rather than an unpaid entitlement".</w:t>
-      </w:r>
-    </w:p>
-    <w:p>
-      <w:pPr>
-        <w:spacing w:before="0" w:after="100" w:line="264" w:lineRule="auto"/>
-      </w:pPr>
-      <w:r>
-        <w:rPr>
-          <w:rFonts w:ascii="Arial" w:hAnsi="Arial" w:cs="Arial"/>
-          <w:b/>
-          <w:sz w:val="20"/>
-          <w:szCs w:val="20"/>
-        </w:rPr>
-        <w:t xml:space="preserve">The Respondent's pleaded position on the roster. </w:t>
-      </w:r>
-      <w:r>
-        <w:rPr>
-          <w:rFonts w:ascii="Arial" w:hAnsi="Arial" w:cs="Arial"/>
-          <w:b w:val="0"/>
-          <w:sz w:val="20"/>
-          <w:szCs w:val="20"/>
-        </w:rPr>
-        <w:t>On 18 February 2026 the Respondent denied paragraphs of the Appellant's earlier notice on the stated grounds "because the comparator used does not represent a true comparator in the circumstances and because the roster was equitable". [¶ 299]</w:t>
-      </w:r>
-    </w:p>
-    <w:p>
-      <w:pPr>
-        <w:spacing w:before="0" w:after="100" w:line="264" w:lineRule="auto"/>
-      </w:pPr>
-      <w:r>
-        <w:rPr>
-          <w:rFonts w:ascii="Arial" w:hAnsi="Arial" w:cs="Arial"/>
-          <w:sz w:val="20"/>
-          <w:szCs w:val="20"/>
-        </w:rPr>
-        <w:t>The Consultation Paper of November 2024 states that the proposed roster "is intended to introduce a more equitable roster for Switchboard Services, Logan Hospital staff". [¶ 171]</w:t>
-      </w:r>
-    </w:p>
-    <w:p>
-      <w:pPr>
-        <w:spacing w:before="0" w:after="100" w:line="264" w:lineRule="auto"/>
-      </w:pPr>
-      <w:r>
-        <w:rPr>
-          <w:rFonts w:ascii="Arial" w:hAnsi="Arial" w:cs="Arial"/>
-          <w:sz w:val="20"/>
-          <w:szCs w:val="20"/>
-        </w:rPr>
-        <w:t>It states that the proposed roster includes "Redistribution of nights for greater equity based on FTE" and a "Rotational roster for predictability and equity to all staff ensuring fair distribution of penalties". [¶¶ 172 to 173]</w:t>
-      </w:r>
-    </w:p>
-    <w:p>
-      <w:pPr>
-        <w:spacing w:before="0" w:after="100" w:line="264" w:lineRule="auto"/>
-      </w:pPr>
-      <w:r>
-        <w:rPr>
-          <w:rFonts w:ascii="Arial" w:hAnsi="Arial" w:cs="Arial"/>
-          <w:sz w:val="20"/>
-          <w:szCs w:val="20"/>
-        </w:rPr>
-        <w:t>It states that it includes an additional eight-hour Saturday shift to assist with call volume and the extension of a five-hour weekday shift to eight hours. [¶¶ 174 to 175]</w:t>
-      </w:r>
-    </w:p>
-    <w:p>
-      <w:pPr>
-        <w:spacing w:before="0" w:after="100" w:line="264" w:lineRule="auto"/>
-      </w:pPr>
-      <w:r>
-        <w:rPr>
-          <w:rFonts w:ascii="Arial" w:hAnsi="Arial" w:cs="Arial"/>
-          <w:b/>
-          <w:sz w:val="20"/>
-          <w:szCs w:val="20"/>
-        </w:rPr>
-        <w:t xml:space="preserve">The Respondent's pleaded answer to this stressor. </w:t>
-      </w:r>
-      <w:r>
-        <w:rPr>
-          <w:rFonts w:ascii="Arial" w:hAnsi="Arial" w:cs="Arial"/>
-          <w:b w:val="0"/>
-          <w:sz w:val="20"/>
-          <w:szCs w:val="20"/>
-        </w:rPr>
-        <w:t>Beyond the agreement and the sick-leave matters at 3(c), the Respondent does not allege that the Appellant was subject to any disciplinary process, or that his work performance was the subject of any formal performance management process, before 18 June 2024, nor does it describe any communication with him before that date as a warning. [¶¶ 300 to 302] Paragraph 27 of its amended statement of facts and contentions does not identify, by particular, date, document or cross-reference, the management action relied upon. [¶¶ 238, 303] The employer's own account of its complaint handling is that complaints "are made directly to the Line Manager of Switch Board and managed solely via email or verbally with the complainant", and no change to operating procedures as a consequence of any employee complaint is alleged. [¶¶ 267, 272]</w:t>
-      </w:r>
-    </w:p>
-    <w:p>
-      <w:pPr>
-        <w:spacing w:before="80" w:after="140" w:line="264" w:lineRule="auto"/>
-      </w:pPr>
-      <w:r>
-        <w:rPr>
-          <w:rFonts w:ascii="Arial" w:hAnsi="Arial" w:cs="Arial"/>
-          <w:b/>
-          <w:sz w:val="20"/>
-          <w:szCs w:val="20"/>
-        </w:rPr>
         <w:t xml:space="preserve">The medical link - Stressor 3. </w:t>
       </w:r>
       <w:r>
@@ -4137,28 +4085,6 @@
           <w:szCs w:val="20"/>
         </w:rPr>
         <w:t>Tab M1 records the 1 July 2024 report that the roster was being manipulated so the Appellant worked "lates then earlies". Tab M4 later records workplace stress involving management and rostering. Tab M8 is the review decision recording the seven-hour break and the finding that the rostering of the 17 and 18 March shifts was unreasonable management action. Tab M7 is relied on only for continuing effect and capacity in 2026. The medical material is not relied on to prove the roster events. Those events are proved by the admitted facts above about the roster, the policy, the correspondence and the review decision.</w:t>
-      </w:r>
-    </w:p>
-    <w:p>
-      <w:pPr>
-        <w:spacing w:before="80" w:after="140" w:line="264" w:lineRule="auto"/>
-      </w:pPr>
-      <w:r>
-        <w:rPr>
-          <w:rFonts w:ascii="Arial" w:hAnsi="Arial" w:cs="Arial"/>
-          <w:b/>
-          <w:sz w:val="20"/>
-          <w:szCs w:val="20"/>
-        </w:rPr>
-        <w:t xml:space="preserve">The medical case as a whole. </w:t>
-      </w:r>
-      <w:r>
-        <w:rPr>
-          <w:rFonts w:ascii="Arial" w:hAnsi="Arial" w:cs="Arial"/>
-          <w:sz w:val="20"/>
-          <w:szCs w:val="20"/>
-        </w:rPr>
-        <w:t>The medical material does not give a separate diagnosis for each pleaded event. The Appellant relies on one psychological injury arising from the whole course of conduct. Repeating an admitted fact under more than one stressor therefore serves a purpose and is not double counting. It allows each stressor to be decided on its own, while keeping the whole course of conduct that was described to the treating doctors.</w:t>
       </w:r>
     </w:p>
     <w:p>
@@ -4527,7 +4453,7 @@
                 <w:sz w:val="17"/>
                 <w:szCs w:val="17"/>
               </w:rPr>
-              <w:t xml:space="preserve">MASPER Registrar's first report, 3 May 2024 at 3:06 pm, to the first reply, 9 May 2024 at 9:20 am (her second report was sent on the fifth calendar day; the reply on the sixth)</w:t>
+              <w:t xml:space="preserve">MASPER Registrar's first report, 3 May 2024 at 3:06 pm, to the Manager's first reply, 9 May 2024 at 9:20 am (her second report was sent on the fifth calendar day; the reply on the sixth)</w:t>
             </w:r>
           </w:p>
         </w:tc>
@@ -4907,7 +4833,7 @@
                 <w:sz w:val="17"/>
                 <w:szCs w:val="17"/>
               </w:rPr>
-              <w:t xml:space="preserve">The escalation to the reply at 4:30 pm, two hours after the office hours stated to all Switchboard staff on 17 May 2024 had ended</w:t>
+              <w:t xml:space="preserve">The escalation to the Manager's reply at 4:30 pm, two hours after the office hours she had stated to all Switchboard staff on 17 May 2024 had ended</w:t>
             </w:r>
           </w:p>
         </w:tc>
@@ -7428,7 +7354,7 @@
           <w:sz w:val="20"/>
           <w:szCs w:val="20"/>
         </w:rPr>
-        <w:t>The Respondent's notified evidence is consistent with the admitted record. On 24 September 2026 the Respondent served outlines of the evidence of Ms Taylor, Ms Reese, Ms Wright and Ms Earl. An outline is not evidence; the outlines are relied on only as the Respondent's own description of the matters they concern, and the Appellant will ask each witness to confirm them. On the Respondent's own outlines: the seven-hour break was "the result of human error" and, on the advice returned within payroll, "a rostering practice issue for the line manager"; the agreement of 17 June 2020 reduced the break "from ten hours to eight", so that a seven-hour break fell below both; no fatigue-leave entitlement under clause 18.10 attached to a short break between two ordinary shifts; the second decline of the paid Special Pandemic Leave request "appears to have been made in error"; and pay corrections were the line manager's to submit. The Appellant contends that the rostering of 17 to 18 March 2024 was, on the Respondent's own description, an act of the line manager in rostering; that it is management action; and that it was not reasonable management action taken in a reasonable way, for the reasons in Stressor 3. No outline addresses the removal of database access or its restoration; the Contact &amp; Number Changes book; any consultation preceding the change notified on 15 April 2024; the reports of the MASPER Registrar of 3 and 8 May 2024; the emails of the Integrated Respiratory Service of 15 and 20 May 2024; the amendment of the clinic contact-details document; the fatigue enquiry of 8 April 2024 or the interval to 1 May 2024; the email to Human Resources of 10 May 2024; or the absence of fatigue risk management at the Switchboard before 30 June 2024. Those matters are relied on to the extent established by the admissions; silence in an outline is not a further admission. The Respondent's list of witnesses, sent to the Registry for filing and to the Appellant on 24 September 2026, names those four witnesses, described as "lay" witnesses, and no other, and states that the Respondent "reserves its right to amend this list depending on the case presented by the appellant at the hearing". Neither the list nor the outlines names a medical or expert witness, and no expert report has been served as at 30 September 2026.</w:t>
+        <w:t xml:space="preserve">The Respondent's notified evidence is consistent with the admitted record. On 24 September 2026 the Respondent served outlines of the evidence of Ms Taylor, Ms Reese, Ms Wright and Ms Earl. An outline is not evidence; the outlines are relied on only as the Respondent's own description of the matters they concern, and the Appellant will ask each witness to confirm them. On the Respondent's own outlines: the seven-hour break was "the result of human error" and, on the advice returned within payroll, "a rostering practice issue for the line manager"; the agreement of 17 June 2020 reduced the break "from ten hours to eight", so that a seven-hour break fell below both; no fatigue-leave entitlement under clause 18.10 attached to a short break between two ordinary shifts; the second decline of the paid Special Pandemic Leave request "appears to have been made in error"; and pay corrections were the line manager's to submit. The Appellant contends that the rostering of 17 to 18 March 2024 was, on the Respondent's own description, an act of the line manager in rostering; that it is management action; and that it was not reasonable management action taken in a reasonable way, for the reasons in Stressor 3. No outline addresses the removal of database access or its restoration; the Contact &amp; Number Changes book; any consultation preceding the change notified on 15 April 2024; the reports of the MASPER Registrar of 3 and 8 May 2024; the emails of the Integrated Respiratory Service of 15 and 20 May 2024; the amendment of the clinic contact-details document; the fatigue enquiry of 8 April 2024 or the interval to 1 May 2024; the email to Human Resources of 10 May 2024; or the absence of fatigue risk management at the Switchboard before 30 June 2024. By particular, the outlines give no account of the dated events at Stressor 1(b), 1(f), 1(h) and 1(k), or at Stressor 3(e) to 3(h). On those particulars the facts are admitted, and the questions are whether each was management action, whether any management action was reasonable and taken in a reasonable way, and whether it contributed to the injury. Those matters are relied on to the extent established by the admissions; silence in an outline is not a further admission. The Respondent's list of witnesses, sent to the Registry for filing and to the Appellant on 24 September 2026, names those four witnesses, described as "lay" witnesses, and no other, and states that the Respondent "reserves its right to amend this list depending on the case presented by the appellant at the hearing". Neither the list nor the outlines names a medical or expert witness, and no expert report has been served as at 30 September 2026.</w:t>
       </w:r>
     </w:p>
     <w:p>
@@ -7582,29 +7508,6 @@
           <w:szCs w:val="18"/>
         </w:rPr>
         <w:t>Particulars: paragraphs 238, 295, 300 to 303 of the notice to admit facts served 28 August 2026, admitted 8 September 2026.</w:t>
-      </w:r>
-    </w:p>
-    <w:p>
-      <w:pPr>
-        <w:spacing w:before="0" w:after="100" w:line="264" w:lineRule="auto"/>
-      </w:pPr>
-      <w:r>
-        <w:rPr>
-          <w:rFonts w:ascii="Arial" w:hAnsi="Arial" w:cs="Arial"/>
-          <w:b/>
-          <w:sz w:val="20"/>
-          <w:szCs w:val="20"/>
-        </w:rPr>
-        <w:t xml:space="preserve">11. </w:t>
-      </w:r>
-      <w:r>
-        <w:rPr>
-          <w:rFonts w:ascii="Arial" w:hAnsi="Arial" w:cs="Arial"/>
-          <w:b w:val="0"/>
-          <w:sz w:val="20"/>
-          <w:szCs w:val="20"/>
-        </w:rPr>
-        <w:t>The particulars on which the Respondent's notified evidence gives no account. Read with paragraph 5A, the Respondent's outlines of 24 September 2026 give no account of the dated events at Stressor 1(b), 1(f), 1(h) and 1(k), or at Stressor 3(e) to 3(h). As to Stressor 3(b), they describe the seven-hour break as "the result of human error" and, on the advice returned within payroll, "a rostering practice issue for the line manager". As to Stressor 2(b), they describe the second decline as one that "appears to have been made in error". On those particulars the facts are admitted, and the questions are whether each was management action, whether any management action was reasonable and taken in a reasonable way, and whether it contributed to the injury.</w:t>
       </w:r>
     </w:p>
     <w:p>

</xml_diff>

<commit_message>
WC/2024/227: 1(h) - Appellant's contemporaneous receipt of the misdirected-call complaints pleaded as his evidence (change 69)
Co-Authored-By: Claude Opus 5.5 <noreply@anthropic.com>
Claude-Session: https://claude.ai/code/session_01PbSZiMB1koFR46V5hQyVcy
</commit_message>
<xml_diff>
--- a/wc2024227/drafts/out/FILING_1OCT2026/2026-10_SECOND_AMENDED_9A_FINAL.docx
+++ b/wc2024227/drafts/out/FILING_1OCT2026/2026-10_SECOND_AMENDED_9A_FINAL.docx
@@ -1149,7 +1149,7 @@
                 <w:color w:val="000000"/>
                 <w:sz w:val="18"/>
               </w:rPr>
-              <w:t xml:space="preserve">Nine occasions of calls reaching the wrong team, including a MET-call enquiry; the Manager's first reply after 5 days, 18 hours and 14 minutes; a new process sent to staff on 9 May.</w:t>
+              <w:t xml:space="preserve">Nine occasions of calls reaching the wrong team, including a MET-call enquiry, with the complaints and feedback reaching the Appellant from the registrars; the Manager's first reply after 5 days, 18 hours and 14 minutes; a new process sent to staff on 9 May.</w:t>
             </w:r>
           </w:p>
         </w:tc>
@@ -4142,7 +4142,7 @@
           <w:sz w:val="20"/>
           <w:szCs w:val="20"/>
         </w:rPr>
-        <w:t>The Respondent does not allege that any communication was sent to Logan Switch or to the Switchboard staff concerning those occasions at any time after 3 May 2024 and before 10:15 am on 9 May 2024. [¶ 69]</w:t>
+        <w:t xml:space="preserve">The Respondent does not allege that any communication was sent to Logan Switch or to the Switchboard staff concerning those occasions at any time after 3 May 2024 and before 10:15 am on 9 May 2024. [¶ 69] The Appellant's evidence is that he received the complaints about the misdirected calls at the time, and saw the Registrar's emails about them, and that the feedback he received about those calls came from the registrars themselves, not from management.</w:t>
       </w:r>
     </w:p>
     <w:p>

</xml_diff>

<commit_message>
WC/2024/227: 1(h) - complaints via registrars' calls; Registrar's emails seen in the Manager's 9 May trail (change 70)
Co-Authored-By: Claude Opus 5.5 <noreply@anthropic.com>
Claude-Session: https://claude.ai/code/session_01PbSZiMB1koFR46V5hQyVcy
</commit_message>
<xml_diff>
--- a/wc2024227/drafts/out/FILING_1OCT2026/2026-10_SECOND_AMENDED_9A_FINAL.docx
+++ b/wc2024227/drafts/out/FILING_1OCT2026/2026-10_SECOND_AMENDED_9A_FINAL.docx
@@ -1149,7 +1149,7 @@
                 <w:color w:val="000000"/>
                 <w:sz w:val="18"/>
               </w:rPr>
-              <w:t xml:space="preserve">Nine occasions of calls reaching the wrong team, including a MET-call enquiry, with the complaints and feedback reaching the Appellant from the registrars; the Manager's first reply after 5 days, 18 hours and 14 minutes; a new process sent to staff on 9 May.</w:t>
+              <w:t xml:space="preserve">Nine occasions of calls reaching the wrong team, including a MET-call enquiry, with the complaints reaching the Appellant in the registrars' own calls to the Switchboard; the Manager's first reply after 5 days, 18 hours and 14 minutes; a new process sent to staff on 9 May.</w:t>
             </w:r>
           </w:p>
         </w:tc>
@@ -4142,7 +4142,7 @@
           <w:sz w:val="20"/>
           <w:szCs w:val="20"/>
         </w:rPr>
-        <w:t xml:space="preserve">The Respondent does not allege that any communication was sent to Logan Switch or to the Switchboard staff concerning those occasions at any time after 3 May 2024 and before 10:15 am on 9 May 2024. [¶ 69] The Appellant's evidence is that he received the complaints about the misdirected calls at the time, and saw the Registrar's emails about them, and that the feedback he received about those calls came from the registrars themselves, not from management.</w:t>
+        <w:t xml:space="preserve">The Respondent does not allege that any communication was sent to Logan Switch or to the Switchboard staff concerning those occasions at any time after 3 May 2024 and before 10:15 am on 9 May 2024. [¶ 69] The Appellant's evidence is that the complaints about the misdirected calls reached him at the time in the registrars' own calls to the Switchboard, and that what he received from the Manager about them was her email to Logan Switch at 10:15 am on 9 May 2024, which stated that it included the email trail below it for reference. [¶¶ 66 to 67] The Registrar's emails of 3 and 8 May 2024 were addressed to the Manager and Dr Wong [¶¶ 56, 59]; the Appellant's evidence is that he saw them in that trail on 9 May 2024.</w:t>
       </w:r>
     </w:p>
     <w:p>

</xml_diff>

<commit_message>
WC/2024/227: final re-run of checks; two small 9A fixes (change 71)
Co-Authored-By: Claude Opus 5.5 <noreply@anthropic.com>
Claude-Session: https://claude.ai/code/session_01PbSZiMB1koFR46V5hQyVcy
</commit_message>
<xml_diff>
--- a/wc2024227/drafts/out/FILING_1OCT2026/2026-10_SECOND_AMENDED_9A_FINAL.docx
+++ b/wc2024227/drafts/out/FILING_1OCT2026/2026-10_SECOND_AMENDED_9A_FINAL.docx
@@ -4599,7 +4599,7 @@
           <w:sz w:val="20"/>
           <w:szCs w:val="20"/>
         </w:rPr>
-        <w:t xml:space="preserve">The Respondent's pleaded answer, including paragraph 27 of its statement, is at Part C, paragraph 10. [¶¶ 300 to 303] The matters at 1(a), 1(c), 1(e), 1(i) and 1(j), and at paragraph 3 below, are pleaded as part of the sequence of matters the Appellant raised and the responses he received. They are not relied on as separate causes within Stressor 1. Where an admitted fact from that sequence is repeated under Stressor 2 or Stressor 3, it is relied on there only for the purpose stated under that stressor. The circumstances relied on as causes in Stressor 1 are those at 1(b), 1(d), 1(f) to 1(h), 1(k) and 1(l), read with the opening duties and standards and the supporting records.</w:t>
+        <w:t xml:space="preserve">The Respondent's pleaded answer, including paragraph 27 of its statement, is at Part C, paragraph 10. [¶¶ 300 to 303] The matters at 1(a), 1(c), 1(e), 1(i) and 1(j), and at Part B.3 below, are pleaded as part of the sequence of matters the Appellant raised and the responses he received. They are not relied on as separate causes within Stressor 1. Where an admitted fact from that sequence is repeated under Stressor 2 or Stressor 3, it is relied on there only for the purpose stated under that stressor. The circumstances relied on as causes in Stressor 1 are those at 1(b), 1(d), 1(f) to 1(h), 1(k) and 1(l), read with the opening duties and standards and the supporting records.</w:t>
       </w:r>
       <w:r>
         <w:rPr>
@@ -8683,7 +8683,7 @@
                 <w:sz w:val="17"/>
                 <w:szCs w:val="17"/>
               </w:rPr>
-              <w:t xml:space="preserve">Payroll's direction to the Manager's "still waiting" email, 21 May 2024</w:t>
+              <w:t xml:space="preserve">Payroll's direction to the Manager's email of 21 May 2024 that she was still waiting for payroll confirmation</w:t>
             </w:r>
           </w:p>
         </w:tc>

</xml_diff>

<commit_message>
WC/2024/227: 9A 'In summary' moved to page 1 (change 76)
Co-Authored-By: Claude Opus 5.5 <noreply@anthropic.com>
Claude-Session: https://claude.ai/code/session_01PbSZiMB1koFR46V5hQyVcy
</commit_message>
<xml_diff>
--- a/wc2024227/drafts/out/FILING_1OCT2026/2026-10_SECOND_AMENDED_9A_FINAL.docx
+++ b/wc2024227/drafts/out/FILING_1OCT2026/2026-10_SECOND_AMENDED_9A_FINAL.docx
@@ -94,6 +94,30 @@
           <w:szCs w:val="22"/>
         </w:rPr>
         <w:t xml:space="preserve"> (Part C, paragraph 1).</w:t>
+      </w:r>
+    </w:p>
+    <w:p>
+      <w:pPr>
+        <w:spacing w:before="80" w:after="140" w:line="264" w:lineRule="auto"/>
+        <w:jc w:val="both"/>
+      </w:pPr>
+      <w:r>
+        <w:rPr>
+          <w:rFonts w:ascii="Times New Roman" w:hAnsi="Times New Roman" w:cs="Times New Roman"/>
+          <w:b/>
+          <w:sz w:val="22"/>
+          <w:szCs w:val="22"/>
+        </w:rPr>
+        <w:t xml:space="preserve">In summary. </w:t>
+      </w:r>
+      <w:r>
+        <w:rPr>
+          <w:rFonts w:ascii="Times New Roman" w:hAnsi="Times New Roman" w:cs="Times New Roman"/>
+          <w:b w:val="0"/>
+          <w:sz w:val="22"/>
+          <w:szCs w:val="22"/>
+        </w:rPr>
+        <w:t>The injury: a psychological injury, diagnosed, with employment found by the Respondent's own review to be a significant contributing factor [¶¶ 261 to 262]. Stressor 1: a continuous 24/7 patient-safety function [¶¶ 2, 8, 289] carried on while database access was removed and not restored [¶¶ 40, 55]; process changes made effective the day they were notified, with no listed record of consultation [¶¶ 51, 181, 273]; calls misdirected and the directory not corrected [¶¶ 58, 67, 89 to 93, 109 to 110]; and the manager's fixed office hours not stated for approximately nine months [¶¶ 71 to 73]. Stressor 2: pay wrong in four fortnights [¶¶ 185 to 189]; Payroll's direction of 3 May 2024 not actioned at 13 May [¶ 193], still awaited on 21 May [¶ 195], lodged 28 May and recorded "Part Completed" [¶ 203]; and a paid leave request declined twice, with the Respondent acknowledging that attachments were present when the later decline was made [¶¶ 116, 118, 134]. Stressor 3: a seven-hour break rostered in that role [¶ 284] against a minimum of ten hours, or eight by written agreement [¶ 285], the agreement’s scope disputed by reference to the later HR email and no swap alleged [¶¶ 225, 234]; the fatigue enquiry answered after 23 days with a refusal [¶¶ 247, 249]; the employer’s statement that fatigue risk management assessment was implemented after 30 June 2024, read with the May risk-matrix discussion [¶¶ 264, 269 to 271]; and the Respondent's own review finding that the rostering was unreasonable management action [¶ 260].</w:t>
       </w:r>
     </w:p>
     <w:p>
@@ -3459,30 +3483,6 @@
     </w:p>
     <w:p>
       <w:pPr>
-        <w:spacing w:before="80" w:after="140" w:line="264" w:lineRule="auto"/>
-        <w:jc w:val="both"/>
-      </w:pPr>
-      <w:r>
-        <w:rPr>
-          <w:rFonts w:ascii="Times New Roman" w:hAnsi="Times New Roman" w:cs="Times New Roman"/>
-          <w:b/>
-          <w:sz w:val="22"/>
-          <w:szCs w:val="22"/>
-        </w:rPr>
-        <w:t xml:space="preserve">In summary. </w:t>
-      </w:r>
-      <w:r>
-        <w:rPr>
-          <w:rFonts w:ascii="Times New Roman" w:hAnsi="Times New Roman" w:cs="Times New Roman"/>
-          <w:b w:val="0"/>
-          <w:sz w:val="22"/>
-          <w:szCs w:val="22"/>
-        </w:rPr>
-        <w:t>The injury: a psychological injury, diagnosed, with employment found by the Respondent's own review to be a significant contributing factor [¶¶ 261 to 262]. Stressor 1: a continuous 24/7 patient-safety function [¶¶ 2, 8, 289] carried on while database access was removed and not restored [¶¶ 40, 55]; process changes made effective the day they were notified, with no listed record of consultation [¶¶ 51, 181, 273]; calls misdirected and the directory not corrected [¶¶ 58, 67, 89 to 93, 109 to 110]; and the manager's fixed office hours not stated for approximately nine months [¶¶ 71 to 73]. Stressor 2: pay wrong in four fortnights [¶¶ 185 to 189]; Payroll's direction of 3 May 2024 not actioned at 13 May [¶ 193], still awaited on 21 May [¶ 195], lodged 28 May and recorded "Part Completed" [¶ 203]; and a paid leave request declined twice, with the Respondent acknowledging that attachments were present when the later decline was made [¶¶ 116, 118, 134]. Stressor 3: a seven-hour break rostered in that role [¶ 284] against a minimum of ten hours, or eight by written agreement [¶ 285], the agreement’s scope disputed by reference to the later HR email and no swap alleged [¶¶ 225, 234]; the fatigue enquiry answered after 23 days with a refusal [¶¶ 247, 249]; the employer’s statement that fatigue risk management assessment was implemented after 30 June 2024, read with the May risk-matrix discussion [¶¶ 264, 269 to 271]; and the Respondent's own review finding that the rostering was unreasonable management action [¶ 260].</w:t>
-      </w:r>
-    </w:p>
-    <w:p>
-      <w:pPr>
         <w:keepNext/>
         <w:pageBreakBefore/>
         <w:spacing w:before="0" w:after="100" w:line="264" w:lineRule="auto"/>

</xml_diff>

<commit_message>
WC/2024/227: Langerak [86] and Mahaffey [57] pinpoints; documentary-record sentence (change 78)
Co-Authored-By: Claude Opus 5.5 <noreply@anthropic.com>
Claude-Session: https://claude.ai/code/session_01PbSZiMB1koFR46V5hQyVcy
</commit_message>
<xml_diff>
--- a/wc2024227/drafts/out/FILING_1OCT2026/2026-10_SECOND_AMENDED_9A_FINAL.docx
+++ b/wc2024227/drafts/out/FILING_1OCT2026/2026-10_SECOND_AMENDED_9A_FINAL.docx
@@ -171,7 +171,7 @@
           <w:sz w:val="22"/>
           <w:szCs w:val="22"/>
         </w:rPr>
-        <w:t>Each stressor is pleaded so that it can be decided on its own facts. Where one admitted fact matters to more than one stressor, it is repeated on purpose. The repetition does not allege separate injuries and does not count causation twice. It shows the different part the same event plays in each stressor within the whole course of conduct. The medical material is placed between the facts only to show what was reported at the time, the diagnosis, capacity and treatment history. It is not used to turn a clinical history into proof of an event that is otherwise disputed. The numbered themes organise the case; the lettered particulars identify dated events or connected event sequences. Unlettered paragraphs state duties, standards, supporting records, medical links and the pleaded response. Context-only and post-injury material retains that limited purpose.</w:t>
+        <w:t xml:space="preserve">The conduct relied on was, for the most part, done in writing - by email, roster, myHR and payroll record - so each such document is pleaded as the step taken, on the date and in the terms recorded, rather than characterised. Each stressor is pleaded so that it can be decided on its own facts. Where one admitted fact matters to more than one stressor, it is repeated on purpose. The repetition does not allege separate injuries and does not count causation twice. It shows the different part the same event plays in each stressor within the whole course of conduct. The medical material is placed between the facts only to show what was reported at the time, the diagnosis, capacity and treatment history. It is not used to turn a clinical history into proof of an event that is otherwise disputed. The numbered themes organise the case; the lettered particulars identify dated events or connected event sequences. Unlettered paragraphs state duties, standards, supporting records, medical links and the pleaded response. Context-only and post-injury material retains that limited purpose.</w:t>
       </w:r>
     </w:p>
     <w:p>
@@ -10835,7 +10835,7 @@
           <w:sz w:val="22"/>
           <w:szCs w:val="22"/>
         </w:rPr>
-        <w:t xml:space="preserve"> [2020] ICQ 2, as applied in </w:t>
+        <w:t xml:space="preserve"> [2020] ICQ 2 at [86], as applied in </w:t>
       </w:r>
       <w:r>
         <w:rPr>
@@ -10869,7 +10869,7 @@
           <w:sz w:val="22"/>
           <w:szCs w:val="22"/>
         </w:rPr>
-        <w:t xml:space="preserve"> [2016] ICQ 10 is consistent with the proposition that, where other employment factors also caused the disorder, the presence of reasonable management action among the causes does not by itself answer the statutory question. The review decision's finding that the rostering of 17 and 18 March 2024 was unreasonable management action is relied on as an admitted document, not as a binding decision.</w:t>
+        <w:t xml:space="preserve"> [2016] ICQ 10 at [57] is consistent with the proposition that, where other employment factors also caused the disorder, the presence of reasonable management action among the causes does not by itself answer the statutory question. The review decision's finding that the rostering of 17 and 18 March 2024 was unreasonable management action is relied on as an admitted document, not as a binding decision.</w:t>
       </w:r>
     </w:p>
     <w:p>

</xml_diff>

<commit_message>
WC/2024/227: corrected proposed 9A after verification runs (change 95)
Co-Authored-By: Claude Opus 5.5 <noreply@anthropic.com>
Claude-Session: https://claude.ai/code/session_01PbSZiMB1koFR46V5hQyVcy
</commit_message>
<xml_diff>
--- a/wc2024227/drafts/out/FILING_1OCT2026/2026-10_SECOND_AMENDED_9A_FINAL.docx
+++ b/wc2024227/drafts/out/FILING_1OCT2026/2026-10_SECOND_AMENDED_9A_FINAL.docx
@@ -333,7 +333,7 @@
           <w:sz w:val="22"/>
           <w:szCs w:val="22"/>
         </w:rPr>
-        <w:t>At the first consultation, on the referral, the treating psychiatrist, Dr Ravikumar Bangalore Krishnaiah, told the Appellant, and confirmed in writing at 11:45 am that day, that he was "suffering from psychological injury of Major Depressive Disorder with anxiety state"; that fluoxetine was increased to two capsules "from today" and Seroquel 25 mg commenced at night, "to restore basic needs- sleep, eating and routine". The Appellant's email of 5:12 pm that day reads "I have finally been able to see a psychiatrist today". [Tab M3; Respondent's item 9.] Read with paragraph 1.5, it records the diagnosis made on 24 October 2024 of the condition first certified on 1 July 2024.</w:t>
+        <w:t xml:space="preserve">At the first consultation, on the referral, the treating psychiatrist, Dr Ravikumar Bangalore Krishnaiah, told the Appellant, and confirmed in writing at 11:45 am that day, that he was "suffering from psychological injury of Major Depressive Disorder with anxiety state …"; that fluoxetine was increased to two capsules "from today" and Seroquel 25 mg commenced, at half a tablet for three nights and then one tablet at night, "to restore basic needs- sleep, eating and routine". The Appellant's email of 5:12 pm that day reads "I have finally been able to see a psychiatrist today". [Tab M3; Respondent's item 9.] Read with paragraph 1.5, it records the diagnosis made on 24 October 2024 of the condition first certified on 1 July 2024.</w:t>
       </w:r>
     </w:p>
     <w:p>
@@ -356,7 +356,7 @@
           <w:sz w:val="22"/>
           <w:szCs w:val="22"/>
         </w:rPr>
-        <w:t>Diagnosis: Major Depressive Disorder with anxious distress (DSM-5 296.23). The report states the severity, the effect on functioning and the treatment (fluoxetine increased to three capsules daily; quetiapine 25 mg at night). The treating clinician records the origin as "workplace stress stemming from issues with management and rostering", records that pay was "withheld or delayed for up to five months at a time" as a source of financial stress, and states that "premature exposure to the workplace is more likely result in significant deterioration". [Tab M4; Respondent's item 10.] The stressors recorded in that report match matters admitted on 8 September 2026: management and rostering, and the night-shift line; the shorter break; and pay withheld or delayed from the 5 February 2024 fortnight, uncorrected at 13 May, "claims older than 3 months" on 28 May, a claim effective 30 March recorded "Part Completed" on 30 May, and the two February claims absent from the myHR report. The report bears a footer reading "for the only reason of clinical information and not for medico-legal use". The author's emails of 5 and 8 September 2026 state of his records "You can use them according to the need to support your legal issues", and identify the report of 13 February 2025 as "the report that captures the relevant information you have requested" on the matters in issue. [Tab M5.] The report is not relied on to say which of the individual events pleaded at Part B.2 caused the injury, or how much each contributed. Nothing after 24 October 2024 is relied on as a cause of the injury.</w:t>
+        <w:t xml:space="preserve">Diagnosis: Major Depressive Disorder with anxious distress (DSM-5 296.23). The report states the severity, the effect on functioning and the treatment (fluoxetine increased to three capsules daily; quetiapine 25 mg at night). The treating clinician records the origin as "workplace stress stemming from issues with management and rostering", records that pay was "withheld or delayed for up to five months at a time" as a source of financial stress, and states that "premature exposure to the workplace is more likely [sic] result in significant deterioration". [Tab M4; Respondent's item 10.] The stressors recorded in that report match matters admitted on 8 September 2026: management and rostering, and the night-shift line; the shorter break; and pay withheld or delayed from the 5 February 2024 fortnight, uncorrected at 13 May, "claims older than 3 months" on 28 May, a claim effective 30 March recorded "Part Completed" on 30 May, and the two February claims absent from the myHR report. The report bears a footer reading "for the only reason of clinical information and not for medico-legal use". The author's emails of 5 and 8 September 2026 state of his records "You can use them according to the need to support your legal issues", and identify the report of 13 February 2025 as "the report that captures the relevant information you have requested" on the matters in issue. [Tab M5.] The report is not relied on to say which of the individual events pleaded at Part B.2 caused the injury, or how much each contributed. Nothing after 24 October 2024 is relied on as a cause of the injury.</w:t>
       </w:r>
     </w:p>
     <w:p>
@@ -468,7 +468,7 @@
           <w:sz w:val="22"/>
           <w:szCs w:val="22"/>
         </w:rPr>
-        <w:t xml:space="preserve">No medico-legal report has been prepared for this proceeding. The Appellant relies on the treating records and documents at Tabs M1 to M4 and M7 to M9, served with the Schedule of Medical Documents Relied Upon on 9 September 2026. He also relies on the oral evidence of the treating general practitioner, Dr Peter Hawes, and the treating psychiatrist, Dr Ravikumar Bangalore Krishnaiah. Each is named in the Appellant's list of witnesses filed 9 September 2026. Each will be asked to address, from his own records and the admitted facts put to him: the diagnosis; the history reported to him and when; whether the Appellant's employment, and in particular the matters pleaded at Stressors 1 to 3, was a significant contributing factor to the injury; and the non-employment matters recorded in the report of 13 February 2025. This paragraph gives notice of that evidence. Once hearing dates are set, the Appellant will apply for attendance notices and for leave for each practitioner to give evidence by telephone or video link at a fixed time.</w:t>
+        <w:t xml:space="preserve">No medico-legal report has been prepared for this proceeding. The Appellant relies on the treating records and documents at Tabs M1 to M5 and M7 to M9 (Tab M6, the treating psychiatrist's clinical records, to be served on receipt), served with the Schedule of Medical Documents Relied Upon on 9 September 2026. He also relies on the oral evidence of the treating general practitioner, Dr Peter Hawes, and the treating psychiatrist, Dr Ravikumar Bangalore Krishnaiah. Each is named in the Appellant's list of witnesses filed 9 September 2026. Each will be asked to address, from his own records and the admitted facts put to him: the diagnosis; the history reported to him and when; whether the Appellant's employment, and in particular the matters pleaded at Stressors 1 to 3, was a significant contributing factor to the injury; and the non-employment matters recorded in the report of 13 February 2025. This paragraph gives notice of that evidence. Once hearing dates are set, the Appellant will apply for attendance notices and for leave for each practitioner to give evidence by telephone or video link at a fixed time.</w:t>
       </w:r>
     </w:p>
     <w:p>
@@ -1289,7 +1289,7 @@
                 <w:color w:val="000000"/>
                 <w:sz w:val="22"/>
               </w:rPr>
-              <w:t xml:space="preserve">Nine occasions of calls reaching the wrong team, including a MET-call enquiry, with the complaints reaching the Appellant in the registrars' own calls to the Switchboard; the Manager's first reply after 5 days, 18 hours and 14 minutes; a new process sent to staff on 9 May.</w:t>
+              <w:t xml:space="preserve">Nine occasions of calls reaching the wrong team, including a MET-call enquiry, with the complaints reaching the Appellant in the registrars' own calls to the Switchboard; the Manager's reply after 5 days, 18 hours and 14 minutes; a new process sent to staff on 9 May.</w:t>
             </w:r>
           </w:p>
         </w:tc>
@@ -2763,7 +2763,7 @@
                 <w:color w:val="000000"/>
                 <w:sz w:val="22"/>
               </w:rPr>
-              <w:t xml:space="preserve">28 May 2024</w:t>
+              <w:t xml:space="preserve">28 to 30 May 2024</w:t>
             </w:r>
           </w:p>
         </w:tc>
@@ -2789,7 +2789,7 @@
                 <w:color w:val="000000"/>
                 <w:sz w:val="22"/>
               </w:rPr>
-              <w:t xml:space="preserve">Validation request</w:t>
+              <w:t xml:space="preserve">Validation request and partly completed AVAC</w:t>
             </w:r>
           </w:p>
         </w:tc>
@@ -2815,7 +2815,7 @@
                 <w:color w:val="000000"/>
                 <w:sz w:val="22"/>
               </w:rPr>
-              <w:t xml:space="preserve">The Manager asked the Appellant to sign a validation form for claims older than three months.</w:t>
+              <w:t xml:space="preserve">The Manager asked the Appellant to sign a validation form for claims older than three months; the AVAC lodged that day was recorded "Part Completed" on 30 May.</w:t>
             </w:r>
           </w:p>
         </w:tc>
@@ -3648,7 +3648,7 @@
           <w:sz w:val="22"/>
           <w:szCs w:val="22"/>
         </w:rPr>
-        <w:t xml:space="preserve">Emergency codes are received at the Switchboard, categorised by the operator by the type of emergency, and paged to the response group for that category within the time the procedure allows. [¶ 8] The Appellant's evidence is that each code was paged at the same time to a response team of about ten clinicians through the SPOK paging system; that codes and other urgent matters did not arrive one at a time, so that he managed concurrent emergency and security responses and time-critical clinical calls while continuing to manage the call queue; and that the number of codes varied from day to day. The Emergency Code Register records eight codes on 17 March 2024, eleven on 18 March and sixteen entries on 19 March (Stressor 3(b) and 3(c); Tab 31).</w:t>
+        <w:t xml:space="preserve">The position receives emergency response notifications and distributes them to the appropriate response groups, dependent on the category of emergency, as per emergency code procedures, strictly adhering to protocols and timeframes. [¶ 8] The Appellant's evidence is that each code was paged at the same time to a response team of about ten clinicians through the SPOK paging system; that codes and other urgent matters did not arrive one at a time, so that he managed concurrent emergency and security responses and time-critical clinical calls while continuing to manage the call queue; and that the number of codes varied from day to day. The Emergency Code Register records eight entries on 17 March 2024, eleven on 18 March and sixteen on 19 March (Stressor 3(b) and 3(c); Tab 31).</w:t>
       </w:r>
     </w:p>
     <w:p>
@@ -3672,7 +3672,7 @@
           <w:sz w:val="22"/>
           <w:szCs w:val="22"/>
         </w:rPr>
-        <w:t xml:space="preserve">The Appellant's evidence is that complaints from the public, from clinicians and from staff across the hospital arrived first at the Switchboard, by telephone and to the shared Switchboard inbox, and came to him as the operator on duty; that he triaged them and resolved a substantial proportion himself, escalating those that needed management action; and that complaints that were not resolved returned to the Switchboard to be dealt with again, including complaints about the currency of the on-call roster and the telephone directory. On the employer's own account, complaints about Switchboard operational errors were made directly to the Line Manager and managed solely by email or verbally with the complainant [¶ 267], and no change to the Switchboard's operating procedures as a consequence of any employee complaint is alleged before 30 June 2024. [¶ 272] These operating conditions are pleaded as the setting in which the causal particulars at 1(b), 1(h) and 1(k), and at Stressor 3(b), occurred. They are the Appellant's evidence, not admitted counts, and they are not pleaded as separate causal particulars.</w:t>
+        <w:t xml:space="preserve">The Appellant's evidence is that complaints from the public, from clinicians and from staff across the hospital arrived first at the Switchboard, by telephone and to the shared Switchboard inbox, and came to him as the operator on duty; that he triaged them and resolved a substantial proportion himself, escalating those that needed management action; and that complaints that were not resolved returned to the Switchboard to be dealt with again, including complaints about the currency of the on-call roster and the telephone directory. On the employer's own account, complaints about Switchboard operational errors were made directly to the Line Manager and managed solely by email or verbally with the complainant [¶ 267], and no change to the Switchboard's operating procedures as a consequence of any employee complaint is alleged over the period 1 December 2023 to 30 June 2024. [¶ 272] These operating conditions are pleaded as the setting in which the causal particulars at 1(b), 1(h) and 1(k), and at Stressor 3(b), occurred. They are the Appellant's evidence, not admitted counts, and they are not pleaded as separate causal particulars.</w:t>
       </w:r>
     </w:p>
     <w:p>
@@ -3724,7 +3724,7 @@
           <w:sz w:val="22"/>
           <w:szCs w:val="22"/>
         </w:rPr>
-        <w:t>The Respondent does not allege that agreement under clause 6.2 of the Award was obtained, or that a ballot of affected employees was conducted, before it. [¶¶ 180 to 181]</w:t>
+        <w:t xml:space="preserve">The Respondent does not allege that a ballot of affected employees was conducted before it. [¶ 181] Nor does it allege that agreement under clause 6.2 of the Award was obtained before the rostering of the Appellant's shifts on 17 and 18 March 2024 (Stressor 3(b)). [¶ 180]</w:t>
       </w:r>
     </w:p>
     <w:p>
@@ -4096,7 +4096,7 @@
           <w:sz w:val="22"/>
           <w:szCs w:val="22"/>
         </w:rPr>
-        <w:t xml:space="preserve">On 8 August 2023 at 4:15 pm the Director wrote regarding an additional shift to replace the shift not worked due to a rostering error. [¶ 28] On 8 August 2023 he confirmed that he would work the replacement shift and was looking to pick up another. [¶ 29]</w:t>
+        <w:t xml:space="preserve">On 8 August 2023 at 4:15 pm the Director wrote regarding an additional shift to replace the shift not worked due to a rostering error. [¶ 28] On 8 August 2023 the Appellant confirmed that he would work the replacement shift and was looking to pick up another. [¶ 29]</w:t>
       </w:r>
     </w:p>
     <w:p>
@@ -4110,7 +4110,7 @@
           <w:sz w:val="22"/>
           <w:szCs w:val="22"/>
         </w:rPr>
-        <w:t>On 29 August 2023 she sent HR Policy E12, and on 4 September 2023 the Appellant replied. [¶¶ 160 to 161]</w:t>
+        <w:t xml:space="preserve">On 29 August 2023 the Director sent HR Policy E12, and on 4 September 2023 the Appellant replied. [¶¶ 160 to 161]</w:t>
       </w:r>
     </w:p>
     <w:p>
@@ -4501,7 +4501,7 @@
           <w:sz w:val="22"/>
           <w:szCs w:val="22"/>
         </w:rPr>
-        <w:t xml:space="preserve">The Manager's first reply was sent on 9 May at 9:20 am, </w:t>
+        <w:t xml:space="preserve">The Manager's reply was sent on 9 May at 9:20 am, </w:t>
       </w:r>
       <w:r>
         <w:rPr>
@@ -4546,7 +4546,7 @@
           <w:sz w:val="22"/>
           <w:szCs w:val="22"/>
         </w:rPr>
-        <w:t xml:space="preserve">The Respondent does not allege that any communication was sent to Logan Switch or to the Switchboard staff concerning those occasions at any time after 3 May 2024 and before 10:15 am on 9 May 2024. [¶ 69] The Appellant's evidence is that the complaints about the misdirected calls reached him at the time in the registrars' own calls to the Switchboard, and that what he received from the Manager about them was her email to Logan Switch at 10:15 am on 9 May 2024, which stated that it included the email trail below it for reference. [¶¶ 66 to 67] The Registrar's emails of 3 and 8 May 2024 were addressed to the Manager and Dr Wong [¶¶ 56, 59]; the Appellant's evidence is that he saw them in that trail on 9 May 2024.</w:t>
+        <w:t xml:space="preserve">The Respondent does not allege that any communication was sent to Logan Switch or to the Switchboard staff concerning those occasions at any time after 3 May 2024 and before 10:15 am on 9 May 2024. [¶ 69] The Appellant's evidence is that the complaints about the misdirected calls reached him at the time in the registrars' own calls to the Switchboard, and that what he received from the Manager about them was her email to Logan Switch at 10:15 am on 9 May 2024, which stated that it included the email trail below it for reference. [¶¶ 66 to 67] The Registrar's emails of 3 and 8 May 2024 were addressed to the Manager and copied to Dr Wong [¶¶ 56, 59]; the Appellant's evidence is that he saw them in that trail on 9 May 2024.</w:t>
       </w:r>
     </w:p>
     <w:p>
@@ -4560,7 +4560,7 @@
           <w:sz w:val="22"/>
           <w:szCs w:val="22"/>
         </w:rPr>
-        <w:t xml:space="preserve">So the sequence at the console was: the first report on 3 May 2024, a second on 8 May (the fifth calendar day after the first), nine occasions in all, the Manager's first reply after five days, eighteen hours and fourteen minutes, and a new process communicated to Switchboard staff at 10:15 am on 9 May (the sixth day). [¶¶ 56 to 69]</w:t>
+        <w:t xml:space="preserve">So the sequence at the console was: the first report on 3 May 2024, a second on 8 May (the fifth calendar day after the first), nine occasions in all, the Manager's reply after five days, eighteen hours and fourteen minutes, and a new process communicated to Switchboard staff at 10:15 am on 9 May (the sixth day). [¶¶ 56 to 69]</w:t>
       </w:r>
     </w:p>
     <w:p>
@@ -4584,7 +4584,7 @@
           <w:sz w:val="22"/>
           <w:szCs w:val="22"/>
         </w:rPr>
-        <w:t>On 13 May 2024 the Appellant lodged a corrupt conduct complaint regarding clinical risks. The Ethical Standards Unit formally determined this constituted a Public Interest Disclosure (Admitted Fact: Form 24, para 20, admitted 18 February 2026). The content is not set out. It is pleaded for chronology only; no cause of the injury and no motive is alleged in connection with it.</w:t>
+        <w:t xml:space="preserve">On 13 May 2024 the Appellant lodged a complaint. On 24 December 2024 the Ethical Standards Unit determined that it constituted a Public Interest Disclosure (paragraph 20 of the Appellant's first notice to admit facts, admitted 18 February 2026). The content is not set out. It is pleaded for chronology only; no cause of the injury and no motive is alleged in connection with it.</w:t>
       </w:r>
     </w:p>
     <w:p>
@@ -5003,7 +5003,7 @@
           <w:sz w:val="22"/>
           <w:szCs w:val="22"/>
         </w:rPr>
-        <w:t xml:space="preserve">The Respondent does not allege that any change was made to the operating procedures of the Switchboard as a consequence of any employee complaint at any time before 30 June 2024 [¶ 272]; its position on fatigue risk management before that date is pleaded at Stressor 3, supporting fatigue records [¶¶ 269 to 271].</w:t>
+        <w:t xml:space="preserve">The Respondent does not allege that any change was made to the operating procedures of the Switchboard as a consequence of any employee complaint over the period 1 December 2023 to 30 June 2024 [¶ 272]; its position on fatigue risk management before that date is pleaded at Stressor 3, supporting fatigue records [¶¶ 269 to 271].</w:t>
       </w:r>
     </w:p>
     <w:p>
@@ -5365,7 +5365,7 @@
           <w:sz w:val="22"/>
           <w:szCs w:val="22"/>
         </w:rPr>
-        <w:t>The Appellant raised the pay for the period 8 to 31 March 2024 with the Manager on 8 April 2024. [¶ 242] On 9 April she replied that she had escalated the fatigue enquiry to Human Resources. [¶ 244] On 24 April he wrote that it had been more than two weeks without any response or overtime payment. [¶ 246] On 1 May she replied that the fatigue payment for 18 March would not be processed, and that payroll was still reviewing his public holiday entitlements. [¶¶ 247, 255]</w:t>
+        <w:t xml:space="preserve">The Appellant raised the pay for the period 8 to 31 March 2024 with the Manager on 8 April 2024. [¶ 242] On 9 April she replied that she had escalated the fatigue enquiry to Human Resources. [¶ 244] On 24 April he wrote that it had been more than two weeks without any response or overtime payment. [¶ 246] On 1 May she replied that the fatigue payment for 18 March would not be processed [¶ 247]; the review decision records that payroll was, as at 1 May 2024, still reviewing his public holiday entitlements. [¶ 255]</w:t>
       </w:r>
     </w:p>
     <w:p>
@@ -5523,7 +5523,7 @@
           <w:sz w:val="22"/>
           <w:szCs w:val="22"/>
         </w:rPr>
-        <w:t>On 21 May 2024 at 12:33 pm the Manager wrote that she was "still I am waiting payroll confirmation". [¶¶ 194 to 195]</w:t>
+        <w:t xml:space="preserve">On 21 May 2024 at 12:33 pm the Manager wrote that she was "still I am waiting [sic] payroll confirmation". [¶¶ 194 to 195]</w:t>
       </w:r>
     </w:p>
     <w:p>
@@ -5547,7 +5547,7 @@
           <w:sz w:val="22"/>
           <w:szCs w:val="22"/>
         </w:rPr>
-        <w:t>On 28 May 2024 at 8:36 am she wrote: "Please find attached Validation of claims older than 3 months, please sign and return to be as soon as possible so I can escalate for delegate approval." [¶¶ 196 to 197]</w:t>
+        <w:t xml:space="preserve">On 28 May 2024 at 8:36 am she wrote: "Please find attached Validation of claims older than 3 months, please sign and return to be [sic] as soon as possible so I can escalate for delegate approval." [¶¶ 196 to 197]</w:t>
       </w:r>
     </w:p>
     <w:p>
@@ -5623,7 +5623,7 @@
           <w:sz w:val="22"/>
           <w:szCs w:val="22"/>
         </w:rPr>
-        <w:t xml:space="preserve">The shift of 9 February 2024 was not corrected on Payslip 06, pay date 5 June 2024. On Payroll's account it "was amended with an exemption for the Validation of Claims form on the 30.06.2025 and is on Payslip 07", for the pay period 9 to 22 June 2025, pay date 2 July 2025. The amendment was 423 days, and the pay date 425 days, after Payroll's direction of 3 May 2024; both were after the date of injury; after the Respondent's review decision of 24 October 2024; and after this appeal was commenced. It was made with an exemption from the form the Manager had asked the Appellant to sign on 28 May 2024. [¶¶ 196 to 197] The Respondent's pleading describes the pay issues as "remedied in a timely manner" [¶ 207], and its outlines of evidence describe them as "corrected" (Ms Wright's outline, served 24 September 2026), without stating these dates.</w:t>
+        <w:t xml:space="preserve">The shift of 9 February 2024 was not corrected on Payslip 06, pay date 5 June 2024. On Payroll's account it "was amended with an exemption for the Validation of Claims form on the 30.06.2025 and is on Payslip 07", for the pay period 9 to 22 June 2025, pay date 2 July 2025. The amendment was 423 days, and the pay date 425 days, after Payroll's direction of 3 May 2024; both were after the date of injury, after the Respondent's review decision of 24 October 2024, and after this appeal was commenced. It was made with an exemption from the form the Manager had asked the Appellant to sign on 28 May 2024. [¶¶ 196 to 197] The Respondent's pleading describes the pay issues as "remedied in a timely manner" [¶ 207], and its outlines of evidence describe them as "corrected" (Ms Wright's outline, served 24 September 2026), without stating these dates.</w:t>
       </w:r>
     </w:p>
     <w:p>
@@ -6004,7 +6004,7 @@
           <w:sz w:val="22"/>
           <w:szCs w:val="22"/>
         </w:rPr>
-        <w:t xml:space="preserve">On 1 May 2024 the Manager wrote that the request for fatigue payment for 18 March 2024 would not be processed "due to the existing 8-hour agreement signed by you on 17 June 2020", noting that he was able to terminate the agreement going forward; that email is pleaded at 3(d) below. [¶¶ 247 to 248] The review decision records the employer's response of 6 September 2024 as confirming "you did not formally rescind the 8-hour agreement signed by you on 17 June 2020 and the change to your employment contract and adjustments in your working hours did not automatically invalidate the agreement". [¶ 252] By email of 7 July 2026 a Senior Consultant, Human Resources wrote that the rostering "currently provides more than" the required break, and acknowledged the 8-hour agreement signed on 17 June 2020 "which allows you to work with only an 8 hour break, however this </w:t>
+        <w:t xml:space="preserve">On 1 May 2024 the Manager wrote that the request for fatigue payment for 18 March 2024 would not be processed "due to the existing 8-hour agreement signed by you on 17 June 2020", noting that he was able to terminate the agreement going forward; that email is pleaded at 3(d) below. [¶¶ 247 to 248] The review decision records the employer's response of 6 September 2024 as confirming "you did not formally rescind the 8-hour agreement signed by you on 17 June 2020 and the change to your employment contract and adjustments in your working hours did not automatically invalidate the agreement". [¶ 252] By email of 7 July 2026 a Senior Consultant, Human Resources, wrote that the rostering "currently provides more than" the required break, and acknowledged the 8-hour agreement signed on 17 June 2020 "which allows you to work with only an 8 hour break, however this </w:t>
       </w:r>
       <w:r>
         <w:rPr>
@@ -6168,7 +6168,7 @@
           <w:sz w:val="22"/>
           <w:szCs w:val="22"/>
         </w:rPr>
-        <w:t>Metro South Health has stated in writing that "a spreadsheet of recorded MET calls is available for the period 17-18 March 2024". [¶ 268] A key responsibility of the position is to participate in the Emergency Response process by receiving emergency response notifications and distributing them to the appropriate response groups, dependent on the category of emergency, as per emergency code procedures, strictly adhering to protocols and timeframes; and to support the allocation, coordination and fault repair of all pager units for the hospital. [¶¶ 7 to 8] The Switchboard staff are, on the employer's own statement, non-clinical. [¶ 265]</w:t>
+        <w:t xml:space="preserve">Metro South Health has stated in writing that "a spreadsheet of recorded MET calls is available for the period 17-18 March 2024". [¶ 268] A key responsibility of the position is to participate in the Emergency Response process by receiving emergency response notifications and distributing them to the appropriate response groups, dependent on the category of emergency, as per emergency code procedures, strictly adhering to protocols and timeframes; and to support the allocation, coordination and fault repair of all pager units for the hospital. [¶¶ 7 to 8] The Switchboard staff are, on the employer's own statement, non-clinical. [¶ 263]</w:t>
       </w:r>
     </w:p>
     <w:p>
@@ -6192,7 +6192,7 @@
           <w:sz w:val="22"/>
           <w:szCs w:val="22"/>
         </w:rPr>
-        <w:t>Each emergency code at Logan Hospital is received at the Switchboard, categorised by the operator by the type of emergency, and paged to the response group for that category within the time the procedure allows. [¶ 8] A Code Blue is the call for a medical emergency in which a patient has suffered, or is about to suffer, cardiac or respiratory arrest, and brings the resuscitation team. A MET call is the call for the Medical Emergency Team to a patient whose observations have deteriorated to the hospital's escalation threshold; a Neonatal MET call and a Paediatric MET call are the same call for a newborn and for a child. A Code Grey is the call for a security response to threatening or aggressive behaviour; a Code Black is the call for a security response to a personal threat. The colour codes follow the Australian Standard for emergency control in health care facilities, AS 4083. Queensland Health's own Code Blue procedure for the Royal Brisbane and Women's Hospital (Procedure 001443, version 5, effective April 2020) states that "there are eight different types of Code Blue", including Medical Emergency, Cardiac Arrest, Neonatal Emergency, and Paediatric Emergency or Paediatric Cardiac Arrest; that "Switchboard Services will activate one or multiple teams to provide a Code Blue response"; and that the response team "will be notified by a paging system from Switchboard Services… identifying the type of Code Blue and the location of the emergency". The Logan Hospital emergency code procedures referred to in the role description [¶ 8] are the equivalent document for Logan Hospital (Schedule, Part 2).</w:t>
+        <w:t xml:space="preserve">The position receives emergency response notifications and distributes them to the appropriate response groups, dependent on the category of emergency, as per emergency code procedures, strictly adhering to protocols and timeframes. [¶ 8] A Code Blue is the call for a medical emergency in which a patient has suffered, or is about to suffer, cardiac or respiratory arrest, and brings the resuscitation team. A MET call is the call for the Medical Emergency Team to a patient whose observations have deteriorated to the hospital's escalation threshold; a Neonatal MET call and a Paediatric MET call are the same call for a newborn and for a child. A Code Grey is the call for a security response to threatening or aggressive behaviour; a Code Black is the call for a security response to a personal threat. The colour codes follow the Australian Standard for emergency control in health care facilities, AS 4083. Queensland Health's own Code Blue procedure for the Royal Brisbane and Women's Hospital (Procedure 001443, version 5, effective April 2020) states that "there are eight different types of Code Blue", including Medical Emergency, Cardiac Arrest, Neonatal Emergency, and Paediatric Emergency or Paediatric Cardiac Arrest; that "Switchboard Services will activate one or multiple teams to provide a Code Blue response"; and that the response team "will be notified by a paging system from Switchboard Services… identifying the type of Code Blue and the location of the emergency". The Logan Hospital emergency code procedures referred to in the role description [¶ 8] are the equivalent document for Logan Hospital (Schedule, Part 2).</w:t>
       </w:r>
     </w:p>
     <w:p>
@@ -6324,7 +6324,7 @@
           <w:sz w:val="22"/>
           <w:szCs w:val="22"/>
         </w:rPr>
-        <w:t xml:space="preserve">. [¶ 284] The shift commencing on 18 March fell on a Monday, the first shift of the working week. [¶ 227] Payroll later recorded that the fortnight commencing 18 March 2024 had too many ordinary shifts and that one of the shifts needed to be overtime [¶ 188], as pleaded at Stressor 2(d). The break was rostered in a function the Respondent admits is critical to patient safety [¶ 289].</w:t>
+        <w:t xml:space="preserve">. [¶ 284] The shift commencing on 18 March fell on a Monday. [¶ 227] Payroll later recorded that the fortnight commencing 18 March 2024 had too many ordinary shifts and that one of the shifts needed to be overtime [¶ 188], as pleaded at Stressor 2(d). The break was rostered in a function the Respondent admits is critical to patient safety [¶ 289].</w:t>
       </w:r>
     </w:p>
     <w:p>
@@ -6362,7 +6362,7 @@
           <w:sz w:val="22"/>
           <w:szCs w:val="22"/>
         </w:rPr>
-        <w:t>The seven-hour figure is the interval between the rostered finish at 23:00 on 17 March 2024 and the rostered commencement at 06:00 on 18 March 2024. The review decision records the Appellant's response of 9 August 2024 that the break "did not include travel time" and that, with travel factored in, the break between shifts would have been less than five hours. [¶ 251] The Appellant's account is this. His home is on the Gold Coast and the drive to and from Logan Hospital took about an hour each way at those hours. Across the two shifts about four hours were spent driving. When the 17 March shift ended at 23:00 he had been awake and working for about sixteen hours. Of the seven hours before 06:00, two were on the road and at best four to five were available for sleep. So, across the pair of shifts, the Appellant's account is: about sixteen hours of work, on two eight-hour shifts; about four hours of travel, in four drives of about an hour each; and about four hours of sleep, of the four to five hours available. The seven hours and the response of 9 August 2024 are the admitted record; the rest of that account is the Appellant's own evidence.</w:t>
+        <w:t xml:space="preserve">The seven-hour figure is the interval between the rostered finish at 23:00 on 17 March 2024 and the rostered commencement at 06:00 on 18 March 2024. The review decision records the Appellant's response of 9 August 2024 that the break "did not include travel time" and that, with travel factored in, the break between shifts would have been less than five hours. [¶ 251] The Appellant's account is this. His home is on the Gold Coast and the drive to and from Logan Hospital took about an hour each way at those hours. Across the two shifts about four hours were spent driving. When the 17 March shift ended at 23:00 he had been awake for about sixteen hours. Of the seven hours before 06:00, two were on the road and at best four to five were available for sleep. So, across the pair of shifts, the Appellant's account is: about sixteen hours of work, on two eight-hour shifts; about four hours of travel, in four drives of about an hour each; and about four hours of sleep, of the four to five hours available. The seven hours and the response of 9 August 2024 are the admitted record; the rest of that account is the Appellant's own evidence.</w:t>
       </w:r>
     </w:p>
     <w:p>
@@ -6377,7 +6377,7 @@
           <w:sz w:val="22"/>
           <w:szCs w:val="22"/>
         </w:rPr>
-        <w:t xml:space="preserve">The codes on the shift of 17 March 2024. </w:t>
+        <w:t xml:space="preserve">The codes on 17 March 2024. </w:t>
       </w:r>
       <w:r>
         <w:rPr>
@@ -6386,7 +6386,7 @@
           <w:sz w:val="22"/>
           <w:szCs w:val="22"/>
         </w:rPr>
-        <w:t>The shift ended at 23:00. [¶ 284] The Emergency Code Register for that day (Tab 31) records eight codes: at 3:57 a Code Grey in the ED lounge; at 5:19 a MET call to Ward 5A bed 27; at 7:48 a Code Grey in the ED corridor near short stay; at 13:48 a MET call to Ward 3B bed 2; at 14:13 a Code Grey in ED adult acute bed 15; at 19:16 a MET call to Ward 2H bed 7; at 19:20, four minutes later, a Code Blue to the same patient, Ward 2H bed 7; and at 21:16 a MET call to Ward 2Q bed 5. The last three fell in the evening of that shift.</w:t>
+        <w:t xml:space="preserve">The shift ended at 23:00. [¶ 284] The Emergency Code Register for that day (Tab 31) records eight entries: at 3:57 a Code Grey in the ED lounge; at 5:19 a MET call to Ward 5A bed 27; at 7:48 a Code Grey in the ED corridor near short stay; at 13:48 a MET call to Ward 3B bed 2; at 14:13 a Code Grey in ED adult acute bed 15; at 19:16 a MET call to Ward 2H bed 7; at 19:20, four minutes later, a Code Blue to the same patient, Ward 2H bed 7; and at 21:16 a MET call to Ward 2Q bed 5. The last three fell in the evening of that shift.</w:t>
       </w:r>
     </w:p>
     <w:p>
@@ -6401,7 +6401,7 @@
           <w:sz w:val="22"/>
           <w:szCs w:val="22"/>
         </w:rPr>
-        <w:t xml:space="preserve">The codes on the shift of 18 March 2024. </w:t>
+        <w:t xml:space="preserve">The codes on 18 March 2024. </w:t>
       </w:r>
       <w:r>
         <w:rPr>
@@ -6410,7 +6410,7 @@
           <w:sz w:val="22"/>
           <w:szCs w:val="22"/>
         </w:rPr>
-        <w:t>The shift began at 06:00, seven hours after the previous one ended. [¶ 284] The register records eleven codes that day: at 8:48 a Code Grey at the QAS triage airlock; at 9:20 a MET call to Ward 6A bed 8; at 11:31 a MET call to Ward 3DR bed 14, cancelled at 11:32; at 11:35 a Neonatal MET call to Theatre 2; at 13:09 a Neonatal MET call to Birth Suites 5; at 14:38 a MET call to Ward 3DR bed 11; at 14:45 and 14:55 Code Greys at QAS triage; and at 19:15 and 19:34 Code Greys on the ED QAS ramp. Six of those fell between 06:00 and 14:00: a Code Grey, three adult MET calls (one cancelled within a minute) and two Neonatal MET calls.</w:t>
+        <w:t xml:space="preserve">The shift began at 06:00, seven hours after the previous one ended. [¶ 284] The register records eleven entries that day: at 8:48 a Code Grey at the QAS triage airlock; at 9:20 a MET call to Ward 6A bed 8; at 11:31 a MET call to Ward 3DR bed 14, cancelled at 11:32; at 11:35 a Neonatal MET call to Theatre 2; at 13:09 a Neonatal MET call to Birth Suites 5; at 14:38 a MET call to Ward 3DR bed 11; at 14:45 and 14:55 Code Greys at QAS triage; and at 19:15 and 19:34 Code Greys on the ED QAS ramp. Six of those entries fell between 06:00 and 14:00: a Code Grey, two adult MET calls, an entry cancelling the second of them a minute later, and two Neonatal MET calls.</w:t>
       </w:r>
     </w:p>
     <w:p>
@@ -6448,7 +6448,7 @@
           <w:sz w:val="22"/>
           <w:szCs w:val="22"/>
         </w:rPr>
-        <w:t xml:space="preserve">In April 2025, during the Appellant's graduated return, the console took between 269 and 444 calls on a single eight-hour shift, an average of about 360, on the monthly call statistics for that period; the highest figure, 444, was the one Monday afternoon shift in that period, 14 April 2025. On the Appellant's account the Monday early shift is the peak of the week: the weekend's backlog, the resumption of clinics and elective lists and the Monday admissions arrive at the console together. The shift of 18 March 2024 was the Monday early shift, the first shift of the working week [¶ 227], and it followed a break of seven hours. [¶ 284] The Appellant's evidence is that on that shift, after the short break, he managed the emergency codes and doctor pages through the SPOK paging system while fatigued.</w:t>
+        <w:t xml:space="preserve">In April 2025, during the Appellant's graduated return, the console took between 269 and 444 calls on a single eight-hour shift, an average of about 360, on the monthly call statistics for that period; the highest figure, 444, was the one Monday afternoon shift in that period, 14 April 2025. On the Appellant's account the Monday early shift is the peak of the week: the weekend's backlog, the resumption of clinics and elective lists and the Monday admissions arrive at the console together. The shift of 18 March 2024 was the Monday early shift [¶ 227], and it followed a break of seven hours. [¶ 284] The Appellant's evidence is that on that shift, after the short break, he managed the emergency codes and doctor pages through the SPOK paging system while fatigued.</w:t>
       </w:r>
     </w:p>
     <w:p>
@@ -6511,7 +6511,7 @@
           <w:sz w:val="22"/>
           <w:szCs w:val="22"/>
         </w:rPr>
-        <w:t>Sick leave of 7.60 hours was taken that day. [¶ 235] The register records sixteen entries on 19 March 2024: at 0:17 a MET call to Ward MIU bed 21; at 1:41 a Code Grey in ED Ambi Care; at 9:27 a Paediatric MET call to Ward CIU bed 16; at 10:28 a simulation MET call (adults) to Ward 7C bed 3; at 11:30 a MET call to Ward 2I bed 20; at 11:34 a MET call to the same patient, Ward 2I bed 20, annotated "CALLED VIA SWITRCHBOARD" [sic]; at 12:36 a MET call to Ward 2I bed 12; at 13:42 a MET call to Ward 3DR bed 11; at 16:28 a further MET call to Ward 3DR bed 11, cancelled at 16:29; at 16:48 a Code Grey in the ED mental health lounge; at 17:23 a further MET call to Ward 3DR bed 11; at 17:31 a Code Grey in ED Ambi Care room 2; at 18:45 a MET call to Ward 5B bed 7; at 21:28 a Code Grey in the ED mental health lounge; and at 22:25 a Code Grey at ED QAS triage. Six of those fell between 06:00 and 14:00: a Paediatric MET call, a simulation, and four adult MET calls. Ward 3DR bed 11, the subject of a MET call at 14:38 on the shift of 18 March, was the subject of further MET calls at 13:42, 16:28 and 17:23 on 19 March.</w:t>
+        <w:t xml:space="preserve">Sick leave of 7.60 hours was taken that day. [¶ 235] The register records sixteen entries on 19 March 2024: at 0:17 a MET call to Ward MIU bed 21; at 1:41 a Code Grey in ED Ambi Care; at 9:27 a Paediatric MET call to Ward CIU bed 16; at 10:28 a simulation MET call (adults) to Ward 7C bed 3; at 11:30 a MET call to Ward 2I bed 20; at 11:34 a MET call to the same patient, Ward 2I bed 20, annotated "CALLED VIA SWITRCHBOARD" [sic]; at 12:36 a MET call to Ward 2I bed 12; at 13:42 a MET call to Ward 3DR bed 11; at 16:28 a further MET call to Ward 3DR bed 11, cancelled at 16:29; at 16:48 a Code Grey in the ED mental health lounge; at 17:23 a further MET call to Ward 3DR bed 11; at 17:31 a Code Grey in ED Ambi Care room 2; at 18:45 a MET call to Ward 5B bed 7; at 21:28 a Code Grey in the ED mental health lounge; and at 22:25 a Code Grey at ED QAS triage. Six of those fell between 06:00 and 14:00: a Paediatric MET call, a simulation, and four adult MET calls. Ward 3DR bed 11, the subject of a MET call at 14:38 on 18 March, was the subject of further MET calls at 13:42, 16:28 and 17:23 on 19 March.</w:t>
       </w:r>
     </w:p>
     <w:p>
@@ -6833,7 +6833,7 @@
           <w:sz w:val="22"/>
           <w:szCs w:val="22"/>
         </w:rPr>
-        <w:t xml:space="preserve">On 20 May 2024 the Director sent Human Resources the Queensland Health Fatigue Risk Management Systems Implementation Guideline, qh-gdl-401-3.3. [¶¶ 222 to 223] Ten days earlier she had written that she and the Manager had run through the Roster Risk Assessment Matrix and "we say at best there would be a rating of 11 which is moderate". [¶ 219] The full guideline was disclosed with that email chain on 14 July 2025 and is identified separately in Schedule Part 2; Tab 8A is the cover page only. The following passages are from the disclosed guideline.</w:t>
+        <w:t xml:space="preserve">On 20 May 2024 the Director sent Human Resources the Queensland Health Fatigue Risk Management Systems Implementation Guideline, qh-gdl-401-3.3. [¶¶ 222 to 223] Ten days earlier she had written that she and the Manager had run through the Roster Risk Assessment Matrix and "we say at best there would be a rating of 11 which is moderate". [¶ 219] The full guideline was disclosed with that email chain on 14 July 2025 and is identified separately in Schedule Part 2; Tab 8A is the cover page only. Passages from the disclosed guideline are set out below, after the employer's statements on implementation.</w:t>
       </w:r>
     </w:p>
     <w:p>
@@ -6896,7 +6896,7 @@
           <w:sz w:val="22"/>
           <w:szCs w:val="22"/>
         </w:rPr>
-        <w:t xml:space="preserve">". [¶ 264] It stated that "there have been no 'consequential' changes to operating procedures over the period requested". [¶ 266] The Respondent does not allege that any fatigue risk assessment was conducted, that fatigue risk management training was provided, that fatigue risk management assessment was implemented at the Switchboard, or that any change was made to the operating procedures of the Switchboard as a consequence of any employee complaint, at any time before 30 June 2024. [¶¶ 269 to 272]</w:t>
+        <w:t xml:space="preserve">". [¶ 264] It stated that "there have been no 'consequential' changes to operating procedures over the period requested". [¶ 266] The Respondent does not allege that any fatigue risk assessment was conducted in respect of the Appellant's position, that fatigue risk management training was provided to the Appellant, or that fatigue risk management assessment was implemented at the Switchboard, at any time before 30 June 2024 [¶¶ 269 to 271], or that any change was made to the operating procedures of the Switchboard as a consequence of any employee complaint over the period 1 December 2023 to 30 June 2024. [¶ 272]</w:t>
       </w:r>
     </w:p>
     <w:p>
@@ -7630,7 +7630,7 @@
                 <w:sz w:val="22"/>
                 <w:szCs w:val="22"/>
               </w:rPr>
-              <w:t xml:space="preserve">MASPER Registrar's first report, 3 May 2024 at 3:06 pm, to the Manager's first reply, 9 May 2024 at 9:20 am (her second report was sent on the fifth calendar day; the reply on the sixth)</w:t>
+              <w:t xml:space="preserve">MASPER Registrar's first report, 3 May 2024 at 3:06 pm, to the Manager's reply, 9 May 2024 at 9:20 am (her second report was sent on the fifth calendar day; the reply on the sixth)</w:t>
             </w:r>
           </w:p>
         </w:tc>
@@ -10403,7 +10403,7 @@
           <w:sz w:val="22"/>
           <w:szCs w:val="22"/>
         </w:rPr>
-        <w:t>That access to the database was restored to the Appellant before 18 June 2024; that any document records consultation with Switchboard operators before the change communicated on 15 April 2024; that agreement under clause 6.2 of the Award was obtained, or a ballot conducted, before that change.</w:t>
+        <w:t xml:space="preserve">That access to the database was restored to the Appellant before 18 June 2024; that any document records consultation with Switchboard operators before the change communicated on 15 April 2024; that a ballot of affected employees was conducted before that change; that agreement under clause 6.2 of the Award was obtained before the rostering of 17 and 18 March 2024.</w:t>
       </w:r>
     </w:p>
     <w:p>
@@ -10518,7 +10518,7 @@
           <w:sz w:val="22"/>
           <w:szCs w:val="22"/>
         </w:rPr>
-        <w:t>That the Switchboard Manager got in touch with the Appellant about alternative shifts after the meeting of 16 April 2024; that the fatigue toolkit was reviewed or feedback given before 18 June 2024; that the consecutive shifts of 17 and 18 March 2024 arose from a staff-initiated shift swap; that any response was made to the fatigue enquiry between 9 April and 1 May 2024; that any fatigue risk assessment was conducted, that any fatigue risk management training was provided, or that fatigue risk management assessment was implemented at the Switchboard, before 30 June 2024; or that any change was made to the operating procedures of the Switchboard as a consequence of any employee complaint over the period 1 December 2023 to 30 June 2024.</w:t>
+        <w:t xml:space="preserve">That the Switchboard Manager got in touch with the Appellant about alternative shifts after the meeting of 16 April 2024; that the fatigue toolkit was reviewed or feedback given before 18 June 2024; that the consecutive shifts of 17 and 18 March 2024 arose from a staff-initiated shift swap; that any response was made to the fatigue enquiry between 9 April and 1 May 2024; that any fatigue risk assessment was conducted in respect of the Appellant's position, that any fatigue risk management training was provided to the Appellant, or that fatigue risk management assessment was implemented at the Switchboard, before 30 June 2024; or that any change was made to the operating procedures of the Switchboard as a consequence of any employee complaint over the period 1 December 2023 to 30 June 2024.</w:t>
       </w:r>
     </w:p>
     <w:p>
@@ -10574,7 +10574,7 @@
           <w:sz w:val="22"/>
           <w:szCs w:val="22"/>
         </w:rPr>
-        <w:t>Particulars: paragraphs 16, 21 to 22, 25, 55, 69, 73, 90, 93, 99, 105 to 110, 142, 150 to 153, 166, 180 to 181, 213, 216, 234, 250, 269 to 273, 300 to 303 of the notice to admit facts served 28 August 2026, admitted 8 September 2026. Paragraph 154 of that notice is not admitted.</w:t>
+        <w:t xml:space="preserve">Particulars: paragraphs 55, 69, 73, 90, 93, 99, 105 to 110, 142, 150 to 153, 180 to 181, 213, 216, 234, 250, 269 to 273, 300 to 303 of the notice to admit facts served 28 August 2026, admitted 8 September 2026. Paragraph 154 of that notice is not admitted.</w:t>
       </w:r>
     </w:p>
     <w:p>
@@ -10748,7 +10748,7 @@
           <w:sz w:val="22"/>
           <w:szCs w:val="22"/>
         </w:rPr>
-        <w:t xml:space="preserve">The Respondent's notified lay evidence. On 24 September 2026 the Respondent served outlines of the evidence of Ms Taylor, Ms Reese, Ms Wright and Ms Earl. An outline is not evidence; the outlines are relied on only as the Respondent's own description of the matters they concern, and the Appellant will ask each witness to confirm them. On the Respondent's own outlines: the seven-hour break was "the result of human error" and, on the advice returned within payroll, "a rostering practice issue for the line manager"; the agreement of 17 June 2020 reduced the break "from ten hours to eight", so that a seven-hour break fell below both; no fatigue-leave entitlement under clause 18.10 attached to a short break between two ordinary shifts; the second decline of the paid Special Pandemic Leave request "appears to have been made in error"; and pay corrections were the line manager's to submit. The Appellant contends that the rostering of 17 to 18 March 2024 was, on the Respondent's own description, an act of the line manager in rostering; that it is management action; and that it was not reasonable management action taken in a reasonable way, for the reasons in Stressor 3. No outline addresses the removal of database access or its restoration; the Contact &amp; Number Changes book; any consultation preceding the change notified on 15 April 2024; the reports of the MASPER Registrar of 3 and 8 May 2024; the emails of the Integrated Respiratory Service of 15 and 20 May 2024; the amendment of the clinic contact-details document; the fatigue enquiry of 8 April 2024 or the interval to 1 May 2024; the email to Human Resources of 10 May 2024; or the absence of fatigue risk management at the Switchboard before 30 June 2024. By particular, the outlines give no account of the dated events at Stressor 1(b), 1(f), 1(h) and 1(k), or at Stressor 3(e) and 3(f); nor of the internal records at Stressor 3(g) and 3(h), which are relied on only as proof of how the matters at 3(d) to 3(f) were handled. On the causal particulars, the facts are admitted, and the questions are whether each was management action, whether any management action was reasonable and taken in a reasonable way, and whether it contributed to the injury. Those matters are relied on to the extent established by the admissions; silence in an outline is not a further admission. The Respondent's list of witnesses, sent to the Registry for filing and to the Appellant on 24 September 2026, names those four witnesses, described as "lay" witnesses, and no other, and states that the Respondent "reserves its right to amend this list depending on the case presented by the appellant at the hearing". Neither the list nor the outlines names a medical or expert witness, and no expert report has been served as at 30 September 2026.</w:t>
+        <w:t xml:space="preserve">The Respondent's notified lay evidence. On 24 September 2026 the Respondent served outlines of the evidence of Ms Taylor, Ms Reese, Ms Wright and Ms Earl. An outline is not evidence; the outlines are relied on only as the Respondent's own description of the matters they concern, and the Appellant will ask each witness to confirm them. On the Respondent's own outlines: the seven-hour break was "the result of human error" and, on the advice returned within payroll, "a rostering practice issue for the line manager"; the agreement of 17 June 2020 reduced the break "from ten hours to eight", so that a seven-hour break fell below both; no fatigue-leave entitlement under clause 18.10 attached to a short break between two ordinary shifts; the second decline of the paid Special Pandemic Leave request "appears to have been made in error"; and pay corrections were the line manager's to submit. The Appellant contends that the rostering of 17 to 18 March 2024 was, on the Respondent's own description, an act of the line manager in rostering; that it is management action; and that it was not reasonable management action taken in a reasonable way, for the reasons in Stressor 3. No outline addresses the removal of database access or its restoration; the Contact &amp; Number Changes book; any consultation preceding the change notified on 15 April 2024; the reports of the MASPER Registrar of 3 and 8 May 2024; the emails of the Integrated Respiratory Service of 15 and 20 May 2024; the amendment of the clinic contact-details document; the fatigue enquiry of 8 April 2024 or the interval to 1 May 2024; the email to Human Resources of 10 May 2024; or the absence of fatigue risk management at the Switchboard before 30 June 2024. By particular, the outlines give no account of the dated events at Stressor 1(b), 1(f), 1(h) and 1(k), or at Stressor 3(e) and 3(f); nor of the internal records at Stressor 3(g) and 3(h), which are relied on only as proof of how the matters at 3(d) to 3(f) were handled. On the causal particulars, the facts are admitted, and the questions are whether each was management action, whether any management action was reasonable and taken in a reasonable way, and whether it contributed to the injury. Those matters are relied on to the extent established by the admissions; silence in an outline is not a further admission. The Respondent's list of witnesses, sent to the Registry for filing and to the Appellant on 24 September 2026, names those four witnesses, described as "lay" witnesses, and no other, and states that the Respondent "reserves its right to amend this list depending on the case presented by the appellant at the hearing". Neither the list nor the outlines name a medical or expert witness, and no expert report has been served as at 30 September 2026.</w:t>
       </w:r>
     </w:p>
     <w:p>
@@ -10934,7 +10934,7 @@
           <w:sz w:val="22"/>
           <w:szCs w:val="22"/>
         </w:rPr>
-        <w:t xml:space="preserve">The Respondent admits the contents of Review Decision 69983 and says no finding in it binds the Commission because the hearing is </w:t>
+        <w:t xml:space="preserve">The Respondent admits the contents of Review Decision 69983 and says that they are not relevant because the hearing is de novo (a fresh hearing). [¶ 295] It follows that no finding in the decision binds the Commission. That is accepted,</w:t>
       </w:r>
       <w:r>
         <w:rPr>
@@ -10943,15 +10943,15 @@
           <w:szCs w:val="22"/>
           <w:i/>
         </w:rPr>
-        <w:t xml:space="preserve">de novo</w:t>
-      </w:r>
-      <w:r>
-        <w:rPr>
-          <w:rFonts w:ascii="Times New Roman" w:hAnsi="Times New Roman" w:cs="Times New Roman"/>
-          <w:sz w:val="22"/>
-          <w:szCs w:val="22"/>
-        </w:rPr>
-        <w:t xml:space="preserve"> (a fresh hearing). [¶ 295] That is accepted, and it applies to the whole of the decision. The conclusion under appeal is a conclusion of that decision, reached on the findings recorded in it.</w:t>
+        <w:t xml:space="preserve"/>
+      </w:r>
+      <w:r>
+        <w:rPr>
+          <w:rFonts w:ascii="Times New Roman" w:hAnsi="Times New Roman" w:cs="Times New Roman"/>
+          <w:sz w:val="22"/>
+          <w:szCs w:val="22"/>
+        </w:rPr>
+        <w:t xml:space="preserve"> and it applies to the whole of the decision. The conclusion under appeal is a conclusion of that decision, reached on the findings recorded in it.</w:t>
       </w:r>
     </w:p>
     <w:p>

</xml_diff>

<commit_message>
WC/2024/227: corrected 9A second verification round (change 96)
Co-Authored-By: Claude Opus 5.5 <noreply@anthropic.com>
Claude-Session: https://claude.ai/code/session_01PbSZiMB1koFR46V5hQyVcy
</commit_message>
<xml_diff>
--- a/wc2024227/drafts/out/FILING_1OCT2026/2026-10_SECOND_AMENDED_9A_FINAL.docx
+++ b/wc2024227/drafts/out/FILING_1OCT2026/2026-10_SECOND_AMENDED_9A_FINAL.docx
@@ -117,7 +117,7 @@
           <w:sz w:val="22"/>
           <w:szCs w:val="22"/>
         </w:rPr>
-        <w:t>The injury: a psychological injury, diagnosed, with employment found by the Respondent's own review to be a significant contributing factor [¶¶ 261 to 262]. Stressor 1: a continuous 24/7 patient-safety function [¶¶ 2, 8, 289] carried on while database access was removed and not restored [¶¶ 40, 55]; process changes made effective the day they were notified, with no listed record of consultation [¶¶ 51, 181, 273]; calls misdirected and the directory not corrected [¶¶ 58, 67, 89 to 93, 109 to 110]; and the manager's fixed office hours not stated for approximately nine months [¶¶ 71 to 73]. Stressor 2: pay wrong in four fortnights [¶¶ 185 to 189]; Payroll's direction of 3 May 2024 not actioned at 13 May [¶ 193], still awaited on 21 May [¶ 195], lodged 28 May and recorded "Part Completed" [¶ 203]; and a paid leave request declined twice, with the Respondent acknowledging that attachments were present when the later decline was made [¶¶ 116, 118, 134]. Stressor 3: a seven-hour break rostered in that role [¶ 284] against a minimum of ten hours, or eight by written agreement [¶ 285], the agreement’s scope disputed by reference to the later HR email and no swap alleged [¶¶ 225, 234]; the fatigue enquiry answered after 23 days with a refusal [¶¶ 247, 249]; the employer’s statement that fatigue risk management assessment was implemented after 30 June 2024, read with the May risk-matrix discussion [¶¶ 264, 269 to 271]; and the Respondent's own review finding that the rostering was unreasonable management action [¶ 260].</w:t>
+        <w:t xml:space="preserve">The injury: a psychological injury, diagnosed, with employment found by the Respondent's own review to be a significant contributing factor [¶¶ 261 to 262]. Stressor 1: a continuous 24/7 patient-safety function [¶¶ 2, 8, 289] carried on while database access was removed and not alleged to have been restored [¶¶ 40, 55]; process changes made effective the day they were notified, with no listed record of consultation [¶¶ 51, 181, 273]; calls misdirected and the directory not corrected [¶¶ 58, 67, 89 to 93, 109 to 110]; and the manager's fixed office hours not stated for approximately nine months [¶¶ 71 to 73]. Stressor 2: pay wrong in four fortnights [¶¶ 185 to 189]; Payroll's direction of 3 May 2024 not actioned at 13 May [¶ 193], still awaited on 21 May [¶ 195], lodged 28 May and recorded "Part Completed" [¶ 203]; and a paid leave request declined twice, with the Respondent acknowledging that attachments were present when the later decline was made [¶¶ 116, 118, 134]. Stressor 3: a seven-hour break rostered in that role [¶ 284] against a minimum of ten hours, or eight by written agreement [¶ 285], the agreement’s scope disputed by reference to the later HR email and no swap alleged [¶¶ 225, 234]; the fatigue enquiry answered after 23 days with a refusal [¶¶ 247, 249]; the employer’s statement that fatigue risk management assessment was implemented after 30 June 2024, read with the May risk-matrix discussion [¶¶ 264, 269 to 271]; and the Respondent's own review finding that the rostering was unreasonable management action [¶ 260].</w:t>
       </w:r>
     </w:p>
     <w:p>
@@ -333,7 +333,7 @@
           <w:sz w:val="22"/>
           <w:szCs w:val="22"/>
         </w:rPr>
-        <w:t xml:space="preserve">At the first consultation, on the referral, the treating psychiatrist, Dr Ravikumar Bangalore Krishnaiah, told the Appellant, and confirmed in writing at 11:45 am that day, that he was "suffering from psychological injury of Major Depressive Disorder with anxiety state …"; that fluoxetine was increased to two capsules "from today" and Seroquel 25 mg commenced, at half a tablet for three nights and then one tablet at night, "to restore basic needs- sleep, eating and routine". The Appellant's email of 5:12 pm that day reads "I have finally been able to see a psychiatrist today". [Tab M3; Respondent's item 9.] Read with paragraph 1.5, it records the diagnosis made on 24 October 2024 of the condition first certified on 1 July 2024.</w:t>
+        <w:t xml:space="preserve">At the first consultation, on the referral, the treating psychiatrist, Dr Ravikumar Bangalore Krishnaiah, told the Appellant, and confirmed in writing at 11:45 am that day, that he was "suffering from psychological injury of Major Depressive Disorder with anxiety state …"; that fluoxetine was increased to two capsules "from today" and Seroquel 25 mg commenced, "to restore basic needs- sleep, eating and routine". The Appellant's email of 5:12 pm that day reads "I have finally been able to see a psychiatrist today". [Tab M3; Respondent's item 9.] Read with paragraph 1.5, it records the diagnosis made on 24 October 2024 of the condition first certified on 1 July 2024.</w:t>
       </w:r>
     </w:p>
     <w:p>
@@ -412,7 +412,7 @@
           <w:sz w:val="22"/>
           <w:szCs w:val="22"/>
         </w:rPr>
-        <w:t xml:space="preserve">". The claim was rejected under section 32(5), not section 32(1). [Tabs M6, M8 and M9.] The hearing is </w:t>
+        <w:t xml:space="preserve">". The claim was rejected under section 32(5), not section 32(1). [Tabs M2, M8 and M9.] The hearing is </w:t>
       </w:r>
       <w:r>
         <w:rPr>
@@ -468,7 +468,7 @@
           <w:sz w:val="22"/>
           <w:szCs w:val="22"/>
         </w:rPr>
-        <w:t xml:space="preserve">No medico-legal report has been prepared for this proceeding. The Appellant relies on the treating records and documents at Tabs M1 to M5 and M7 to M9 (Tab M6, the treating psychiatrist's clinical records, to be served on receipt), served with the Schedule of Medical Documents Relied Upon on 9 September 2026. He also relies on the oral evidence of the treating general practitioner, Dr Peter Hawes, and the treating psychiatrist, Dr Ravikumar Bangalore Krishnaiah. Each is named in the Appellant's list of witnesses filed 9 September 2026. Each will be asked to address, from his own records and the admitted facts put to him: the diagnosis; the history reported to him and when; whether the Appellant's employment, and in particular the matters pleaded at Stressors 1 to 3, was a significant contributing factor to the injury; and the non-employment matters recorded in the report of 13 February 2025. This paragraph gives notice of that evidence. Once hearing dates are set, the Appellant will apply for attendance notices and for leave for each practitioner to give evidence by telephone or video link at a fixed time.</w:t>
+        <w:t xml:space="preserve">No medico-legal report has been prepared for this proceeding. The Appellant relies on the treating records and documents at Tabs M1 to M5 and M7 to M9 (Tab M6 to follow), served with the Schedule of Medical Documents Relied Upon on 9 September 2026. He also relies on the oral evidence of the treating general practitioner, Dr Peter Hawes, and the treating psychiatrist, Dr Ravikumar Bangalore Krishnaiah. Each is named in the Appellant's list of witnesses filed 9 September 2026. Each will be asked to address, from his own records and the admitted facts put to him: the diagnosis; the history reported to him and when; whether the Appellant's employment, and in particular the matters pleaded at Stressors 1 to 3, was a significant contributing factor to the injury; and the non-employment matters recorded in the report of 13 February 2025. This paragraph gives notice of that evidence. Once hearing dates are set, the Appellant will apply for attendance notices and for leave for each practitioner to give evidence by telephone or video link at a fixed time.</w:t>
       </w:r>
     </w:p>
     <w:p>
@@ -744,7 +744,7 @@
                 <w:color w:val="000000"/>
                 <w:sz w:val="22"/>
               </w:rPr>
-              <w:t xml:space="preserve">Database access removed and not restored; changes to process made effective the day they were notified, with no listed record of consultation; emergency calls misdirected and a directory entry not corrected; fixed office hours not stated for approximately nine months, and the written request for them met with a request to retract. All of this in a role carrying high call volume, concurrent emergency codes and complaints arriving first at the Switchboard. Particulars 1(a) to 1(l); the causal particulars are listed below.</w:t>
+              <w:t xml:space="preserve">Database access removed; no restoration alleged; changes to process made effective the day they were notified, with no listed record of consultation; emergency calls misdirected and a directory entry not corrected; fixed office hours not stated for approximately nine months, and the written request for them met with a request to retract. All of this in a role carrying high call volume, concurrent emergency codes and complaints arriving first at the Switchboard. Particulars 1(a) to 1(l); the causal particulars are listed below.</w:t>
             </w:r>
           </w:p>
         </w:tc>
@@ -853,7 +853,7 @@
                 <w:color w:val="000000"/>
                 <w:sz w:val="22"/>
               </w:rPr>
-              <w:t xml:space="preserve">Operators' access to the database removed and not restored; corrections only through the Coordinator (Tuesdays and every second Monday) or the Manager, and after-hours requests left to wait.</w:t>
+              <w:t xml:space="preserve">Operators' access to the database removed; no restoration alleged; corrections only through the Coordinator (Tuesdays and every second Monday) or the Manager, and after-hours requests left to wait.</w:t>
             </w:r>
           </w:p>
         </w:tc>
@@ -2815,7 +2815,7 @@
                 <w:color w:val="000000"/>
                 <w:sz w:val="22"/>
               </w:rPr>
-              <w:t xml:space="preserve">The Manager asked the Appellant to sign a validation form for claims older than three months; the AVAC lodged that day was recorded "Part Completed" on 30 May.</w:t>
+              <w:t xml:space="preserve">The Manager asked the Appellant to sign a validation form for claims older than three months; the AVAC was recorded "Part Completed" on 30 May.</w:t>
             </w:r>
           </w:p>
         </w:tc>
@@ -3639,7 +3639,7 @@
           <w:sz w:val="22"/>
           <w:szCs w:val="22"/>
         </w:rPr>
-        <w:t xml:space="preserve">Emergency codes, received and paged concurrently (context). </w:t>
+        <w:t xml:space="preserve">Emergency codes, received and paged concurrently (context). The position distributes emergency notifications to the response groups by category of emergency. [¶ 8]</w:t>
       </w:r>
       <w:r>
         <w:rPr>
@@ -3648,7 +3648,7 @@
           <w:sz w:val="22"/>
           <w:szCs w:val="22"/>
         </w:rPr>
-        <w:t xml:space="preserve">The position receives emergency response notifications and distributes them to the appropriate response groups, dependent on the category of emergency, as per emergency code procedures, strictly adhering to protocols and timeframes. [¶ 8] The Appellant's evidence is that each code was paged at the same time to a response team of about ten clinicians through the SPOK paging system; that codes and other urgent matters did not arrive one at a time, so that he managed concurrent emergency and security responses and time-critical clinical calls while continuing to manage the call queue; and that the number of codes varied from day to day. The Emergency Code Register records eight entries on 17 March 2024, eleven on 18 March and sixteen on 19 March (Stressor 3(b) and 3(c); Tab 31).</w:t>
+        <w:t xml:space="preserve"> The Appellant's evidence is that each code was paged at the same time to a response team of about ten clinicians through the SPOK paging system; that codes and other urgent matters did not arrive one at a time, so that he managed concurrent emergency and security responses and time-critical clinical calls while continuing to manage the call queue; and that the number of codes varied from day to day. The Emergency Code Register records eight entries on 17 March 2024, eleven on 18 March and sixteen on 19 March (Stressor 3(b) and 3(c); Tab 31).</w:t>
       </w:r>
     </w:p>
     <w:p>
@@ -3724,7 +3724,7 @@
           <w:sz w:val="22"/>
           <w:szCs w:val="22"/>
         </w:rPr>
-        <w:t xml:space="preserve">The Respondent does not allege that a ballot of affected employees was conducted before it. [¶ 181] Nor does it allege that agreement under clause 6.2 of the Award was obtained before the rostering of the Appellant's shifts on 17 and 18 March 2024 (Stressor 3(b)). [¶ 180]</w:t>
+        <w:t xml:space="preserve">The Respondent does not allege that a ballot of affected employees was conducted before it. [¶ 181] Nor does it allege clause 6.2 agreement before the roster of 17 and 18 March 2024. [¶ 180]</w:t>
       </w:r>
     </w:p>
     <w:p>
@@ -3856,7 +3856,7 @@
           <w:sz w:val="22"/>
           <w:szCs w:val="22"/>
         </w:rPr>
-        <w:t>The Respondent does not identify the entry removed or its author, does not allege that the removed page has been located or that any copy exists, does not allege that any entry made by the Appellant remains in the book, and does not allege that the book ceased to be in its possession during his employment. [¶¶ 150 to 153]</w:t>
+        <w:t xml:space="preserve">The Respondent does not identify the entry removed or its author, does not allege that the removed page has been located or that any copy exists, does not allege that any entry made by the Appellant remains in the book, and does not allege that the book ceased to be in the possession of Metro South Health during his employment. [¶¶ 150 to 153]</w:t>
       </w:r>
     </w:p>
     <w:p>
@@ -4205,7 +4205,7 @@
           <w:sz w:val="22"/>
           <w:szCs w:val="22"/>
         </w:rPr>
-        <w:t xml:space="preserve">The Respondent does not allege that fixed office hours were stated to the Switchboard staff at any time between 23 August 2023 and 17 May 2024. </w:t>
+        <w:t xml:space="preserve">The Respondent does not allege that the Manager stated fixed office hours to the Switchboard staff at any time between 23 August 2023 and 17 May 2024. </w:t>
       </w:r>
       <w:r>
         <w:rPr>
@@ -4646,7 +4646,7 @@
           <w:sz w:val="22"/>
           <w:szCs w:val="22"/>
         </w:rPr>
-        <w:t>The Respondent does not allege that the Appellant was informed before 14 May 2024 that any other means of notification was required. [¶ 166]</w:t>
+        <w:t xml:space="preserve">The Respondent does not allege that the Appellant was informed before 14 May 2024 that telephoning the Switchboard did not comply. [¶ 166]</w:t>
       </w:r>
     </w:p>
     <w:p>
@@ -5365,7 +5365,7 @@
           <w:sz w:val="22"/>
           <w:szCs w:val="22"/>
         </w:rPr>
-        <w:t xml:space="preserve">The Appellant raised the pay for the period 8 to 31 March 2024 with the Manager on 8 April 2024. [¶ 242] On 9 April she replied that she had escalated the fatigue enquiry to Human Resources. [¶ 244] On 24 April he wrote that it had been more than two weeks without any response or overtime payment. [¶ 246] On 1 May she replied that the fatigue payment for 18 March would not be processed [¶ 247]; the review decision records that payroll was, as at 1 May 2024, still reviewing his public holiday entitlements. [¶ 255]</w:t>
+        <w:t xml:space="preserve">The Appellant raised the pay for the period 8 to 31 March 2024 with the Manager on 8 April 2024. [¶ 242] On 9 April she replied that she had escalated the fatigue enquiry to Human Resources. [¶ 244] On 24 April he wrote that it had been more than two weeks without any response or overtime payment. [¶ 246] On 1 May she replied that the fatigue payment for 18 March would not be processed. [¶ 247]</w:t>
       </w:r>
     </w:p>
     <w:p>
@@ -5389,7 +5389,7 @@
           <w:sz w:val="22"/>
           <w:szCs w:val="22"/>
         </w:rPr>
-        <w:t>The review decision records that section 23 of the Award provides that where an employee in receipt of the additional week's leave prescribed by clause 19.2(a) is rostered off on Easter Saturday, Easter Sunday, Show Day or Labour Day, that employee is to be paid an additional day's wage or granted a day's holiday in lieu. [¶ 241] As at 1 May 2024 payroll was "still reviewing your entitlements regarding public holidays not required arising while you were a part-time employee". [¶ 255] The Manager confirmed "that since your commencement of full-time employment, all payments for public holidays not required had been processed". [¶ 256]</w:t>
+        <w:t xml:space="preserve">The review decision records that section 23 of the Award provides that where an employee in receipt of the additional week's leave prescribed by clause 19.2(a) is rostered off on Easter Saturday, Easter Sunday, Show Day or Labour Day, that employee is to be paid an additional day's wage or granted a day's holiday in lieu. [¶ 241] The review decision records that, as at 1 May 2024, payroll was "still reviewing your entitlements regarding public holidays not required arising while you were a part-time employee". [¶ 255] The Manager confirmed "that since your commencement of full-time employment, all payments for public holidays not required had been processed". [¶ 256]</w:t>
       </w:r>
     </w:p>
     <w:p>
@@ -6192,7 +6192,7 @@
           <w:sz w:val="22"/>
           <w:szCs w:val="22"/>
         </w:rPr>
-        <w:t xml:space="preserve">The position receives emergency response notifications and distributes them to the appropriate response groups, dependent on the category of emergency, as per emergency code procedures, strictly adhering to protocols and timeframes. [¶ 8] A Code Blue is the call for a medical emergency in which a patient has suffered, or is about to suffer, cardiac or respiratory arrest, and brings the resuscitation team. A MET call is the call for the Medical Emergency Team to a patient whose observations have deteriorated to the hospital's escalation threshold; a Neonatal MET call and a Paediatric MET call are the same call for a newborn and for a child. A Code Grey is the call for a security response to threatening or aggressive behaviour; a Code Black is the call for a security response to a personal threat. The colour codes follow the Australian Standard for emergency control in health care facilities, AS 4083. Queensland Health's own Code Blue procedure for the Royal Brisbane and Women's Hospital (Procedure 001443, version 5, effective April 2020) states that "there are eight different types of Code Blue", including Medical Emergency, Cardiac Arrest, Neonatal Emergency, and Paediatric Emergency or Paediatric Cardiac Arrest; that "Switchboard Services will activate one or multiple teams to provide a Code Blue response"; and that the response team "will be notified by a paging system from Switchboard Services… identifying the type of Code Blue and the location of the emergency". The Logan Hospital emergency code procedures referred to in the role description [¶ 8] are the equivalent document for Logan Hospital (Schedule, Part 2).</w:t>
+        <w:t xml:space="preserve">A Code Blue is the call for a medical emergency in which a patient has suffered, or is about to suffer, cardiac or respiratory arrest, and brings the resuscitation team. A MET call is the call for the Medical Emergency Team to a patient whose observations have deteriorated to the hospital's escalation threshold; a Neonatal MET call and a Paediatric MET call are the same call for a newborn and for a child. A Code Grey is the call for a security response to threatening or aggressive behaviour; a Code Black is the call for a security response to a personal threat. The colour codes follow the Australian Standard for emergency control in health care facilities, AS 4083. Queensland Health's own Code Blue procedure for the Royal Brisbane and Women's Hospital (Procedure 001443, version 5, effective April 2020) states that "there are eight different types of Code Blue", including Medical Emergency, Cardiac Arrest, Neonatal Emergency, and Paediatric Emergency or Paediatric Cardiac Arrest; that "Switchboard Services will activate one or multiple teams to provide a Code Blue response"; and that the response team "will be notified by a paging system from Switchboard Services… identifying the type of Code Blue and the location of the emergency". The Logan Hospital emergency code procedures referred to in the role description [¶ 8] are the equivalent document for Logan Hospital (Schedule, Part 2).</w:t>
       </w:r>
     </w:p>
     <w:p>
@@ -6636,7 +6636,7 @@
           <w:sz w:val="22"/>
           <w:szCs w:val="22"/>
         </w:rPr>
-        <w:t xml:space="preserve">. In between were the acknowledgment of 9 April, the escalation to Human Resources, and the Appellant's email of 24 April; no other response is alleged. [¶¶ 242 to 250] So the day after the consecutive shifts was recorded against the Appellant's own sick leave [¶ 235], and the Respondent says no fatigue leave was due for it [¶¶ 236 to 237]. The refusal relied on an agreement signed at a time the Respondent does not allege the Manager held that role, and never reviewed; the Respondent does not allege that he was told, before that day, that he could end it "going forward". [¶¶ 21 to 22, 25, 242 to 250]</w:t>
+        <w:t xml:space="preserve">. In between were the acknowledgment of 9 April, the escalation to Human Resources, and the Appellant's email of 24 April; no other response is alleged. [¶¶ 242 to 250] So the day after the consecutive shifts was recorded against the Appellant's own sick leave [¶ 235], and the Respondent says no fatigue leave was due for it [¶¶ 236 to 237]. The refusal relied on an agreement signed at a time the Respondent does not allege the Manager held that role, and not alleged to have been reviewed before 18 March 2024; the Respondent does not allege that he was told, before that day, that he could end it "going forward". [¶¶ 21 to 22, 25, 242 to 250]</w:t>
       </w:r>
     </w:p>
     <w:p>
@@ -6712,7 +6712,7 @@
           <w:sz w:val="22"/>
           <w:szCs w:val="22"/>
         </w:rPr>
-        <w:t>The Respondent does not allege that the toolkit was reviewed or that any feedback was provided before 18 June 2024. [¶ 216]</w:t>
+        <w:t xml:space="preserve">The Respondent does not allege that the Manager reviewed the toolkit or provided any feedback on it before 18 June 2024. [¶ 216]</w:t>
       </w:r>
     </w:p>
     <w:p>
@@ -6966,7 +6966,7 @@
           <w:sz w:val="22"/>
           <w:szCs w:val="22"/>
         </w:rPr>
-        <w:t xml:space="preserve">So the guideline treated the Award under which the Appellant was employed as a supporting document. It treated every employee of a Hospital and Health Service as a worker to whom it applied. It called for consultation with workers on fatigue hazards, and for training of rostering staff and managers. A resource pack had preceded it since December 2018. It is the guideline the Director sent to Human Resources on 20 May 2024 [¶¶ 222 to 223], ten days after she and the Manager had assessed the fatigue risk of the Appellant's roster as moderate [¶ 219]; the Chief Executive's letter states that fatigue risk management assessment at the Switchboard was implemented only "after 30 June 2024" and that the mandatory training "only applies to health practitioners and clinical assistants". [¶¶ 264 to 265] The Respondent does not allege that any fatigue risk management training was provided to the Appellant, or that any fatigue risk assessment of his position was conducted, before 30 June 2024. [¶¶ 269 to 270]</w:t>
+        <w:t xml:space="preserve">So the guideline treated the Award under which the Appellant was employed as a supporting document. It treated every employee of a Hospital and Health Service as a worker to whom it applied. It called for consultation with workers on fatigue hazards, and for training of rostering staff and managers. A resource pack had preceded it since December 2018. It is the guideline the Director sent to Human Resources on 20 May 2024 [¶¶ 222 to 223], ten days after she and the Manager had assessed the fatigue risk of the Appellant's roster as moderate [¶ 219]; the Chief Executive's letter states that fatigue risk management assessment at the Switchboard was implemented "after 30 June 2024" and that the mandatory training "only applies to health practitioners and clinical assistants". [¶¶ 264 to 265] The Respondent does not allege that any fatigue risk management training was provided to the Appellant, or that any fatigue risk assessment of his position was conducted, before 30 June 2024. [¶¶ 269 to 270]</w:t>
       </w:r>
     </w:p>
     <w:p>
@@ -10426,7 +10426,7 @@
           <w:sz w:val="22"/>
           <w:szCs w:val="22"/>
         </w:rPr>
-        <w:t>That any communication was sent to Logan Switch or the Switchboard staff about the occasions reported on 3 and 8 May 2024 before 10:15 am on 9 May 2024; that any response was made to the Integrated Respiratory Service before 20 May 2024, or before 2:05 pm on that day; that any document created on 20 May 2024 records the discussion referred to in the reply of that afternoon; that any communication was sent by either named person to that Service on that day; that the contact-details document was amended on or before 20 May 2024; that the Switchboard staff were notified of the modifications made to it on 22 February 2024; or that the Appellant was rostered to work after 2:05 pm on 20 May 2024.</w:t>
+        <w:t xml:space="preserve">That any communication was sent to Logan Switch or the Switchboard staff about the occasions reported on 3 and 8 May 2024 before 10:15 am on 9 May 2024; that any response was made to the Service's email of 15 May 2024 before 20 May 2024, or to its email of 20 May 2024 before 2:05 pm on that day; that any document created on 20 May 2024 records the discussion referred to in the reply of that afternoon; that any communication was sent by either named person to that Service on that day; that the contact-details document was amended on or before 20 May 2024; that the Switchboard staff were notified of the modifications made to it on 22 February 2024; or that the Appellant was rostered to work after 2:05 pm on 20 May 2024.</w:t>
       </w:r>
     </w:p>
     <w:p>
@@ -10441,15 +10441,15 @@
           <w:sz w:val="22"/>
           <w:szCs w:val="22"/>
         </w:rPr>
-        <w:t xml:space="preserve">5.3 As to the office hours. </w:t>
-      </w:r>
-      <w:r>
-        <w:rPr>
-          <w:rFonts w:ascii="Times New Roman" w:hAnsi="Times New Roman" w:cs="Times New Roman"/>
-          <w:sz w:val="22"/>
-          <w:szCs w:val="22"/>
-        </w:rPr>
-        <w:t>That fixed office hours were stated to the Switchboard staff at any time between 23 August 2023 and 17 May 2024.</w:t>
+        <w:t xml:space="preserve">5.3 As to the office hours. That the Manager stated fixed office hours to the Switchboard staff</w:t>
+      </w:r>
+      <w:r>
+        <w:rPr>
+          <w:rFonts w:ascii="Times New Roman" w:hAnsi="Times New Roman" w:cs="Times New Roman"/>
+          <w:sz w:val="22"/>
+          <w:szCs w:val="22"/>
+        </w:rPr>
+        <w:t xml:space="preserve"> at any time between 23 August 2023 and 17 May 2024.</w:t>
       </w:r>
     </w:p>
     <w:p>
@@ -10518,7 +10518,7 @@
           <w:sz w:val="22"/>
           <w:szCs w:val="22"/>
         </w:rPr>
-        <w:t xml:space="preserve">That the Switchboard Manager got in touch with the Appellant about alternative shifts after the meeting of 16 April 2024; that the fatigue toolkit was reviewed or feedback given before 18 June 2024; that the consecutive shifts of 17 and 18 March 2024 arose from a staff-initiated shift swap; that any response was made to the fatigue enquiry between 9 April and 1 May 2024; that any fatigue risk assessment was conducted in respect of the Appellant's position, that any fatigue risk management training was provided to the Appellant, or that fatigue risk management assessment was implemented at the Switchboard, before 30 June 2024; or that any change was made to the operating procedures of the Switchboard as a consequence of any employee complaint over the period 1 December 2023 to 30 June 2024.</w:t>
+        <w:t xml:space="preserve">That the Switchboard Manager got in touch with the Appellant about alternative shifts after the meeting of 16 April 2024; that the Manager reviewed the fatigue toolkit or gave feedback on it before 18 June 2024; that the consecutive shifts of 17 and 18 March 2024 arose from a staff-initiated shift swap; that any response was made to the fatigue enquiry between 9 April and 1 May 2024; that any fatigue risk assessment was conducted in respect of the Appellant's position, that any fatigue risk management training was provided to the Appellant, or that fatigue risk management assessment was implemented at the Switchboard, before 30 June 2024; or that any change was made to the operating procedures of the Switchboard as a consequence of any employee complaint over the period 1 December 2023 to 30 June 2024.</w:t>
       </w:r>
     </w:p>
     <w:p>
@@ -10654,7 +10654,7 @@
           <w:sz w:val="22"/>
           <w:szCs w:val="22"/>
         </w:rPr>
-        <w:t>The admitted record is the factual basis for that assessment. The Appellant does not ask the Commission to find conduct unreasonable from labels alone. The Respondent has admitted, to the extent recorded in its response of 8 September 2026, the facts drawn from the documents set out in Part B. They include: that database access was removed and is not alleged to have been restored before 18 June 2024; that no document records consultation with Switchboard operators before the 15 April 2024 change; that the first report of calls reaching the wrong medical team came nearly six days before the first identified communication to Switchboard staff about them; that the record of 20 May 2024 contains the gaps identified at Stressor 1(k); and that the employer's letter of 5 June 2026 states that the identified fatigue records do not exist, that the mandatory training applied only to health practitioners and clinical assistants, that fatigue assessment at the Switchboard began after 30 June 2024, and that there were no consequential changes to operating procedures over the period requested.</w:t>
+        <w:t xml:space="preserve">The admitted record is the factual basis for that assessment. The Appellant does not ask the Commission to find conduct unreasonable from labels alone. The Respondent has admitted, to the extent recorded in its response of 8 September 2026, the facts drawn from the documents set out in Part B. They include: that database access was removed and is not alleged to have been restored before 18 June 2024; that its List of Documents lists no document recording consultation with Switchboard operators before the 15 April 2024 change; that the first report of calls reaching the wrong medical team came nearly six days before the first identified communication to Switchboard staff about them; that the record of 20 May 2024 contains the gaps identified at Stressor 1(k); and that the employer's letter of 5 June 2026 states that the identified fatigue records do not exist, that the mandatory training applied only to health practitioners and clinical assistants, that fatigue assessment at the Switchboard began after 30 June 2024, and that there were no consequential changes to operating procedures over the period requested.</w:t>
       </w:r>
     </w:p>
     <w:p>
@@ -10934,7 +10934,7 @@
           <w:sz w:val="22"/>
           <w:szCs w:val="22"/>
         </w:rPr>
-        <w:t xml:space="preserve">The Respondent admits the contents of Review Decision 69983 and says that they are not relevant because the hearing is de novo (a fresh hearing). [¶ 295] It follows that no finding in the decision binds the Commission. That is accepted,</w:t>
+        <w:t xml:space="preserve">The Respondent admits the contents of Review Decision 69983 and says that this fact is not relevant because the hearing is de novo (a fresh hearing). [¶ 295] It follows that no finding in the decision binds the Commission. That is accepted,</w:t>
       </w:r>
       <w:r>
         <w:rPr>

</xml_diff>

<commit_message>
WC/2024/227: corrected 9A third verification round (change 97)
Co-Authored-By: Claude Opus 5.5 <noreply@anthropic.com>
Claude-Session: https://claude.ai/code/session_01PbSZiMB1koFR46V5hQyVcy
</commit_message>
<xml_diff>
--- a/wc2024227/drafts/out/FILING_1OCT2026/2026-10_SECOND_AMENDED_9A_FINAL.docx
+++ b/wc2024227/drafts/out/FILING_1OCT2026/2026-10_SECOND_AMENDED_9A_FINAL.docx
@@ -117,7 +117,7 @@
           <w:sz w:val="22"/>
           <w:szCs w:val="22"/>
         </w:rPr>
-        <w:t xml:space="preserve">The injury: a psychological injury, diagnosed, with employment found by the Respondent's own review to be a significant contributing factor [¶¶ 261 to 262]. Stressor 1: a continuous 24/7 patient-safety function [¶¶ 2, 8, 289] carried on while database access was removed and not alleged to have been restored [¶¶ 40, 55]; process changes made effective the day they were notified, with no listed record of consultation [¶¶ 51, 181, 273]; calls misdirected and the directory not corrected [¶¶ 58, 67, 89 to 93, 109 to 110]; and the manager's fixed office hours not stated for approximately nine months [¶¶ 71 to 73]. Stressor 2: pay wrong in four fortnights [¶¶ 185 to 189]; Payroll's direction of 3 May 2024 not actioned at 13 May [¶ 193], still awaited on 21 May [¶ 195], lodged 28 May and recorded "Part Completed" [¶ 203]; and a paid leave request declined twice, with the Respondent acknowledging that attachments were present when the later decline was made [¶¶ 116, 118, 134]. Stressor 3: a seven-hour break rostered in that role [¶ 284] against a minimum of ten hours, or eight by written agreement [¶ 285], the agreement’s scope disputed by reference to the later HR email and no swap alleged [¶¶ 225, 234]; the fatigue enquiry answered after 23 days with a refusal [¶¶ 247, 249]; the employer’s statement that fatigue risk management assessment was implemented after 30 June 2024, read with the May risk-matrix discussion [¶¶ 264, 269 to 271]; and the Respondent's own review finding that the rostering was unreasonable management action [¶ 260].</w:t>
+        <w:t xml:space="preserve">The injury: a psychological injury, diagnosed, with employment found by the Respondent's own review to be a significant contributing factor [¶¶ 261 to 262]. Stressor 1: a continuous 24/7 patient-safety function [¶¶ 2, 8, 289] carried on while database access was removed and not alleged to have been restored [¶¶ 40, 55]; the 15 April 2024 process change made effective the day it was notified, with no listed record of consultation [¶¶ 51, 181, 273]; calls misdirected and the directory not corrected [¶¶ 58, 67, 89 to 93, 109 to 110]; and the manager's fixed office hours not stated for approximately nine months [¶¶ 71 to 73]. Stressor 2: pay wrong in four fortnights [¶¶ 185 to 189]; Payroll's direction of 3 May 2024 not actioned at 13 May [¶ 193], still awaited on 21 May [¶ 195], lodged 28 May and recorded "Part Completed" [¶ 203]; and a paid leave request declined twice, with the Respondent acknowledging that the attachments were present [¶¶ 116, 118, 134]. Stressor 3: a seven-hour break rostered in that role [¶ 284] against a minimum of ten hours, or eight by written agreement [¶ 285], the agreement’s scope disputed by reference to the later HR email and no swap alleged [¶¶ 225, 234]; the fatigue enquiry answered after 23 days with a refusal [¶¶ 247, 249]; the employer’s statement that fatigue risk management assessment was implemented after 30 June 2024, read with the May risk-matrix discussion [¶¶ 219, 264, 269 to 271]; and the Respondent's own review finding that the rostering was unreasonable management action [¶ 260].</w:t>
       </w:r>
     </w:p>
     <w:p>
@@ -147,7 +147,7 @@
           <w:sz w:val="22"/>
           <w:szCs w:val="22"/>
         </w:rPr>
-        <w:t xml:space="preserve">Each fact set out below that carries a paragraph number in square brackets was admitted by the Respondent, to the extent recorded in its response of 8 September 2026. A statement without a bracket is drawn from a document identified in the Schedule of Documents enclosed with the Appellant's letter of 1 October 2026 (the Schedule) or is the Appellant's own evidence; the register at Tab 31, the call statistics, the account of the operating conditions in Stressor 1 and the account of travel and sleep in Stressor 3 are of that kind, and facts 228 to 231 were not admitted. The Commission is asked to decide from the admitted facts what the circumstances were, whether they were reasonable, and how much they contributed to the injury.</w:t>
+        <w:t xml:space="preserve">Each fact set out below that carries a paragraph number in square brackets was admitted by the Respondent, to the extent recorded in its response of 8 September 2026. A statement without a bracket is drawn from a document identified in the Schedule of Documents enclosed with the Appellant's letter of 1 October 2026 (the Schedule) or is the Appellant's own evidence; the register at Tab 31, the call statistics, the account of the operating conditions in Stressor 1 and the account of travel and sleep in Stressor 3 are of that kind, and facts 154 and 228 to 231 were not admitted. The Commission is asked to decide from the admitted facts what the circumstances were, whether they were reasonable, and how much they contributed to the injury.</w:t>
       </w:r>
     </w:p>
     <w:p>
@@ -224,7 +224,7 @@
           <w:sz w:val="22"/>
           <w:szCs w:val="22"/>
         </w:rPr>
-        <w:t>Before 18 June 2024 the Appellant had not been diagnosed with or treated for depression. The general-practice record of 16 November 2023 (Dr Nanayakkara) records poor sleep with shift work, that the Appellant could not do shifts without a good sleep, "No psychological illness such as depression/ psychosis", and mood good, with melatonin and temazepam prescribed that day. [Tab M1 - general-practice records, Our Medical Ashmore, 1 January 2023 to 1 July 2024, obtained by the Respondent under the Form 29 signed 4 July 2025; Respondent's item 11.] This record is relied on because it shows, before any claim or proceeding, that shift work was affecting the Appellant's sleep, and what was prescribed for it. What it means clinically is a matter for the treating doctors. Private entries unrelated to the injury are redacted on the extracted pages and marked as such. The records show no diagnosis of, or treatment for, a depressive disorder before June 2024. No medication for mental health was current in May 2024 (paragraph 1.3). On the same records the Respondent's own review found that employment was a significant contributing factor to the injury (paragraph 1.8).</w:t>
+        <w:t xml:space="preserve">Before 18 June 2024 the Appellant had not been diagnosed with or treated for depression. The general-practice record of 16 November 2023 (Dr Nanayakkara) records poor sleep with shift work, that the Appellant could not do shifts without a good sleep, "No psycological [sic] illness such as depression/ psycosis [sic]", and mood good, with melatonin and temazepam prescribed that day. [Tab M1 - general-practice records, Our Medical Ashmore, 1 January 2023 to 1 July 2024, obtained by the Respondent under the Form 29 signed 4 July 2025; Respondent's item 11.] This record is relied on because it shows, before any claim or proceeding, that shift work was affecting the Appellant's sleep, and what was prescribed for it. What it means clinically is a matter for the treating doctors. Private entries unrelated to the injury are redacted on the extracted pages and marked as such. The records show no diagnosis of, or treatment for, a depressive disorder before June 2024. No medication for mental health was current in May 2024 (paragraph 1.3). On the same records the Respondent's own review found that employment was a significant contributing factor to the injury (paragraph 1.8).</w:t>
       </w:r>
     </w:p>
     <w:p>
@@ -248,7 +248,7 @@
           <w:sz w:val="22"/>
           <w:szCs w:val="22"/>
         </w:rPr>
-        <w:t>The referral letter of 16 May 2024 (Dr Zhao) referred the Appellant to a psychiatrist, Dr Amini, for "ongoing care and management". It lists the past medical history as the history-list items "26/10/2022 ADHD" and "26/10/2022 Anxiety". It lists the medications then current; they include no antidepressant, no anti-anxiety medication and no other medication for mental health. [Tab M1.] No appointment with the psychiatrist was obtained on that referral. The referral was made the day after the request to retract at Stressor 1(l). [¶¶ 76 to 77]</w:t>
+        <w:t xml:space="preserve">The referral letter of 16 May 2024 (Dr Zhao) renewed the Appellant's referral to a psychiatrist, Dr Amini, for "ongoing care and management". Its past medical history includes the history-list items "26/10/2022 ADHD" and "26/10/2022 Anxiety". It lists the medications then current; they include no antidepressant, no anti-anxiety medication and no other medication for mental health. [Tab M1.] No appointment with the psychiatrist was obtained on that referral. The referral was renewed the day after the request to retract at Stressor 1(l). [¶¶ 76 to 77]</w:t>
       </w:r>
     </w:p>
     <w:p>
@@ -310,7 +310,7 @@
           <w:sz w:val="22"/>
           <w:szCs w:val="22"/>
         </w:rPr>
-        <w:t>The work capacity certificates of Dr Hawes dated 1 July, 11 August and 8 September 2024, and of Dr Ki Pang dated 7 August 2024, state the date of injury as 18 June 2024, that the Appellant was first seen for this injury on 1 July 2024, and certify no functional capacity continuously from 1 July to 6 October 2024. The referral to a psychiatrist is recorded on the certificate of 8 September 2024. Review Decision 69983 records at page 17 that the certificate of 1 July 2024 indicated "there was no pre-existing factor or condition", and that "This was maintained in all later work capacity certificates". [Tab M2; Respondent's items 7 and 8.] The medication box is unticked on each certificate.</w:t>
+        <w:t xml:space="preserve">The work capacity certificates of Dr Hawes dated 1 July, 11 August and 8 September 2024, and of Dr Ki Pang dated 7 August 2024, state the date of injury as 18 June 2024, that the Appellant was first seen for this injury on 1 July 2024, and certify no functional capacity continuously from 1 July to 6 October 2024. The referral to a psychiatrist is recorded on the certificate of 8 September 2024. Review Decision 69983 records at page 17 that the certificate of 1 July 2024 indicated "there was no pre-existing factor or condition", and that "This was maintained in all later work capacity certificates". [Tabs M1, M2 and M8; Respondent's items 7 and 8.] The medication box is unticked on each certificate.</w:t>
       </w:r>
     </w:p>
     <w:p>
@@ -744,7 +744,7 @@
                 <w:color w:val="000000"/>
                 <w:sz w:val="22"/>
               </w:rPr>
-              <w:t xml:space="preserve">Database access removed; no restoration alleged; changes to process made effective the day they were notified, with no listed record of consultation; emergency calls misdirected and a directory entry not corrected; fixed office hours not stated for approximately nine months, and the written request for them met with a request to retract. All of this in a role carrying high call volume, concurrent emergency codes and complaints arriving first at the Switchboard. Particulars 1(a) to 1(l); the causal particulars are listed below.</w:t>
+              <w:t xml:space="preserve">Database access removed; no restoration alleged; the 15 April 2024 process change made effective the day it was notified, with no listed record of consultation; emergency calls misdirected and a directory entry not corrected; fixed office hours not stated for approximately nine months, and the written request for them met with a request to retract. All of this in a role carrying high call volume, concurrent emergency codes and complaints arriving first at the Switchboard. Particulars 1(a) to 1(l); the causal particulars are listed below.</w:t>
             </w:r>
           </w:p>
         </w:tc>
@@ -2924,7 +2924,7 @@
                 <w:color w:val="000000"/>
                 <w:sz w:val="22"/>
               </w:rPr>
-              <w:t xml:space="preserve">A seven-hour break rostered in that role against a minimum of ten hours, or eight by written agreement, with no staff-initiated swap alleged; sick leave the next day; the fatigue enquiry answered after 23 days with a refusal; the fatigue toolkit raised without feedback; no fatigue risk management at the Switchboard before 30 June 2024; and the Respondent's own review finding that the rostering was unreasonable management action. Particulars 3(a) to 3(h); the causal particulars are listed below.</w:t>
+              <w:t xml:space="preserve">A seven-hour break rostered in that role against a minimum of ten hours, or eight by written agreement, with no staff-initiated swap alleged; sick leave the next day; the fatigue enquiry answered after 23 days with a refusal; the fatigue toolkit raised without feedback; fatigue risk management assessment at the Switchboard implemented only after 30 June 2024; and the Respondent's own review finding that the rostering was unreasonable management action. Particulars 3(a) to 3(h); the causal particulars are listed below.</w:t>
             </w:r>
           </w:p>
         </w:tc>
@@ -3870,7 +3870,7 @@
           <w:sz w:val="22"/>
           <w:szCs w:val="22"/>
         </w:rPr>
-        <w:t>The Respondent has admitted that it does not have a copy of the removed page. [¶ 288] The Respondent's amended List of Documents of 14 August 2026 does not list the Communication Book, nor any page or entry from it; that proposition (paragraph 154 of the notice) was not admitted.</w:t>
+        <w:t xml:space="preserve">The Respondent has admitted that it does not have a copy of the removed page. [¶ 288] The Appellant says that the Respondent's amended List of Documents of 14 August 2026 does not list the Communication Book; that proposition (paragraph 154 of the notice) was not admitted.</w:t>
       </w:r>
     </w:p>
     <w:p>
@@ -4799,7 +4799,7 @@
           <w:sz w:val="22"/>
           <w:szCs w:val="22"/>
         </w:rPr>
-        <w:t xml:space="preserve">So the sequence was: the Service's first email on 15 May 2024; its second on 20 May, the fifth calendar day; the Appellant's escalation five days, two hours and eighteen minutes after the first email and three hours and two minutes after the second; and the Manager's reply two hours and twenty-five minutes after that, two hours after the office hours she had stated had ended. In that time the Respondent alleges no response to the Service, no amendment of the document, and no notice to the staff of the change made to it on 22 February 2024. [¶¶ 90, 93, 97 to 98, 102 to 103, 105 to 110]</w:t>
+        <w:t xml:space="preserve">So the sequence was: the Service's first email on 15 May 2024; its second on 20 May, the fifth calendar day; the Appellant's escalation five days, two hours and eighteen minutes after the first email and three hours and two minutes after the second; and the Manager's reply two hours and twenty-five minutes after that, two hours after the office hours she had stated had ended. The Respondent alleges no response to the Service before the escalation, and no amendment of the document, or notice to the staff of the change made to it on 22 February 2024, on or before 20 May 2024. [¶¶ 90, 93, 97 to 98, 102 to 103, 105 to 110]</w:t>
       </w:r>
     </w:p>
     <w:p>
@@ -5094,7 +5094,7 @@
           <w:sz w:val="22"/>
           <w:szCs w:val="22"/>
         </w:rPr>
-        <w:t xml:space="preserve">Tab M1 records the 28 June 2024 presentation as "stress at work" and "upset by people not following rules". Review Decision 69983 (Tab 25; Tab M8) records that WorkCover spoke with Dr Hawes on 2 September 2024 and that he opined that the injury was caused by, among other things, "management failing to follow rules"; it records "Non-adherence to rules by management" among the factors "identified by your doctor as medically causative". Tab M4 records the treating psychiatrist's later account of origin as workplace stress involving management and rostering. Those records are relied on as evidence, made at the time and by the treating doctors, of what was reported, the diagnosis and the effect. They are not relied on to prove that the events in Stressor 1 happened. Those events are proved, so far as they are relied on here, by the admitted facts and the employer documents identified.</w:t>
+        <w:t xml:space="preserve">Tab M1 records the 28 June 2024 presentation as "stress at work" and "upset by people not following rules". Review Decision 69983 (Tab 25) records that WorkCover spoke with Dr Hawes on 2 September 2024 and that he opined that the injury was caused by, among other things, "management failing to follow rules"; it records "Non-adherence to rules by management" among the factors "identified by your doctor as medically causative". Tab M4 records the treating psychiatrist's later account of origin as workplace stress involving management and rostering. Those records are relied on as evidence, made at the time and by the treating doctors, of what was reported, the diagnosis and the effect. They are not relied on to prove that the events in Stressor 1 happened. Those events are proved, so far as they are relied on here, by the admitted facts and the employer documents identified.</w:t>
       </w:r>
     </w:p>
     <w:p>
@@ -5389,7 +5389,7 @@
           <w:sz w:val="22"/>
           <w:szCs w:val="22"/>
         </w:rPr>
-        <w:t xml:space="preserve">The review decision records that section 23 of the Award provides that where an employee in receipt of the additional week's leave prescribed by clause 19.2(a) is rostered off on Easter Saturday, Easter Sunday, Show Day or Labour Day, that employee is to be paid an additional day's wage or granted a day's holiday in lieu. [¶ 241] The review decision records that, as at 1 May 2024, payroll was "still reviewing your entitlements regarding public holidays not required arising while you were a part-time employee". [¶ 255] The Manager confirmed "that since your commencement of full-time employment, all payments for public holidays not required had been processed". [¶ 256]</w:t>
+        <w:t xml:space="preserve">The review decision records that section 23 of the Award provides that where an employee in receipt of the additional week's leave prescribed by clause 19.2(a) is rostered off on Easter Saturday, Easter Sunday, Show Day or Labour Day, that employee is to be paid an additional day's wage or granted a day's holiday in lieu. [¶ 241] The review decision records that, as at 1 May 2024, payroll was "still reviewing your entitlements regarding public holidays not required arising while you were a part-time employee". [¶ 255] The review decision records the Manager as confirming "that since your commencement of full-time employment, all payments for public holidays not required had been processed". [¶ 256]</w:t>
       </w:r>
     </w:p>
     <w:p>
@@ -5705,7 +5705,7 @@
           <w:sz w:val="22"/>
           <w:szCs w:val="22"/>
         </w:rPr>
-        <w:t xml:space="preserve">. In all that time the Respondent alleges no step other than those listed. [¶¶ 185 to 197, 203, 209, 242 to 247] The enquiry of 8 April 2024 was also the fatigue enquiry pleaded at Stressor 3(d); no further response to it is alleged between the acknowledgment on 9 April and the substantive reply on 1 May, and it was answered after 23 days [¶¶ 249 to 250].</w:t>
+        <w:t xml:space="preserve">. [¶¶ 185 to 197, 203, 209, 242 to 247] The enquiry of 8 April 2024 was also the fatigue enquiry pleaded at Stressor 3(d); no further response to it is alleged between the acknowledgment on 9 April and the substantive reply on 1 May, and it was answered after 23 days [¶¶ 249 to 250].</w:t>
       </w:r>
     </w:p>
     <w:p>
@@ -6192,7 +6192,7 @@
           <w:sz w:val="22"/>
           <w:szCs w:val="22"/>
         </w:rPr>
-        <w:t xml:space="preserve">A Code Blue is the call for a medical emergency in which a patient has suffered, or is about to suffer, cardiac or respiratory arrest, and brings the resuscitation team. A MET call is the call for the Medical Emergency Team to a patient whose observations have deteriorated to the hospital's escalation threshold; a Neonatal MET call and a Paediatric MET call are the same call for a newborn and for a child. A Code Grey is the call for a security response to threatening or aggressive behaviour; a Code Black is the call for a security response to a personal threat. The colour codes follow the Australian Standard for emergency control in health care facilities, AS 4083. Queensland Health's own Code Blue procedure for the Royal Brisbane and Women's Hospital (Procedure 001443, version 5, effective April 2020) states that "there are eight different types of Code Blue", including Medical Emergency, Cardiac Arrest, Neonatal Emergency, and Paediatric Emergency or Paediatric Cardiac Arrest; that "Switchboard Services will activate one or multiple teams to provide a Code Blue response"; and that the response team "will be notified by a paging system from Switchboard Services… identifying the type of Code Blue and the location of the emergency". The Logan Hospital emergency code procedures referred to in the role description [¶ 8] are the equivalent document for Logan Hospital (Schedule, Part 2).</w:t>
+        <w:t xml:space="preserve">A Code Blue is the call for a medical emergency in which a patient has suffered, or is about to suffer, cardiac or respiratory arrest, and brings the resuscitation team. A MET call is the call for the Medical Emergency Team to a patient whose observations have deteriorated to the hospital's escalation threshold; a Neonatal MET call and a Paediatric MET call are the same call for a newborn and for a child. A Code Grey is the call for a security response to threatening or aggressive behaviour; a Code Black is the call for a security response to a personal threat. The colour codes follow the Australian Standard for emergency control in health care facilities, AS 4083. Queensland Health's own Code Blue procedure for the Royal Brisbane and Women's Hospital (Procedure 001443, version 5, effective April 2020) states that "there are eight different types of Code Blue", including Medical Emergency, Cardiac Arrest, Neonatal Emergency, and Paediatric Emergency or Paediatric Cardiac Arrest; that "Switchboard Services will activate one or multiple teams to provide a Code Blue response"; and that the response team "will be notified by a paging system from Switchboard Services (except for Code Blue – external medical emergency and neonatal emergency) identifying the type of Code Blue and the location of the emergency". The Logan Hospital emergency code procedures referred to in the role description [¶ 8] are the equivalent document for Logan Hospital (Schedule, Part 2).</w:t>
       </w:r>
     </w:p>
     <w:p>
@@ -6605,7 +6605,7 @@
           <w:sz w:val="22"/>
           <w:szCs w:val="22"/>
         </w:rPr>
-        <w:t>It records that payroll was, as at 1 May 2024, still reviewing his entitlements; that the employer did not mention his shift on 18 March 2024; and that there was uncertainty between him and the employer regarding whether the 8-hour agreement continued to apply. [¶¶ 253 to 255]</w:t>
+        <w:t xml:space="preserve">It records that payroll was, as at 1 May 2024, still reviewing his entitlements regarding public holidays not required [¶ 255]; that "The employer did not mention your shift on 18 March 2024" [¶ 253]; and that there was uncertainty between him and the employer regarding whether the 8-hour agreement continued to apply. [¶ 254]</w:t>
       </w:r>
     </w:p>
     <w:p>
@@ -6636,7 +6636,7 @@
           <w:sz w:val="22"/>
           <w:szCs w:val="22"/>
         </w:rPr>
-        <w:t xml:space="preserve">. In between were the acknowledgment of 9 April, the escalation to Human Resources, and the Appellant's email of 24 April; no other response is alleged. [¶¶ 242 to 250] So the day after the consecutive shifts was recorded against the Appellant's own sick leave [¶ 235], and the Respondent says no fatigue leave was due for it [¶¶ 236 to 237]. The refusal relied on an agreement signed at a time the Respondent does not allege the Manager held that role, and not alleged to have been reviewed before 18 March 2024; the Respondent does not allege that he was told, before that day, that he could end it "going forward". [¶¶ 21 to 22, 25, 242 to 250]</w:t>
+        <w:t xml:space="preserve">. In between were the acknowledgment of 9 April, the escalation to Human Resources, and the Appellant's email of 24 April; no other response is alleged. [¶¶ 242 to 250] The day after the consecutive shifts was recorded against the Appellant's own sick leave [¶ 235], and the Respondent says no fatigue leave was due for it [¶¶ 236 to 237]. The refusal relied on an agreement signed when the Respondent does not allege Ms Taylor was the Switchboard Manager, and not alleged to have been reviewed before 18 March 2024; the Respondent does not allege that he was told, before that day, that he could end it "going forward". [¶¶ 21 to 22, 25, 242 to 250]</w:t>
       </w:r>
     </w:p>
     <w:p>
@@ -6966,7 +6966,7 @@
           <w:sz w:val="22"/>
           <w:szCs w:val="22"/>
         </w:rPr>
-        <w:t xml:space="preserve">So the guideline treated the Award under which the Appellant was employed as a supporting document. It treated every employee of a Hospital and Health Service as a worker to whom it applied. It called for consultation with workers on fatigue hazards, and for training of rostering staff and managers. A resource pack had preceded it since December 2018. It is the guideline the Director sent to Human Resources on 20 May 2024 [¶¶ 222 to 223], ten days after she and the Manager had assessed the fatigue risk of the Appellant's roster as moderate [¶ 219]; the Chief Executive's letter states that fatigue risk management assessment at the Switchboard was implemented "after 30 June 2024" and that the mandatory training "only applies to health practitioners and clinical assistants". [¶¶ 264 to 265] The Respondent does not allege that any fatigue risk management training was provided to the Appellant, or that any fatigue risk assessment of his position was conducted, before 30 June 2024. [¶¶ 269 to 270]</w:t>
+        <w:t xml:space="preserve">So the guideline listed the Award under which the Appellant was employed among its related documents. It treated every employee of a Hospital and Health Service as a worker to whom it applied. It called for consultation with workers on fatigue hazards, and for training of rostering staff and managers. A resource pack had preceded it since December 2018. It is the guideline the Director sent to Human Resources on 20 May 2024 [¶¶ 222 to 223], ten days after she and the Manager had assessed the fatigue risk of the Appellant's roster as moderate [¶ 219]; the Chief Executive's letter states that fatigue risk management assessment at the Switchboard was implemented "after 30 June 2024" and that the mandatory training "only applies to health practitioners and clinical assistants". [¶¶ 264 to 265] The Respondent does not allege that any fatigue risk management training was provided to the Appellant, or that any fatigue risk assessment of his position was conducted, before 30 June 2024. [¶¶ 269 to 270]</w:t>
       </w:r>
     </w:p>
     <w:p>
@@ -7285,7 +7285,7 @@
           <w:sz w:val="22"/>
           <w:szCs w:val="22"/>
         </w:rPr>
-        <w:t>The work capacity certificates certify no functional capacity from 1 July to 6 October 2024. Matters after the date of injury are not relied on as causes of it; those stated in this paragraph are stated for context and continuing effect only, as they were at Part B.3 of the Amended Statement filed 7 April 2026. (a) On 12 and 16 July 2024, while on certified leave, the Appellant was required to attend meetings convened by management. (b) On 8 October 2024 the employer terminated his employment on the basis of abandonment of employment, following certificates of no functional capacity from 1 July to 6 October 2024; he applied for reinstatement (TD/2024/110) and was reinstated. (c) The Respondent obtained the Appellant's medical records under the Form 29 signed 4 July 2025 without serving that notice on him; on 18 February 2026 it admitted that it did not serve it (Form 24, paragraph 25). Those are the records relied on at Part B.1. The Respondent's amended statement of 13 May 2026 says of (a) to (c) that they post-date the injury and are not relevant; the Appellant relies on them as stated above, and on (c) for the provenance of the medical record. (d) The Employee Capability Checklist completed by Dr Day Hong Ma on 3 July 2026 records current capacity and restrictions and the continuing effect of the injury, including "symptom exacerbation on exposure to the identified workplace stressors" [Tab M7]; it is relied on for the effect of the injury and for capacity only, not for cause. (e) The Appellant's present position is this. On 2 July 2026 the employer advised that he could not return to work until a completed Employee Capability Checklist was provided; Dr Ma completed it on 3 July 2026, certifying him fit with restrictions, and the employer has directed him not to attend work since that date, pending its request of 31 July 2026 for further medical information. He has received no wages since 13 July 2026. The treating psychiatrist wrote to the employer on 13 August 2026 and, on 19 August 2026, asked the basis of the request. On 24 August 2026 the Appellant authorised the psychiatrist to communicate with the employer on his capacity for work. As at 5 September 2026 the enquiry of 19 August 2026 had not been answered. These are the Appellant's own evidence and are not relied on as causes of the injury.</w:t>
+        <w:t xml:space="preserve">The work capacity certificates certify no functional capacity from 1 July to 6 October 2024. Matters after the date of injury are not relied on as causes of it; those stated in this paragraph are stated for context and continuing effect only, as they were at Part B.3 of the Amended Statement filed 7 April 2026. (a) On 12 and 16 July 2024, while on certified leave, the Appellant was required to attend meetings convened by management. (b) On 8 October 2024 the employer terminated his employment on the basis of abandonment of employment, following certificates of no functional capacity from 1 July to 6 October 2024; he applied for reinstatement (TD/2024/110) and was reinstated. (c) The Respondent obtained the Appellant's medical records under the Form 29 signed 4 July 2025 without serving that notice on him; on 18 February 2026 it admitted that it did not serve it (paragraph 25 of the Appellant's first notice to admit facts). Those are the records relied on at Part B.1. The Respondent's amended statement of 13 May 2026 says of (a) to (c) that they post-date the injury and are not relevant; the Appellant relies on them as stated above, and on (c) for the provenance of the medical record. (d) The Employee Capability Checklist completed by Dr Day Hong Ma on 3 July 2026 records current capacity and restrictions and the continuing effect of the injury, including "symptom exacerbation on exposure to the identified workplace stressors" [Tab M7]; it is relied on for the effect of the injury and for capacity only, not for cause. (e) The Appellant's present position is this. On 2 July 2026 the employer advised that he could not return to work until a completed Employee Capability Checklist was provided; Dr Ma completed it on 3 July 2026, certifying him fit with restrictions, and the employer has directed him not to attend work since that date, pending its request of 31 July 2026 for further medical information. He has received no wages since 13 July 2026. The treating psychiatrist wrote to the employer on 13 August 2026 and, on 19 August 2026, asked the basis of the request. On 24 August 2026 the Appellant authorised the psychiatrist to communicate with the employer on his capacity for work. As at 5 September 2026 the enquiry of 19 August 2026 had not been answered. These are the Appellant's own evidence and are not relied on as causes of the injury.</w:t>
       </w:r>
       <w:r>
         <w:rPr>
@@ -10441,15 +10441,15 @@
           <w:sz w:val="22"/>
           <w:szCs w:val="22"/>
         </w:rPr>
-        <w:t xml:space="preserve">5.3 As to the office hours. That the Manager stated fixed office hours to the Switchboard staff</w:t>
-      </w:r>
-      <w:r>
-        <w:rPr>
-          <w:rFonts w:ascii="Times New Roman" w:hAnsi="Times New Roman" w:cs="Times New Roman"/>
-          <w:sz w:val="22"/>
-          <w:szCs w:val="22"/>
-        </w:rPr>
-        <w:t xml:space="preserve"> at any time between 23 August 2023 and 17 May 2024.</w:t>
+        <w:t xml:space="preserve">5.3 As to the office hours. </w:t>
+      </w:r>
+      <w:r>
+        <w:rPr>
+          <w:rFonts w:ascii="Times New Roman" w:hAnsi="Times New Roman" w:cs="Times New Roman"/>
+          <w:sz w:val="22"/>
+          <w:szCs w:val="22"/>
+        </w:rPr>
+        <w:t xml:space="preserve">That the Manager stated fixed office hours to the Switchboard staff at any time between 23 August 2023 and 17 May 2024.</w:t>
       </w:r>
     </w:p>
     <w:p>
@@ -10724,7 +10724,7 @@
           <w:sz w:val="22"/>
           <w:szCs w:val="22"/>
         </w:rPr>
-        <w:t>Section 32(5)(a) - if management action, whether it was reasonable and taken in a reasonable way. To the extent the pleaded circumstances are management action, the Appellant relies on the admitted sequence, timing and gaps in the documents in Part B. In particular: the 15 April process change was effective on the day it was notified, and no document of prior consultation is listed; pay corrections for the identified fortnights were sent back through the line-manager process, one later claim is still recorded as "Part Completed", and two identified February AVAC references do not appear in the report; the paid Special Pandemic Leave entitlement in Stressor 2(b) took three submissions and was declined twice, and the Respondent later pleaded that the supporting attachments were in fact present when the later decline was made; the fatigue enquiry was escalated to Human Resources and answered after 23 days, with an acknowledgment on 9 April and no further response alleged before 1 May; and the roster decision described in the email of 10 May 2024 was not to be disclosed to the Appellant until the implementation plan was issued. The Appellant relies on the intervals in Part B.4, and on the matters the Respondent does not allege and the documents it does not list in Part B.5.</w:t>
+        <w:t xml:space="preserve">Section 32(5)(a) - if management action, whether it was reasonable and taken in a reasonable way. To the extent the pleaded circumstances are management action, the Appellant relies on the admitted sequence, timing and gaps in the documents in Part B. In particular: the 15 April process change was effective on the day it was notified, and no document of prior consultation is listed; pay corrections for the identified fortnights were sent back through the line-manager process, one later claim is still recorded as "Part Completed", and two identified February AVAC references do not appear in the report; the paid Special Pandemic Leave entitlement in Stressor 2(b) took three submissions and was declined twice, and the Respondent later pleaded that the supporting attachments were in fact present; the fatigue enquiry was escalated to Human Resources and answered after 23 days, with an acknowledgment on 9 April and no further response alleged before 1 May; and the roster decision described in the email of 10 May 2024 was not to be disclosed to the Appellant until the implementation plan was issued. The Appellant relies on the intervals in Part B.4, and on the matters the Respondent does not allege and the documents it does not list in Part B.5.</w:t>
       </w:r>
     </w:p>
     <w:p>
@@ -10748,7 +10748,7 @@
           <w:sz w:val="22"/>
           <w:szCs w:val="22"/>
         </w:rPr>
-        <w:t xml:space="preserve">The Respondent's notified lay evidence. On 24 September 2026 the Respondent served outlines of the evidence of Ms Taylor, Ms Reese, Ms Wright and Ms Earl. An outline is not evidence; the outlines are relied on only as the Respondent's own description of the matters they concern, and the Appellant will ask each witness to confirm them. On the Respondent's own outlines: the seven-hour break was "the result of human error" and, on the advice returned within payroll, "a rostering practice issue for the line manager"; the agreement of 17 June 2020 reduced the break "from ten hours to eight", so that a seven-hour break fell below both; no fatigue-leave entitlement under clause 18.10 attached to a short break between two ordinary shifts; the second decline of the paid Special Pandemic Leave request "appears to have been made in error"; and pay corrections were the line manager's to submit. The Appellant contends that the rostering of 17 to 18 March 2024 was, on the Respondent's own description, an act of the line manager in rostering; that it is management action; and that it was not reasonable management action taken in a reasonable way, for the reasons in Stressor 3. No outline addresses the removal of database access or its restoration; the Contact &amp; Number Changes book; any consultation preceding the change notified on 15 April 2024; the reports of the MASPER Registrar of 3 and 8 May 2024; the emails of the Integrated Respiratory Service of 15 and 20 May 2024; the amendment of the clinic contact-details document; the fatigue enquiry of 8 April 2024 or the interval to 1 May 2024; the email to Human Resources of 10 May 2024; or the absence of fatigue risk management at the Switchboard before 30 June 2024. By particular, the outlines give no account of the dated events at Stressor 1(b), 1(f), 1(h) and 1(k), or at Stressor 3(e) and 3(f); nor of the internal records at Stressor 3(g) and 3(h), which are relied on only as proof of how the matters at 3(d) to 3(f) were handled. On the causal particulars, the facts are admitted, and the questions are whether each was management action, whether any management action was reasonable and taken in a reasonable way, and whether it contributed to the injury. Those matters are relied on to the extent established by the admissions; silence in an outline is not a further admission. The Respondent's list of witnesses, sent to the Registry for filing and to the Appellant on 24 September 2026, names those four witnesses, described as "lay" witnesses, and no other, and states that the Respondent "reserves its right to amend this list depending on the case presented by the appellant at the hearing". Neither the list nor the outlines name a medical or expert witness, and no expert report has been served as at 30 September 2026.</w:t>
+        <w:t xml:space="preserve">The Respondent's notified lay evidence. On 24 September 2026 the Respondent served outlines of the evidence of Ms Taylor, Ms Reese, Ms Wright and Ms Earl. An outline is not evidence; the outlines are relied on only as the Respondent's own description of the matters they concern, and the Appellant will ask each witness to confirm them. On the Respondent's own outlines: the seven-hour break was "the result of human error" and, on the advice returned within payroll, "a rostering practice issue for the line manager"; the agreement of 17 June 2020 reduced the break "from ten hours to eight", so that a seven-hour break fell below both; no fatigue-leave entitlement under clause 18.10 attached to a short break between two ordinary shifts; the second decline of the paid Special Pandemic Leave request "appears to have been made in error"; and pay corrections were the line manager's to submit. The Appellant contends that the rostering of 17 to 18 March 2024 was, on the Respondent's own description, an act of the line manager in rostering; that it is management action; and that it was not reasonable management action taken in a reasonable way, for the reasons in Stressor 3. No outline addresses the removal of database access or its restoration; the Contact &amp; Number Changes book; any consultation preceding the change notified on 15 April 2024; the reports of the MASPER Registrar of 3 and 8 May 2024; the emails of the Integrated Respiratory Service of 15 and 20 May 2024; the amendment of the clinic contact-details document; the fatigue enquiry of 8 April 2024 or the interval to 1 May 2024; the email to Human Resources of 10 May 2024; or the implementation of fatigue risk management assessment at the Switchboard only after 30 June 2024. By particular, the outlines give no account of the dated events at Stressor 1(b), 1(f), 1(h) and 1(k), or at Stressor 3(e) and 3(f); nor of the internal records at Stressor 3(g) and 3(h), which are relied on only as proof of how the matters at 3(d) to 3(f) were handled. On the causal particulars, the facts are admitted, and the questions are whether each was management action, whether any management action was reasonable and taken in a reasonable way, and whether it contributed to the injury. Those matters are relied on to the extent established by the admissions; silence in an outline is not a further admission. The Respondent's list of witnesses, sent to the Registry for filing and to the Appellant on 24 September 2026, names those four witnesses, described as "lay" witnesses, and no other, and states that the Respondent "reserves its right to amend this list depending on the case presented by the appellant at the hearing". Neither the list nor the outlines name a medical or expert witness, and no expert report has been served as at 30 September 2026.</w:t>
       </w:r>
     </w:p>
     <w:p>
@@ -11540,7 +11540,7 @@
     <w:p>
       <w:pPr>
         <w:spacing w:before="120" w:after="80" w:line="264" w:lineRule="auto"/>
-        <w:jc w:val="both"/>
+        <w:jc w:val="left"/>
       </w:pPr>
       <w:r>
         <w:rPr>

</xml_diff>